<commit_message>
fix: integracion Firebase Auth en login/registro, reglas Firestore, compatibilidad web
</commit_message>
<xml_diff>
--- a/Proyecto - APP Caja Chica ALM.docx
+++ b/Proyecto - APP Caja Chica ALM.docx
@@ -299,15 +299,13 @@
         </w:rPr>
         <w:t xml:space="preserve">Adjunto de Comprobantes </w:t>
       </w:r>
-      <w:proofErr w:type="spellStart"/>
-      <w:r>
-        <w:rPr>
-          <w:b/>
-          <w:bCs/>
-        </w:rPr>
-        <w:t>Evidenciales</w:t>
-      </w:r>
-      <w:proofErr w:type="spellEnd"/>
+      <w:r>
+        <w:rPr>
+          <w:b/>
+          <w:bCs/>
+        </w:rPr>
+        <w:t>Evidénciales</w:t>
+      </w:r>
       <w:r>
         <w:t>: Posibilidad de fotografiar o subir el recibo de la transacción para auditoría.</w:t>
       </w:r>
@@ -399,13 +397,9 @@
       <w:r>
         <w:t xml:space="preserve">: Acceso a un </w:t>
       </w:r>
-      <w:proofErr w:type="spellStart"/>
-      <w:proofErr w:type="gramStart"/>
-      <w:r>
-        <w:t>click</w:t>
-      </w:r>
-      <w:proofErr w:type="spellEnd"/>
-      <w:proofErr w:type="gramEnd"/>
+      <w:r>
+        <w:t>clic</w:t>
+      </w:r>
       <w:r>
         <w:t xml:space="preserve"> de la factura o foto original respaldatoria de cada movimiento financiero.</w:t>
       </w:r>
@@ -478,11 +472,9 @@
       <w:r>
         <w:t xml:space="preserve">: Almacenamiento rápido en la nube (Google Cloud </w:t>
       </w:r>
-      <w:proofErr w:type="spellStart"/>
-      <w:r>
-        <w:t>Firestore</w:t>
-      </w:r>
-      <w:proofErr w:type="spellEnd"/>
+      <w:r>
+        <w:t>Firestone</w:t>
+      </w:r>
       <w:r>
         <w:t>/Storage), garantizando disponibilidad total 24/7.</w:t>
       </w:r>
@@ -502,62 +494,22 @@
         <w:t>Lectura Inteligente (Google ML Kit)</w:t>
       </w:r>
       <w:r>
-        <w:t xml:space="preserve">: Machine </w:t>
-      </w:r>
-      <w:proofErr w:type="spellStart"/>
-      <w:r>
-        <w:t>Learning</w:t>
-      </w:r>
-      <w:proofErr w:type="spellEnd"/>
-      <w:r>
-        <w:t xml:space="preserve"> ejecutándose directamente en los dispositivos sin consumo extra de datos.</w:t>
-      </w:r>
-    </w:p>
-    <w:p>
-      <w:pPr>
-        <w:rPr>
-          <w:b/>
-          <w:bCs/>
-        </w:rPr>
-      </w:pPr>
-      <w:r>
-        <w:rPr>
-          <w:b/>
-          <w:bCs/>
-        </w:rPr>
-        <w:t>6. Identidad Visual (</w:t>
-      </w:r>
-      <w:proofErr w:type="gramStart"/>
-      <w:r>
-        <w:rPr>
-          <w:b/>
-          <w:bCs/>
-        </w:rPr>
-        <w:t>Look</w:t>
-      </w:r>
-      <w:proofErr w:type="gramEnd"/>
-      <w:r>
-        <w:rPr>
-          <w:b/>
-          <w:bCs/>
-        </w:rPr>
-        <w:t xml:space="preserve"> and </w:t>
-      </w:r>
-      <w:proofErr w:type="spellStart"/>
-      <w:r>
-        <w:rPr>
-          <w:b/>
-          <w:bCs/>
-        </w:rPr>
-        <w:t>Feel</w:t>
-      </w:r>
-      <w:proofErr w:type="spellEnd"/>
-      <w:r>
-        <w:rPr>
-          <w:b/>
-          <w:bCs/>
-        </w:rPr>
-        <w:t>)</w:t>
+        <w:t>: Machine Learning ejecutándose directamente en los dispositivos sin consumo extra de datos.</w:t>
+      </w:r>
+    </w:p>
+    <w:p>
+      <w:pPr>
+        <w:rPr>
+          <w:b/>
+          <w:bCs/>
+        </w:rPr>
+      </w:pPr>
+      <w:r>
+        <w:rPr>
+          <w:b/>
+          <w:bCs/>
+        </w:rPr>
+        <w:t>6. Identidad Visual (Look and Feel)</w:t>
       </w:r>
     </w:p>
     <w:p>
@@ -699,15 +651,13 @@
         </w:rPr>
         <w:t xml:space="preserve">visualización a modo de ejemplo de la </w:t>
       </w:r>
-      <w:proofErr w:type="spellStart"/>
-      <w:r>
-        <w:rPr>
-          <w:b/>
-          <w:bCs/>
-        </w:rPr>
-        <w:t>pagina</w:t>
-      </w:r>
-      <w:proofErr w:type="spellEnd"/>
+      <w:r>
+        <w:rPr>
+          <w:b/>
+          <w:bCs/>
+        </w:rPr>
+        <w:t>página</w:t>
+      </w:r>
       <w:r>
         <w:rPr>
           <w:b/>
@@ -718,6 +668,9 @@
     </w:p>
     <w:p>
       <w:r>
+        <w:rPr>
+          <w:noProof/>
+        </w:rPr>
         <w:drawing>
           <wp:inline distT="0" distB="0" distL="0" distR="0" wp14:anchorId="68DDCE13" wp14:editId="294B0057">
             <wp:extent cx="3606393" cy="2547036"/>
@@ -758,6 +711,9 @@
         <w:br/>
       </w:r>
       <w:r>
+        <w:rPr>
+          <w:noProof/>
+        </w:rPr>
         <w:drawing>
           <wp:inline distT="0" distB="0" distL="0" distR="0" wp14:anchorId="532ADFE2" wp14:editId="73CAB57F">
             <wp:extent cx="3581606" cy="2538375"/>
@@ -794,9 +750,15 @@
           </wp:inline>
         </w:drawing>
       </w:r>
-    </w:p>
-    <w:p>
-      <w:r>
+      <w:r>
+        <w:br/>
+      </w:r>
+    </w:p>
+    <w:p>
+      <w:r>
+        <w:rPr>
+          <w:noProof/>
+        </w:rPr>
         <w:lastRenderedPageBreak/>
         <w:drawing>
           <wp:inline distT="0" distB="0" distL="0" distR="0" wp14:anchorId="34B5AC6E" wp14:editId="71B452CD">
@@ -835,45 +797,11 @@
         </w:drawing>
       </w:r>
       <w:r>
+        <w:rPr>
+          <w:noProof/>
+        </w:rPr>
         <w:drawing>
-          <wp:inline distT="0" distB="0" distL="0" distR="0" wp14:anchorId="22AD655C" wp14:editId="2EA3FA03">
-            <wp:extent cx="1609345" cy="3218688"/>
-            <wp:effectExtent l="0" t="0" r="0" b="1270"/>
-            <wp:docPr id="809696103" name="Imagen 1"/>
-            <wp:cNvGraphicFramePr>
-              <a:graphicFrameLocks xmlns:a="http://schemas.openxmlformats.org/drawingml/2006/main" noChangeAspect="1"/>
-            </wp:cNvGraphicFramePr>
-            <a:graphic xmlns:a="http://schemas.openxmlformats.org/drawingml/2006/main">
-              <a:graphicData uri="http://schemas.openxmlformats.org/drawingml/2006/picture">
-                <pic:pic xmlns:pic="http://schemas.openxmlformats.org/drawingml/2006/picture">
-                  <pic:nvPicPr>
-                    <pic:cNvPr id="809696103" name=""/>
-                    <pic:cNvPicPr/>
-                  </pic:nvPicPr>
-                  <pic:blipFill>
-                    <a:blip r:embed="rId8"/>
-                    <a:stretch>
-                      <a:fillRect/>
-                    </a:stretch>
-                  </pic:blipFill>
-                  <pic:spPr>
-                    <a:xfrm>
-                      <a:off x="0" y="0"/>
-                      <a:ext cx="1622995" cy="3245988"/>
-                    </a:xfrm>
-                    <a:prstGeom prst="rect">
-                      <a:avLst/>
-                    </a:prstGeom>
-                  </pic:spPr>
-                </pic:pic>
-              </a:graphicData>
-            </a:graphic>
-          </wp:inline>
-        </w:drawing>
-      </w:r>
-      <w:r>
-        <w:drawing>
-          <wp:inline distT="0" distB="0" distL="0" distR="0" wp14:anchorId="574D9896" wp14:editId="47E8B155">
+          <wp:inline distT="0" distB="0" distL="0" distR="0" wp14:anchorId="574D9896" wp14:editId="602FC713">
             <wp:extent cx="1645920" cy="3226442"/>
             <wp:effectExtent l="0" t="0" r="0" b="0"/>
             <wp:docPr id="2038815429" name="Imagen 1"/>
@@ -888,7 +816,7 @@
                     <pic:cNvPicPr/>
                   </pic:nvPicPr>
                   <pic:blipFill>
-                    <a:blip r:embed="rId9"/>
+                    <a:blip r:embed="rId8"/>
                     <a:stretch>
                       <a:fillRect/>
                     </a:stretch>
@@ -909,8 +837,1399 @@
         </w:drawing>
       </w:r>
     </w:p>
-    <w:p/>
-    <w:p/>
+    <w:p>
+      <w:r>
+        <w:t>Especificación UI/UX y Funcional</w:t>
+      </w:r>
+    </w:p>
+    <w:p>
+      <w:r>
+        <w:rPr>
+          <w:b/>
+          <w:bCs/>
+        </w:rPr>
+        <w:t>Proyecto:</w:t>
+      </w:r>
+      <w:r>
+        <w:t xml:space="preserve"> App de Gestión de Gastos - Agropecuaria Las Marias </w:t>
+      </w:r>
+      <w:r>
+        <w:br/>
+      </w:r>
+      <w:r>
+        <w:rPr>
+          <w:b/>
+          <w:bCs/>
+        </w:rPr>
+        <w:t>Plataforma:</w:t>
+      </w:r>
+      <w:r>
+        <w:t xml:space="preserve"> Aplicación Móvil (con fase de prueba inicial en entorno Web). </w:t>
+      </w:r>
+      <w:r>
+        <w:br/>
+      </w:r>
+      <w:r>
+        <w:rPr>
+          <w:b/>
+          <w:bCs/>
+        </w:rPr>
+        <w:t>Estado Previo:</w:t>
+      </w:r>
+      <w:r>
+        <w:t xml:space="preserve"> Pantalla de Inicio/Login finalizada y controlada (NO MODIFICAR).</w:t>
+      </w:r>
+    </w:p>
+    <w:p>
+      <w:pPr>
+        <w:rPr>
+          <w:b/>
+          <w:bCs/>
+        </w:rPr>
+      </w:pPr>
+      <w:r>
+        <w:rPr>
+          <w:b/>
+          <w:bCs/>
+        </w:rPr>
+        <w:t>1. Guía de Estilo y UI (Interfaz de Usuario)</w:t>
+      </w:r>
+    </w:p>
+    <w:p>
+      <w:pPr>
+        <w:numPr>
+          <w:ilvl w:val="0"/>
+          <w:numId w:val="8"/>
+        </w:numPr>
+      </w:pPr>
+      <w:r>
+        <w:rPr>
+          <w:b/>
+          <w:bCs/>
+        </w:rPr>
+        <w:t>Estética:</w:t>
+      </w:r>
+      <w:r>
+        <w:t xml:space="preserve"> Diseño minimalista, limpio</w:t>
+      </w:r>
+      <w:r>
+        <w:t>,</w:t>
+      </w:r>
+      <w:r>
+        <w:t xml:space="preserve"> amigable</w:t>
+      </w:r>
+      <w:r>
+        <w:t xml:space="preserve"> y profesional</w:t>
+      </w:r>
+      <w:r>
+        <w:t>. Optimizado estrictamente para dimensiones de teléfonos móviles.</w:t>
+      </w:r>
+    </w:p>
+    <w:p>
+      <w:pPr>
+        <w:numPr>
+          <w:ilvl w:val="0"/>
+          <w:numId w:val="8"/>
+        </w:numPr>
+      </w:pPr>
+      <w:r>
+        <w:rPr>
+          <w:b/>
+          <w:bCs/>
+        </w:rPr>
+        <w:t>Paleta de Colores:</w:t>
+      </w:r>
+      <w:r>
+        <w:t xml:space="preserve"> * Primarios: Blanco y Negro.</w:t>
+      </w:r>
+    </w:p>
+    <w:p>
+      <w:pPr>
+        <w:numPr>
+          <w:ilvl w:val="1"/>
+          <w:numId w:val="8"/>
+        </w:numPr>
+      </w:pPr>
+      <w:r>
+        <w:t>Corporativos: Naranja (#ba4817) y Amarillo (#e5a102).</w:t>
+      </w:r>
+    </w:p>
+    <w:p>
+      <w:pPr>
+        <w:numPr>
+          <w:ilvl w:val="0"/>
+          <w:numId w:val="8"/>
+        </w:numPr>
+      </w:pPr>
+      <w:r>
+        <w:rPr>
+          <w:b/>
+          <w:bCs/>
+        </w:rPr>
+        <w:t>Navegación:</w:t>
+      </w:r>
+      <w:r>
+        <w:t xml:space="preserve"> Menú Hamburguesa (esquina superior izquierda).</w:t>
+      </w:r>
+    </w:p>
+    <w:p>
+      <w:pPr>
+        <w:numPr>
+          <w:ilvl w:val="1"/>
+          <w:numId w:val="8"/>
+        </w:numPr>
+      </w:pPr>
+      <w:r>
+        <w:rPr>
+          <w:i/>
+          <w:iCs/>
+        </w:rPr>
+        <w:t>Cabecera del menú:</w:t>
+      </w:r>
+      <w:r>
+        <w:t xml:space="preserve"> Nombre del usuario activo. Avatar circular con las iniciales del usuario (Ej: Javier Cordoba = "JC").</w:t>
+      </w:r>
+    </w:p>
+    <w:p>
+      <w:pPr>
+        <w:numPr>
+          <w:ilvl w:val="1"/>
+          <w:numId w:val="8"/>
+        </w:numPr>
+      </w:pPr>
+      <w:r>
+        <w:rPr>
+          <w:i/>
+          <w:iCs/>
+        </w:rPr>
+        <w:t>Pie del menú:</w:t>
+      </w:r>
+      <w:r>
+        <w:t xml:space="preserve"> Logo/Texto de identidad: "Agropecuaria Las Marias".</w:t>
+      </w:r>
+    </w:p>
+    <w:p>
+      <w:pPr>
+        <w:numPr>
+          <w:ilvl w:val="1"/>
+          <w:numId w:val="8"/>
+        </w:numPr>
+      </w:pPr>
+      <w:r>
+        <w:rPr>
+          <w:i/>
+          <w:iCs/>
+        </w:rPr>
+        <w:t>Opciones del menú:</w:t>
+      </w:r>
+      <w:r>
+        <w:t xml:space="preserve"> Dashboard, Nuevo Registro, Historial, Perfil (cada uno con un icono minimalista representativo).</w:t>
+      </w:r>
+    </w:p>
+    <w:p>
+      <w:pPr>
+        <w:rPr>
+          <w:b/>
+          <w:bCs/>
+        </w:rPr>
+      </w:pPr>
+      <w:r>
+        <w:rPr>
+          <w:b/>
+          <w:bCs/>
+        </w:rPr>
+        <w:t>2. Vistas de la Aplicación (Navegación)</w:t>
+      </w:r>
+    </w:p>
+    <w:p>
+      <w:r>
+        <w:rPr>
+          <w:b/>
+          <w:bCs/>
+        </w:rPr>
+        <w:t>A. Dashboard (Pantalla Principal)</w:t>
+      </w:r>
+    </w:p>
+    <w:p>
+      <w:pPr>
+        <w:numPr>
+          <w:ilvl w:val="0"/>
+          <w:numId w:val="9"/>
+        </w:numPr>
+      </w:pPr>
+      <w:r>
+        <w:rPr>
+          <w:b/>
+          <w:bCs/>
+        </w:rPr>
+        <w:t>Saludo:</w:t>
+      </w:r>
+      <w:r>
+        <w:t xml:space="preserve"> "Hola, [Nombre de Usuario]".</w:t>
+      </w:r>
+    </w:p>
+    <w:p>
+      <w:pPr>
+        <w:numPr>
+          <w:ilvl w:val="0"/>
+          <w:numId w:val="9"/>
+        </w:numPr>
+      </w:pPr>
+      <w:r>
+        <w:rPr>
+          <w:b/>
+          <w:bCs/>
+        </w:rPr>
+        <w:lastRenderedPageBreak/>
+        <w:t>Tarjetas de Saldo (2 columnas):</w:t>
+      </w:r>
+      <w:r>
+        <w:t xml:space="preserve"> Globos/Tarjetas mostrando el saldo disponible en pesos ($), divididos en Efectivo y Tarjeta. Se calculan dinámicamente según los registros.</w:t>
+      </w:r>
+    </w:p>
+    <w:p>
+      <w:pPr>
+        <w:numPr>
+          <w:ilvl w:val="0"/>
+          <w:numId w:val="9"/>
+        </w:numPr>
+      </w:pPr>
+      <w:r>
+        <w:rPr>
+          <w:b/>
+          <w:bCs/>
+        </w:rPr>
+        <w:t>Tarjetas de Resumen (4 cuadrantes):</w:t>
+      </w:r>
+      <w:r>
+        <w:t xml:space="preserve"> Cantidad de movimientos, Dinero Ingresado, Dinero Egresado, Total Gastos. Afectados por un filtro temporal (Diario, Semanal, Mensual</w:t>
+      </w:r>
+      <w:r>
+        <w:t>, Anual</w:t>
+      </w:r>
+      <w:r>
+        <w:t>).</w:t>
+      </w:r>
+    </w:p>
+    <w:p>
+      <w:pPr>
+        <w:numPr>
+          <w:ilvl w:val="0"/>
+          <w:numId w:val="9"/>
+        </w:numPr>
+      </w:pPr>
+      <w:r>
+        <w:rPr>
+          <w:b/>
+          <w:bCs/>
+        </w:rPr>
+        <w:t>Gráfico Analítico:</w:t>
+      </w:r>
+      <w:r>
+        <w:t xml:space="preserve"> Gráfico de barras/columnas de gastos segmentados por establecimiento (ADM, PL, FL, SI, LC, LH, E7, EM). Afectado por filtro temporal (Diario a Anual).</w:t>
+      </w:r>
+    </w:p>
+    <w:p>
+      <w:pPr>
+        <w:numPr>
+          <w:ilvl w:val="0"/>
+          <w:numId w:val="9"/>
+        </w:numPr>
+      </w:pPr>
+      <w:r>
+        <w:rPr>
+          <w:b/>
+          <w:bCs/>
+        </w:rPr>
+        <w:t>Últimos Movimientos:</w:t>
+      </w:r>
+      <w:r>
+        <w:t xml:space="preserve"> Lista resumida.</w:t>
+      </w:r>
+    </w:p>
+    <w:p>
+      <w:pPr>
+        <w:numPr>
+          <w:ilvl w:val="1"/>
+          <w:numId w:val="9"/>
+        </w:numPr>
+      </w:pPr>
+      <w:r>
+        <w:rPr>
+          <w:i/>
+          <w:iCs/>
+        </w:rPr>
+        <w:t>Acción 1:</w:t>
+      </w:r>
+      <w:r>
+        <w:t xml:space="preserve"> Icono de "Tacho de basura" para eliminar el registro (recalcula el saldo automáticamente).</w:t>
+      </w:r>
+    </w:p>
+    <w:p>
+      <w:pPr>
+        <w:numPr>
+          <w:ilvl w:val="1"/>
+          <w:numId w:val="9"/>
+        </w:numPr>
+      </w:pPr>
+      <w:r>
+        <w:rPr>
+          <w:i/>
+          <w:iCs/>
+        </w:rPr>
+        <w:t>Acción 2:</w:t>
+      </w:r>
+      <w:r>
+        <w:t xml:space="preserve"> Icono de "</w:t>
+      </w:r>
+      <w:proofErr w:type="gramStart"/>
+      <w:r>
+        <w:t>Ticket</w:t>
+      </w:r>
+      <w:proofErr w:type="gramEnd"/>
+      <w:r>
+        <w:t>" (solo visible si el registro se hizo vía PDF/PNG). Al presionarlo, abre el comprobante original para visualización e impresión.</w:t>
+      </w:r>
+    </w:p>
+    <w:p>
+      <w:pPr>
+        <w:pStyle w:val="Prrafodelista"/>
+        <w:numPr>
+          <w:ilvl w:val="0"/>
+          <w:numId w:val="9"/>
+        </w:numPr>
+      </w:pPr>
+      <w:r>
+        <w:rPr>
+          <w:b/>
+          <w:bCs/>
+        </w:rPr>
+        <w:t>Nueva Función:</w:t>
+      </w:r>
+      <w:r>
+        <w:t xml:space="preserve"> Exportación de Egresos.</w:t>
+      </w:r>
+      <w:r>
+        <w:t xml:space="preserve"> Debajo del Gráfico Analítico o junto a los filtros de tiempo, se incluirá un botón dual de "Exportar (Excel) / Imprimir".</w:t>
+      </w:r>
+    </w:p>
+    <w:p>
+      <w:pPr>
+        <w:numPr>
+          <w:ilvl w:val="1"/>
+          <w:numId w:val="9"/>
+        </w:numPr>
+      </w:pPr>
+      <w:r>
+        <w:t>Comportamiento:</w:t>
+      </w:r>
+      <w:r>
+        <w:t xml:space="preserve"> Al hacer clic, el sistema compilará únicamente los </w:t>
+      </w:r>
+      <w:r>
+        <w:t>movimientos de salida (gastos)</w:t>
+      </w:r>
+      <w:r>
+        <w:t xml:space="preserve"> correspondientes al filtro temporal activo en ese momento (Diario, Semanal, Mensual o Anual).</w:t>
+      </w:r>
+    </w:p>
+    <w:p>
+      <w:r>
+        <w:rPr>
+          <w:b/>
+          <w:bCs/>
+        </w:rPr>
+        <w:t>B. Nuevo Registro (Ingresos y Egresos)</w:t>
+      </w:r>
+    </w:p>
+    <w:p>
+      <w:pPr>
+        <w:numPr>
+          <w:ilvl w:val="0"/>
+          <w:numId w:val="10"/>
+        </w:numPr>
+      </w:pPr>
+      <w:r>
+        <w:rPr>
+          <w:b/>
+          <w:bCs/>
+        </w:rPr>
+        <w:t>Selector Superior:</w:t>
+      </w:r>
+      <w:r>
+        <w:t xml:space="preserve"> Botón tipo "Toggle" o pestañas redondeadas para elegir entre "Ingreso" o "Egreso". Todo movimiento guarda automáticamente la Fecha y Hora exactas de la carga.</w:t>
+      </w:r>
+    </w:p>
+    <w:p>
+      <w:pPr>
+        <w:numPr>
+          <w:ilvl w:val="0"/>
+          <w:numId w:val="10"/>
+        </w:numPr>
+      </w:pPr>
+      <w:r>
+        <w:rPr>
+          <w:b/>
+          <w:bCs/>
+        </w:rPr>
+        <w:t>Flujo de Ingreso:</w:t>
+      </w:r>
+      <w:r>
+        <w:t xml:space="preserve"> * Campos: Descripción (Texto), Monto (Numérico, sin puntuación), Asignación (Desplegable de los 8 establecimientos).</w:t>
+      </w:r>
+    </w:p>
+    <w:p>
+      <w:pPr>
+        <w:numPr>
+          <w:ilvl w:val="1"/>
+          <w:numId w:val="10"/>
+        </w:numPr>
+      </w:pPr>
+      <w:r>
+        <w:t>Acción: Botón "Registrar". Limpia campos tras el éxito. Valida que no haya campos vacíos.</w:t>
+      </w:r>
+    </w:p>
+    <w:p>
+      <w:pPr>
+        <w:numPr>
+          <w:ilvl w:val="0"/>
+          <w:numId w:val="10"/>
+        </w:numPr>
+      </w:pPr>
+      <w:r>
+        <w:rPr>
+          <w:b/>
+          <w:bCs/>
+        </w:rPr>
+        <w:t>Flujo de Egreso (3 Métodos):</w:t>
+      </w:r>
+    </w:p>
+    <w:p>
+      <w:pPr>
+        <w:numPr>
+          <w:ilvl w:val="1"/>
+          <w:numId w:val="11"/>
+        </w:numPr>
+      </w:pPr>
+      <w:r>
+        <w:rPr>
+          <w:i/>
+          <w:iCs/>
+        </w:rPr>
+        <w:t>Importar PDF.</w:t>
+      </w:r>
+    </w:p>
+    <w:p>
+      <w:pPr>
+        <w:numPr>
+          <w:ilvl w:val="1"/>
+          <w:numId w:val="11"/>
+        </w:numPr>
+      </w:pPr>
+      <w:r>
+        <w:rPr>
+          <w:i/>
+          <w:iCs/>
+        </w:rPr>
+        <w:t>Importar/Tomar Foto (PNG).</w:t>
+      </w:r>
+    </w:p>
+    <w:p>
+      <w:pPr>
+        <w:numPr>
+          <w:ilvl w:val="1"/>
+          <w:numId w:val="11"/>
+        </w:numPr>
+      </w:pPr>
+      <w:r>
+        <w:rPr>
+          <w:i/>
+          <w:iCs/>
+        </w:rPr>
+        <w:t>Registro Manual.</w:t>
+      </w:r>
+    </w:p>
+    <w:p>
+      <w:pPr>
+        <w:numPr>
+          <w:ilvl w:val="0"/>
+          <w:numId w:val="10"/>
+        </w:numPr>
+      </w:pPr>
+      <w:r>
+        <w:rPr>
+          <w:b/>
+          <w:bCs/>
+        </w:rPr>
+        <w:lastRenderedPageBreak/>
+        <w:t>Motor de Extracción Automática (OCR):</w:t>
+      </w:r>
+      <w:r>
+        <w:t xml:space="preserve"> Para los métodos 1 y 2, el sistema debe extraer automáticamente los datos para evitar por completo la carga manual por parte del usuario. </w:t>
+      </w:r>
+      <w:proofErr w:type="gramStart"/>
+      <w:r>
+        <w:t>Los campos a extraer</w:t>
+      </w:r>
+      <w:proofErr w:type="gramEnd"/>
+      <w:r>
+        <w:t>/llenar son:</w:t>
+      </w:r>
+    </w:p>
+    <w:p>
+      <w:pPr>
+        <w:numPr>
+          <w:ilvl w:val="1"/>
+          <w:numId w:val="10"/>
+        </w:numPr>
+      </w:pPr>
+      <w:r>
+        <w:t xml:space="preserve">Tipo de Comprobante (A, B, C o </w:t>
+      </w:r>
+      <w:proofErr w:type="gramStart"/>
+      <w:r>
+        <w:t>Ticket</w:t>
+      </w:r>
+      <w:proofErr w:type="gramEnd"/>
+      <w:r>
+        <w:t>).</w:t>
+      </w:r>
+    </w:p>
+    <w:p>
+      <w:pPr>
+        <w:numPr>
+          <w:ilvl w:val="1"/>
+          <w:numId w:val="10"/>
+        </w:numPr>
+      </w:pPr>
+      <w:r>
+        <w:t>Nº de Factura, Fecha, Descripción, Monto Total, Subtotal.</w:t>
+      </w:r>
+    </w:p>
+    <w:p>
+      <w:pPr>
+        <w:numPr>
+          <w:ilvl w:val="1"/>
+          <w:numId w:val="10"/>
+        </w:numPr>
+      </w:pPr>
+      <w:r>
+        <w:t>IVA (21%, 10.5%, 27%, No Gravado. Capacidad para registrar 2 IVAs simultáneos).</w:t>
+      </w:r>
+    </w:p>
+    <w:p>
+      <w:pPr>
+        <w:numPr>
+          <w:ilvl w:val="1"/>
+          <w:numId w:val="10"/>
+        </w:numPr>
+      </w:pPr>
+      <w:r>
+        <w:rPr>
+          <w:i/>
+          <w:iCs/>
+        </w:rPr>
+        <w:t>Inputs manuales requeridos:</w:t>
+      </w:r>
+      <w:r>
+        <w:t xml:space="preserve"> Forma de pago (Efectivo/Tarjeta) y Establecimiento destino</w:t>
+      </w:r>
+      <w:r>
+        <w:t xml:space="preserve"> a través de una lista desplegable</w:t>
+      </w:r>
+      <w:r>
+        <w:t>.</w:t>
+      </w:r>
+    </w:p>
+    <w:p>
+      <w:pPr>
+        <w:numPr>
+          <w:ilvl w:val="1"/>
+          <w:numId w:val="10"/>
+        </w:numPr>
+      </w:pPr>
+      <w:r>
+        <w:rPr>
+          <w:i/>
+          <w:iCs/>
+        </w:rPr>
+        <w:t>Nota:</w:t>
+      </w:r>
+      <w:r>
+        <w:t xml:space="preserve"> Todos los datos auto-extraídos deben ser editables por el usuario para corregir errores de lectura del OCR.</w:t>
+      </w:r>
+    </w:p>
+    <w:p>
+      <w:pPr>
+        <w:numPr>
+          <w:ilvl w:val="0"/>
+          <w:numId w:val="10"/>
+        </w:numPr>
+      </w:pPr>
+      <w:r>
+        <w:rPr>
+          <w:b/>
+          <w:bCs/>
+        </w:rPr>
+        <w:t>Validación Final:</w:t>
+      </w:r>
+      <w:r>
+        <w:t xml:space="preserve"> Botón "Registrar". Confirma la carga exitosa, limpia los campos y bloquea el envío si faltan datos.</w:t>
+      </w:r>
+    </w:p>
+    <w:p>
+      <w:r>
+        <w:rPr>
+          <w:b/>
+          <w:bCs/>
+        </w:rPr>
+        <w:t>C. Historial</w:t>
+      </w:r>
+    </w:p>
+    <w:p>
+      <w:pPr>
+        <w:numPr>
+          <w:ilvl w:val="0"/>
+          <w:numId w:val="12"/>
+        </w:numPr>
+      </w:pPr>
+      <w:r>
+        <w:rPr>
+          <w:b/>
+          <w:bCs/>
+        </w:rPr>
+        <w:t>Filtros:</w:t>
+      </w:r>
+      <w:r>
+        <w:t xml:space="preserve"> Día, Semana, Mes.</w:t>
+      </w:r>
+    </w:p>
+    <w:p>
+      <w:pPr>
+        <w:numPr>
+          <w:ilvl w:val="0"/>
+          <w:numId w:val="12"/>
+        </w:numPr>
+      </w:pPr>
+      <w:r>
+        <w:rPr>
+          <w:b/>
+          <w:bCs/>
+        </w:rPr>
+        <w:t>Diseño de Lista:</w:t>
+      </w:r>
+      <w:r>
+        <w:t xml:space="preserve"> Tarjetas individuales con bordes redondeados.</w:t>
+      </w:r>
+    </w:p>
+    <w:p>
+      <w:pPr>
+        <w:numPr>
+          <w:ilvl w:val="0"/>
+          <w:numId w:val="12"/>
+        </w:numPr>
+      </w:pPr>
+      <w:r>
+        <w:rPr>
+          <w:b/>
+          <w:bCs/>
+        </w:rPr>
+        <w:t>Datos por Tarjeta:</w:t>
+      </w:r>
+      <w:r>
+        <w:t xml:space="preserve"> Descripción, Monto, Fecha de carga, Método (Efectivo/Tarjeta).</w:t>
+      </w:r>
+    </w:p>
+    <w:p>
+      <w:pPr>
+        <w:numPr>
+          <w:ilvl w:val="0"/>
+          <w:numId w:val="12"/>
+        </w:numPr>
+      </w:pPr>
+      <w:r>
+        <w:rPr>
+          <w:b/>
+          <w:bCs/>
+        </w:rPr>
+        <w:t>Acción Rápida:</w:t>
+      </w:r>
+      <w:r>
+        <w:t xml:space="preserve"> Botón "Nuevo" en la esquina superior derecha que redirige a la vista "Nuevo Registro".</w:t>
+      </w:r>
+    </w:p>
+    <w:p>
+      <w:pPr>
+        <w:pStyle w:val="NormalWeb"/>
+        <w:numPr>
+          <w:ilvl w:val="0"/>
+          <w:numId w:val="12"/>
+        </w:numPr>
+      </w:pPr>
+      <w:r>
+        <w:rPr>
+          <w:b/>
+          <w:bCs/>
+        </w:rPr>
+        <w:t>Nueva Función:</w:t>
+      </w:r>
+      <w:r>
+        <w:t xml:space="preserve"> Reporte General.</w:t>
+      </w:r>
+      <w:r>
+        <w:t xml:space="preserve"> En la parte superior de la vista de Historial, junto al botón de "Nuevo", se agregará un botón de "Exportar (Excel) / Imprimir Reporte".</w:t>
+      </w:r>
+    </w:p>
+    <w:p>
+      <w:pPr>
+        <w:pStyle w:val="NormalWeb"/>
+        <w:numPr>
+          <w:ilvl w:val="0"/>
+          <w:numId w:val="20"/>
+        </w:numPr>
+      </w:pPr>
+      <w:r>
+        <w:t>Comportamiento:</w:t>
+      </w:r>
+      <w:r>
+        <w:t xml:space="preserve"> Esto descargará el listado completo de los movimientos en pantalla, incluyendo </w:t>
+      </w:r>
+      <w:r>
+        <w:t>tanto Ingresos como Egresos</w:t>
+      </w:r>
+      <w:r>
+        <w:t>, filtrados por el rango de tiempo seleccionado (Diario a Anual).</w:t>
+      </w:r>
+    </w:p>
+    <w:p>
+      <w:pPr>
+        <w:ind w:left="720"/>
+      </w:pPr>
+    </w:p>
+    <w:p>
+      <w:r>
+        <w:rPr>
+          <w:b/>
+          <w:bCs/>
+        </w:rPr>
+        <w:t>D. Perfil</w:t>
+      </w:r>
+    </w:p>
+    <w:p>
+      <w:pPr>
+        <w:numPr>
+          <w:ilvl w:val="0"/>
+          <w:numId w:val="13"/>
+        </w:numPr>
+      </w:pPr>
+      <w:r>
+        <w:rPr>
+          <w:b/>
+          <w:bCs/>
+        </w:rPr>
+        <w:t>Visualización:</w:t>
+      </w:r>
+      <w:r>
+        <w:t xml:space="preserve"> Datos cargados en el registro inicial.</w:t>
+      </w:r>
+    </w:p>
+    <w:p>
+      <w:pPr>
+        <w:numPr>
+          <w:ilvl w:val="0"/>
+          <w:numId w:val="13"/>
+        </w:numPr>
+      </w:pPr>
+      <w:r>
+        <w:rPr>
+          <w:b/>
+          <w:bCs/>
+        </w:rPr>
+        <w:t>Edición:</w:t>
+      </w:r>
+      <w:r>
+        <w:t xml:space="preserve"> Permite agregar Número Telefónico, Establecimiento a cargo y un campo de texto libre para "Comentarios".</w:t>
+      </w:r>
+    </w:p>
+    <w:p>
+      <w:pPr>
+        <w:rPr>
+          <w:b/>
+          <w:bCs/>
+        </w:rPr>
+      </w:pPr>
+      <w:r>
+        <w:rPr>
+          <w:b/>
+          <w:bCs/>
+        </w:rPr>
+        <w:t>3. Requisitos Administrativos y de Arquitectura</w:t>
+      </w:r>
+    </w:p>
+    <w:p>
+      <w:pPr>
+        <w:numPr>
+          <w:ilvl w:val="0"/>
+          <w:numId w:val="14"/>
+        </w:numPr>
+      </w:pPr>
+      <w:r>
+        <w:rPr>
+          <w:b/>
+          <w:bCs/>
+        </w:rPr>
+        <w:lastRenderedPageBreak/>
+        <w:t>Entorno de Pruebas:</w:t>
+      </w:r>
+      <w:r>
+        <w:t xml:space="preserve"> El diseño debe renderizarse primero en una versión Web responsiva para que el cliente apruebe la UI y pruebe las funciones antes del empaquetado móvil.</w:t>
+      </w:r>
+    </w:p>
+    <w:p>
+      <w:pPr>
+        <w:numPr>
+          <w:ilvl w:val="0"/>
+          <w:numId w:val="14"/>
+        </w:numPr>
+      </w:pPr>
+      <w:r>
+        <w:rPr>
+          <w:b/>
+          <w:bCs/>
+        </w:rPr>
+        <w:t>Panel de Administrador:</w:t>
+      </w:r>
+      <w:r>
+        <w:t xml:space="preserve"> El rol de administrador debe tener permisos globales para navegar, visualizar y auditar los registros y movimientos de cualquier usuario del sistema.</w:t>
+      </w:r>
+    </w:p>
+    <w:p>
+      <w:pPr>
+        <w:numPr>
+          <w:ilvl w:val="0"/>
+          <w:numId w:val="14"/>
+        </w:numPr>
+      </w:pPr>
+      <w:r>
+        <w:rPr>
+          <w:b/>
+          <w:bCs/>
+        </w:rPr>
+        <w:t>Grabación de Prueba:</w:t>
+      </w:r>
+      <w:r>
+        <w:t xml:space="preserve"> No realizar la grabación de prueba o visualización.</w:t>
+      </w:r>
+    </w:p>
+    <w:p>
+      <w:pPr>
+        <w:rPr>
+          <w:b/>
+          <w:bCs/>
+        </w:rPr>
+      </w:pPr>
+      <w:r>
+        <w:rPr>
+          <w:b/>
+          <w:bCs/>
+        </w:rPr>
+        <w:t>Definiciones Técnicas Finales</w:t>
+      </w:r>
+    </w:p>
+    <w:p>
+      <w:r>
+        <w:rPr>
+          <w:b/>
+          <w:bCs/>
+        </w:rPr>
+        <w:t>1. Motor de Extracción (OCR) Recomendado</w:t>
+      </w:r>
+      <w:r>
+        <w:t xml:space="preserve"> Para lidiar con la complejidad y variabilidad de las facturas argentinas (A, B, C y </w:t>
+      </w:r>
+      <w:proofErr w:type="gramStart"/>
+      <w:r>
+        <w:t>tickets</w:t>
+      </w:r>
+      <w:proofErr w:type="gramEnd"/>
+      <w:r>
+        <w:t xml:space="preserve">), la mejor opción actual en el mercado es utilizar </w:t>
+      </w:r>
+      <w:r>
+        <w:rPr>
+          <w:b/>
+          <w:bCs/>
+        </w:rPr>
+        <w:t>Google Cloud Document AI</w:t>
+      </w:r>
+      <w:r>
+        <w:t xml:space="preserve"> o </w:t>
+      </w:r>
+      <w:r>
+        <w:rPr>
+          <w:b/>
+          <w:bCs/>
+        </w:rPr>
+        <w:t>AWS Textract</w:t>
+      </w:r>
+      <w:r>
+        <w:t>.</w:t>
+      </w:r>
+    </w:p>
+    <w:p>
+      <w:pPr>
+        <w:numPr>
+          <w:ilvl w:val="0"/>
+          <w:numId w:val="15"/>
+        </w:numPr>
+      </w:pPr>
+      <w:r>
+        <w:rPr>
+          <w:b/>
+          <w:bCs/>
+        </w:rPr>
+        <w:t>¿Por qué?</w:t>
+      </w:r>
+      <w:r>
+        <w:t xml:space="preserve"> A diferencia de un OCR tradicional que solo lee texto suelto, estas son herramientas de Inteligencia Artificial entrenadas específicamente para "entender" facturas. Buscan automáticamente pares de datos (ejemplo: encuentran la palabra "Total" o "IVA" y capturan el número que está al lado, sin importar el formato de la imprenta).</w:t>
+      </w:r>
+    </w:p>
+    <w:p>
+      <w:r>
+        <w:rPr>
+          <w:b/>
+          <w:bCs/>
+        </w:rPr>
+        <w:t>2. Experiencia de Carga (UI/UX) y Procesamiento</w:t>
+      </w:r>
+      <w:r>
+        <w:t xml:space="preserve"> El procesamiento de imágenes y lectura de PDFs tomará unos segundos. Para manejar esto, el escaneo se ejecutará en un proceso en segundo plano (background thread). En la interfaz se mostrará un indicador de carga animado (un </w:t>
+      </w:r>
+      <w:r>
+        <w:rPr>
+          <w:i/>
+          <w:iCs/>
+        </w:rPr>
+        <w:t>spinner</w:t>
+      </w:r>
+      <w:r>
+        <w:t xml:space="preserve"> o barra de progreso) acompañado de un texto como </w:t>
+      </w:r>
+      <w:r>
+        <w:rPr>
+          <w:i/>
+          <w:iCs/>
+        </w:rPr>
+        <w:t>"Analizando comprobante..."</w:t>
+      </w:r>
+      <w:r>
+        <w:t>. Esto asegurará que la interfaz siga respondiendo a las interacciones del sistema y evitará por completo que la pantalla colapse o se quede congelada de forma permanente esperando el resultado. Además, se incluirá un límite de tiempo (timeout): si el archivo es ilegible o el servicio tarda demasiado, el proceso se interrumpirá mostrando un mensaje de error amigable para que el usuario pueda hacer la carga manual, asegurando que la aplicación nunca quede tildada.</w:t>
+      </w:r>
+    </w:p>
+    <w:p>
+      <w:r>
+        <w:rPr>
+          <w:b/>
+          <w:bCs/>
+        </w:rPr>
+        <w:t>3. Sistema de Roles y Base de Datos</w:t>
+      </w:r>
+      <w:r>
+        <w:t xml:space="preserve"> Se implementará un sistema de permisos basado en atributos en la base de datos central. Cada cuenta creada tendrá un campo oculto (por ejemplo: rol: "usuario" o rol: "administrador"). Al iniciar sesión con tu cuenta de administrador, la aplicación leerá este permiso y desbloqueará dinámicamente una vista especial en el Dashboard que te permitirá desplegar una lista de todos los usuarios, entrar a sus perfiles y auditar o editar sus movimientos.</w:t>
+      </w:r>
+    </w:p>
+    <w:p>
+      <w:r>
+        <w:rPr>
+          <w:b/>
+          <w:bCs/>
+        </w:rPr>
+        <w:t>4. Política de Retención de Archivos</w:t>
+      </w:r>
+      <w:r>
+        <w:t xml:space="preserve"> Para optimizar costos de servidor y liberar espacio, se programará una tarea automatizada (conocida como </w:t>
+      </w:r>
+      <w:r>
+        <w:rPr>
+          <w:i/>
+          <w:iCs/>
+        </w:rPr>
+        <w:t>Cron Job</w:t>
+      </w:r>
+      <w:r>
+        <w:t xml:space="preserve">) en el servidor (backend). Este proceso se ejecutará de forma silenciosa todos los días a la madrugada. Su función será escanear el almacenamiento en la nube, identificar </w:t>
+      </w:r>
+      <w:r>
+        <w:lastRenderedPageBreak/>
+        <w:t>todas las imágenes y PDFs cuya fecha de subida sea mayor a 60 días (2 meses) y eliminarlos permanentemente. Los datos de texto del gasto (monto, fecha, descripción) permanecerán intactos en el historial.</w:t>
+      </w:r>
+    </w:p>
+    <w:p>
+      <w:r>
+        <w:rPr>
+          <w:b/>
+          <w:bCs/>
+        </w:rPr>
+        <w:t>5. Arquitectura "Offline-First" (Sin Conexión)</w:t>
+      </w:r>
+      <w:r>
+        <w:t xml:space="preserve"> Dado que los establecimientos tienen nula o baja conectividad, la aplicación se programará bajo una arquitectura "Primero Fuera de Línea".</w:t>
+      </w:r>
+    </w:p>
+    <w:p>
+      <w:pPr>
+        <w:numPr>
+          <w:ilvl w:val="0"/>
+          <w:numId w:val="16"/>
+        </w:numPr>
+      </w:pPr>
+      <w:r>
+        <w:rPr>
+          <w:b/>
+          <w:bCs/>
+        </w:rPr>
+        <w:t>Funcionamiento:</w:t>
+      </w:r>
+      <w:r>
+        <w:t xml:space="preserve"> La </w:t>
+      </w:r>
+      <w:proofErr w:type="gramStart"/>
+      <w:r>
+        <w:t>app</w:t>
+      </w:r>
+      <w:proofErr w:type="gramEnd"/>
+      <w:r>
+        <w:t xml:space="preserve"> tendrá una base de datos local (dentro del mismo teléfono). Cuando un usuario registre un gasto en "El Moro", la </w:t>
+      </w:r>
+      <w:proofErr w:type="gramStart"/>
+      <w:r>
+        <w:t>app</w:t>
+      </w:r>
+      <w:proofErr w:type="gramEnd"/>
+      <w:r>
+        <w:t xml:space="preserve"> lo guardará instantáneamente en el teléfono con un estado de </w:t>
+      </w:r>
+      <w:r>
+        <w:rPr>
+          <w:i/>
+          <w:iCs/>
+        </w:rPr>
+        <w:t>"Pendiente de sincronización"</w:t>
+      </w:r>
+      <w:r>
+        <w:t>, permitiendo al usuario seguir trabajando sin interrupciones ni errores de conexión.</w:t>
+      </w:r>
+    </w:p>
+    <w:p>
+      <w:pPr>
+        <w:numPr>
+          <w:ilvl w:val="0"/>
+          <w:numId w:val="16"/>
+        </w:numPr>
+      </w:pPr>
+      <w:r>
+        <w:rPr>
+          <w:b/>
+          <w:bCs/>
+        </w:rPr>
+        <w:t>Sincronización Automática:</w:t>
+      </w:r>
+      <w:r>
+        <w:t xml:space="preserve"> Un servicio en segundo plano monitoreará constantemente el estado de la red. En el momento en que el teléfono detecte señal de internet (3G/4G o Wi-Fi), la aplicación enviará automáticamente los registros pendientes a la base de datos principal en la nube.</w:t>
+      </w:r>
+    </w:p>
+    <w:p>
+      <w:pPr>
+        <w:pStyle w:val="Prrafodelista"/>
+        <w:numPr>
+          <w:ilvl w:val="0"/>
+          <w:numId w:val="7"/>
+        </w:numPr>
+      </w:pPr>
+      <w:r>
+        <w:rPr>
+          <w:b/>
+          <w:bCs/>
+        </w:rPr>
+        <w:t xml:space="preserve">Impresión o exportación a Excel: </w:t>
+      </w:r>
+      <w:r>
+        <w:t>Para que esta función sea realmente útil, el Excel resultante se estructurará como una base de datos limpia (con columnas separadas para fechas, montos, establecimientos y categorías). Esta estructura tabular ordenada es ideal para que los datos queden listos por si más adelante querés aplicarles macros o cruzar información rápidamente sin tener que andar acomodando celdas a mano.</w:t>
+      </w:r>
+    </w:p>
+    <w:p>
+      <w:pPr>
+        <w:pStyle w:val="Prrafodelista"/>
+      </w:pPr>
+      <w:r>
+        <w:t xml:space="preserve">Además, compilar meses o años enteros de historial en un archivo puede tomar un par de segundos. Para evitar el problema de que la pantalla de carga quede tildada o el usuario piense que la </w:t>
+      </w:r>
+      <w:proofErr w:type="gramStart"/>
+      <w:r>
+        <w:t>app</w:t>
+      </w:r>
+      <w:proofErr w:type="gramEnd"/>
+      <w:r>
+        <w:t xml:space="preserve"> se trabó, esta acción mostrará un indicador de "Generando archivo..." claro y animado, manteniendo la interfaz fluida en todo momento.</w:t>
+      </w:r>
+    </w:p>
+    <w:p>
+      <w:pPr>
+        <w:pStyle w:val="Prrafodelista"/>
+      </w:pPr>
+    </w:p>
+    <w:p>
+      <w:pPr>
+        <w:pStyle w:val="Prrafodelista"/>
+        <w:rPr>
+          <w:b/>
+          <w:bCs/>
+        </w:rPr>
+      </w:pPr>
+      <w:r>
+        <w:rPr>
+          <w:b/>
+          <w:bCs/>
+        </w:rPr>
+        <w:t>Actualizaciones Finales al Documento de Diseño</w:t>
+      </w:r>
+    </w:p>
+    <w:p>
+      <w:pPr>
+        <w:pStyle w:val="Prrafodelista"/>
+      </w:pPr>
+      <w:r>
+        <w:rPr>
+          <w:b/>
+          <w:bCs/>
+        </w:rPr>
+        <w:t>1. Formato de Exportación a Excel (Diseño Híbrido)</w:t>
+      </w:r>
+    </w:p>
+    <w:p>
+      <w:pPr>
+        <w:pStyle w:val="Prrafodelista"/>
+        <w:numPr>
+          <w:ilvl w:val="0"/>
+          <w:numId w:val="21"/>
+        </w:numPr>
+      </w:pPr>
+      <w:r>
+        <w:t>Al seleccionar la opción "Exportar (Excel)", el sistema generará un archivo .xlsx estructurado en dos solapas (hojas) para satisfacer ambas necesidades:</w:t>
+      </w:r>
+    </w:p>
+    <w:p>
+      <w:pPr>
+        <w:pStyle w:val="Prrafodelista"/>
+        <w:numPr>
+          <w:ilvl w:val="1"/>
+          <w:numId w:val="21"/>
+        </w:numPr>
+      </w:pPr>
+      <w:r>
+        <w:rPr>
+          <w:b/>
+          <w:bCs/>
+        </w:rPr>
+        <w:t>Hoja 1 - Reporte Ejecutivo:</w:t>
+      </w:r>
+      <w:r>
+        <w:t xml:space="preserve"> Contendrá un diseño visual atractivo con el logo de "Agropecuaria Las Marias", los colores corporativos (Naranja y Amarillo), la fecha de emisión, el rango del filtro aplicado y los totales sumariados al final de la tabla.</w:t>
+      </w:r>
+    </w:p>
+    <w:p>
+      <w:pPr>
+        <w:pStyle w:val="Prrafodelista"/>
+        <w:numPr>
+          <w:ilvl w:val="1"/>
+          <w:numId w:val="21"/>
+        </w:numPr>
+      </w:pPr>
+      <w:r>
+        <w:rPr>
+          <w:b/>
+          <w:bCs/>
+        </w:rPr>
+        <w:t>Hoja 2 - Base de Datos Plana:</w:t>
+      </w:r>
+      <w:r>
+        <w:t xml:space="preserve"> Contendrá los mismos </w:t>
+      </w:r>
+      <w:proofErr w:type="gramStart"/>
+      <w:r>
+        <w:t>datos</w:t>
+      </w:r>
+      <w:proofErr w:type="gramEnd"/>
+      <w:r>
+        <w:t xml:space="preserve"> pero en un formato de tabla cruda (sin estilos visuales complejos ni celdas </w:t>
+      </w:r>
+      <w:r>
+        <w:lastRenderedPageBreak/>
+        <w:t>combinadas), lista para ser importada a otros sistemas, utilizar macros o facilitar el trabajo contable.</w:t>
+      </w:r>
+    </w:p>
+    <w:p>
+      <w:pPr>
+        <w:pStyle w:val="Prrafodelista"/>
+      </w:pPr>
+      <w:r>
+        <w:rPr>
+          <w:b/>
+          <w:bCs/>
+        </w:rPr>
+        <w:t>2. Formato de Impresión (PDF A4)</w:t>
+      </w:r>
+    </w:p>
+    <w:p>
+      <w:pPr>
+        <w:pStyle w:val="Prrafodelista"/>
+        <w:numPr>
+          <w:ilvl w:val="0"/>
+          <w:numId w:val="22"/>
+        </w:numPr>
+      </w:pPr>
+      <w:r>
+        <w:t xml:space="preserve">Al presionar el botón "Imprimir", la aplicación no dependerá del Excel. En su lugar, generará automáticamente un documento </w:t>
+      </w:r>
+      <w:r>
+        <w:rPr>
+          <w:b/>
+          <w:bCs/>
+        </w:rPr>
+        <w:t>PDF maquetado específicamente para tamaño de hoja A4</w:t>
+      </w:r>
+      <w:r>
+        <w:t>.</w:t>
+      </w:r>
+    </w:p>
+    <w:p>
+      <w:pPr>
+        <w:pStyle w:val="Prrafodelista"/>
+        <w:numPr>
+          <w:ilvl w:val="0"/>
+          <w:numId w:val="22"/>
+        </w:numPr>
+      </w:pPr>
+      <w:r>
+        <w:t>Este PDF incluirá el membrete de la empresa, el detalle de los movimientos (Ingresos/Egresos según el filtro) y estará optimizado en blanco, negro y escala de grises para no gastar tinta innecesariamente, manteniendo detalles sutiles en los colores corporativos.</w:t>
+      </w:r>
+    </w:p>
+    <w:p>
+      <w:pPr>
+        <w:pStyle w:val="Prrafodelista"/>
+      </w:pPr>
+      <w:r>
+        <w:rPr>
+          <w:b/>
+          <w:bCs/>
+        </w:rPr>
+        <w:t>3. Permisos de Exportación e Impresión</w:t>
+      </w:r>
+    </w:p>
+    <w:p>
+      <w:pPr>
+        <w:pStyle w:val="Prrafodelista"/>
+        <w:numPr>
+          <w:ilvl w:val="0"/>
+          <w:numId w:val="23"/>
+        </w:numPr>
+      </w:pPr>
+      <w:r>
+        <w:rPr>
+          <w:b/>
+          <w:bCs/>
+        </w:rPr>
+        <w:t>Acceso Universal:</w:t>
+      </w:r>
+      <w:r>
+        <w:t xml:space="preserve"> La función de exportar a Excel y generar el PDF de impresión estará habilitada para todos los usuarios.</w:t>
+      </w:r>
+    </w:p>
+    <w:p>
+      <w:pPr>
+        <w:pStyle w:val="Prrafodelista"/>
+        <w:numPr>
+          <w:ilvl w:val="0"/>
+          <w:numId w:val="23"/>
+        </w:numPr>
+      </w:pPr>
+      <w:r>
+        <w:rPr>
+          <w:b/>
+          <w:bCs/>
+        </w:rPr>
+        <w:t>Lógica de Datos:</w:t>
+      </w:r>
+      <w:r>
+        <w:t xml:space="preserve"> Los empleados estándar solo podrán generar reportes y descargar la información correspondiente a </w:t>
+      </w:r>
+      <w:r>
+        <w:rPr>
+          <w:i/>
+          <w:iCs/>
+        </w:rPr>
+        <w:t>sus propios</w:t>
+      </w:r>
+      <w:r>
+        <w:t xml:space="preserve"> movimientos cargados. El usuario Administrador, desde su vista global, podrá generar reportes que incluyan los movimientos de todos los empleados y establecimientos.</w:t>
+      </w:r>
+    </w:p>
+    <w:p>
+      <w:pPr>
+        <w:pStyle w:val="Prrafodelista"/>
+      </w:pPr>
+      <w:r>
+        <w:rPr>
+          <w:b/>
+          <w:bCs/>
+        </w:rPr>
+        <w:t>4. Nota Técnica de Rendimiento (Prevención de Cuelgues)</w:t>
+      </w:r>
+    </w:p>
+    <w:p>
+      <w:pPr>
+        <w:pStyle w:val="Prrafodelista"/>
+        <w:numPr>
+          <w:ilvl w:val="0"/>
+          <w:numId w:val="24"/>
+        </w:numPr>
+      </w:pPr>
+      <w:r>
+        <w:t>Tanto la generación de reportes (Excel/PDF) como la extracción automática de datos (OCR) de facturas son procesos pesados. Para asegurar el rendimiento óptimo, estas tareas se ejecutarán de forma asíncrona.</w:t>
+      </w:r>
+    </w:p>
+    <w:p>
+      <w:pPr>
+        <w:pStyle w:val="Prrafodelista"/>
+        <w:numPr>
+          <w:ilvl w:val="0"/>
+          <w:numId w:val="24"/>
+        </w:numPr>
+      </w:pPr>
+      <w:r>
+        <w:t xml:space="preserve">Esto garantiza que la pantalla de carga se mantenga siempre fluida con su respectivo símbolo animado, </w:t>
+      </w:r>
+      <w:r>
+        <w:rPr>
+          <w:b/>
+          <w:bCs/>
+        </w:rPr>
+        <w:t>solucionando y previniendo definitivamente que la pantalla quede tildada o congelada</w:t>
+      </w:r>
+      <w:r>
+        <w:t xml:space="preserve"> mientras el sistema procesa la información</w:t>
+      </w:r>
+    </w:p>
+    <w:p>
+      <w:pPr>
+        <w:pStyle w:val="Prrafodelista"/>
+      </w:pPr>
+    </w:p>
+    <w:p>
+      <w:pPr>
+        <w:pStyle w:val="Prrafodelista"/>
+      </w:pPr>
+    </w:p>
     <w:sectPr>
       <w:pgSz w:w="11906" w:h="16838"/>
       <w:pgMar w:top="1417" w:right="1701" w:bottom="1417" w:left="1701" w:header="708" w:footer="708" w:gutter="0"/>
@@ -924,9 +2243,307 @@
 <file path=word/numbering.xml><?xml version="1.0" encoding="utf-8"?>
 <w:numbering xmlns:wpc="http://schemas.microsoft.com/office/word/2010/wordprocessingCanvas" xmlns:cx="http://schemas.microsoft.com/office/drawing/2014/chartex" xmlns:cx1="http://schemas.microsoft.com/office/drawing/2015/9/8/chartex" xmlns:cx2="http://schemas.microsoft.com/office/drawing/2015/10/21/chartex" xmlns:cx3="http://schemas.microsoft.com/office/drawing/2016/5/9/chartex" xmlns:cx4="http://schemas.microsoft.com/office/drawing/2016/5/10/chartex" xmlns:cx5="http://schemas.microsoft.com/office/drawing/2016/5/11/chartex" xmlns:cx6="http://schemas.microsoft.com/office/drawing/2016/5/12/chartex" xmlns:cx7="http://schemas.microsoft.com/office/drawing/2016/5/13/chartex" xmlns:cx8="http://schemas.microsoft.com/office/drawing/2016/5/14/chartex" xmlns:mc="http://schemas.openxmlformats.org/markup-compatibility/2006" xmlns:aink="http://schemas.microsoft.com/office/drawing/2016/ink" xmlns:am3d="http://schemas.microsoft.com/office/drawing/2017/model3d" xmlns:o="urn:schemas-microsoft-com:office:office" xmlns:oel="http://schemas.microsoft.com/office/2019/extlst" xmlns:r="http://schemas.openxmlformats.org/officeDocument/2006/relationships" xmlns:m="http://schemas.openxmlformats.org/officeDocument/2006/math" xmlns:v="urn:schemas-microsoft-com:vml" xmlns:wp14="http://schemas.microsoft.com/office/word/2010/wordprocessingDrawing" xmlns:wp="http://schemas.openxmlformats.org/drawingml/2006/wordprocessingDrawing" xmlns:w10="urn:schemas-microsoft-com:office:word" xmlns:w="http://schemas.openxmlformats.org/wordprocessingml/2006/main" xmlns:w14="http://schemas.microsoft.com/office/word/2010/wordml" xmlns:w15="http://schemas.microsoft.com/office/word/2012/wordml" xmlns:w16cex="http://schemas.microsoft.com/office/word/2018/wordml/cex" xmlns:w16cid="http://schemas.microsoft.com/office/word/2016/wordml/cid" xmlns:w16="http://schemas.microsoft.com/office/word/2018/wordml" xmlns:w16du="http://schemas.microsoft.com/office/word/2023/wordml/word16du" xmlns:w16sdtdh="http://schemas.microsoft.com/office/word/2020/wordml/sdtdatahash" xmlns:w16sdtfl="http://schemas.microsoft.com/office/word/2024/wordml/sdtformatlock" xmlns:w16se="http://schemas.microsoft.com/office/word/2015/wordml/symex" xmlns:wpg="http://schemas.microsoft.com/office/word/2010/wordprocessingGroup" xmlns:wpi="http://schemas.microsoft.com/office/word/2010/wordprocessingInk" xmlns:wne="http://schemas.microsoft.com/office/word/2006/wordml" xmlns:wps="http://schemas.microsoft.com/office/word/2010/wordprocessingShape" mc:Ignorable="w14 w15 w16se w16cid w16 w16cex w16sdtdh w16sdtfl w16du wp14">
   <w:abstractNum w:abstractNumId="0" w15:restartNumberingAfterBreak="0">
+    <w:nsid w:val="042C427C"/>
+    <w:multiLevelType w:val="multilevel"/>
+    <w:tmpl w:val="BD760E86"/>
+    <w:lvl w:ilvl="0">
+      <w:start w:val="1"/>
+      <w:numFmt w:val="bullet"/>
+      <w:lvlText w:val=""/>
+      <w:lvlJc w:val="left"/>
+      <w:pPr>
+        <w:tabs>
+          <w:tab w:val="num" w:pos="720"/>
+        </w:tabs>
+        <w:ind w:left="720" w:hanging="360"/>
+      </w:pPr>
+      <w:rPr>
+        <w:rFonts w:ascii="Symbol" w:hAnsi="Symbol" w:hint="default"/>
+        <w:sz w:val="20"/>
+      </w:rPr>
+    </w:lvl>
+    <w:lvl w:ilvl="1" w:tentative="1">
+      <w:start w:val="1"/>
+      <w:numFmt w:val="bullet"/>
+      <w:lvlText w:val="o"/>
+      <w:lvlJc w:val="left"/>
+      <w:pPr>
+        <w:tabs>
+          <w:tab w:val="num" w:pos="1440"/>
+        </w:tabs>
+        <w:ind w:left="1440" w:hanging="360"/>
+      </w:pPr>
+      <w:rPr>
+        <w:rFonts w:ascii="Courier New" w:hAnsi="Courier New" w:hint="default"/>
+        <w:sz w:val="20"/>
+      </w:rPr>
+    </w:lvl>
+    <w:lvl w:ilvl="2" w:tentative="1">
+      <w:start w:val="1"/>
+      <w:numFmt w:val="bullet"/>
+      <w:lvlText w:val=""/>
+      <w:lvlJc w:val="left"/>
+      <w:pPr>
+        <w:tabs>
+          <w:tab w:val="num" w:pos="2160"/>
+        </w:tabs>
+        <w:ind w:left="2160" w:hanging="360"/>
+      </w:pPr>
+      <w:rPr>
+        <w:rFonts w:ascii="Wingdings" w:hAnsi="Wingdings" w:hint="default"/>
+        <w:sz w:val="20"/>
+      </w:rPr>
+    </w:lvl>
+    <w:lvl w:ilvl="3" w:tentative="1">
+      <w:start w:val="1"/>
+      <w:numFmt w:val="bullet"/>
+      <w:lvlText w:val=""/>
+      <w:lvlJc w:val="left"/>
+      <w:pPr>
+        <w:tabs>
+          <w:tab w:val="num" w:pos="2880"/>
+        </w:tabs>
+        <w:ind w:left="2880" w:hanging="360"/>
+      </w:pPr>
+      <w:rPr>
+        <w:rFonts w:ascii="Wingdings" w:hAnsi="Wingdings" w:hint="default"/>
+        <w:sz w:val="20"/>
+      </w:rPr>
+    </w:lvl>
+    <w:lvl w:ilvl="4" w:tentative="1">
+      <w:start w:val="1"/>
+      <w:numFmt w:val="bullet"/>
+      <w:lvlText w:val=""/>
+      <w:lvlJc w:val="left"/>
+      <w:pPr>
+        <w:tabs>
+          <w:tab w:val="num" w:pos="3600"/>
+        </w:tabs>
+        <w:ind w:left="3600" w:hanging="360"/>
+      </w:pPr>
+      <w:rPr>
+        <w:rFonts w:ascii="Wingdings" w:hAnsi="Wingdings" w:hint="default"/>
+        <w:sz w:val="20"/>
+      </w:rPr>
+    </w:lvl>
+    <w:lvl w:ilvl="5" w:tentative="1">
+      <w:start w:val="1"/>
+      <w:numFmt w:val="bullet"/>
+      <w:lvlText w:val=""/>
+      <w:lvlJc w:val="left"/>
+      <w:pPr>
+        <w:tabs>
+          <w:tab w:val="num" w:pos="4320"/>
+        </w:tabs>
+        <w:ind w:left="4320" w:hanging="360"/>
+      </w:pPr>
+      <w:rPr>
+        <w:rFonts w:ascii="Wingdings" w:hAnsi="Wingdings" w:hint="default"/>
+        <w:sz w:val="20"/>
+      </w:rPr>
+    </w:lvl>
+    <w:lvl w:ilvl="6" w:tentative="1">
+      <w:start w:val="1"/>
+      <w:numFmt w:val="bullet"/>
+      <w:lvlText w:val=""/>
+      <w:lvlJc w:val="left"/>
+      <w:pPr>
+        <w:tabs>
+          <w:tab w:val="num" w:pos="5040"/>
+        </w:tabs>
+        <w:ind w:left="5040" w:hanging="360"/>
+      </w:pPr>
+      <w:rPr>
+        <w:rFonts w:ascii="Wingdings" w:hAnsi="Wingdings" w:hint="default"/>
+        <w:sz w:val="20"/>
+      </w:rPr>
+    </w:lvl>
+    <w:lvl w:ilvl="7" w:tentative="1">
+      <w:start w:val="1"/>
+      <w:numFmt w:val="bullet"/>
+      <w:lvlText w:val=""/>
+      <w:lvlJc w:val="left"/>
+      <w:pPr>
+        <w:tabs>
+          <w:tab w:val="num" w:pos="5760"/>
+        </w:tabs>
+        <w:ind w:left="5760" w:hanging="360"/>
+      </w:pPr>
+      <w:rPr>
+        <w:rFonts w:ascii="Wingdings" w:hAnsi="Wingdings" w:hint="default"/>
+        <w:sz w:val="20"/>
+      </w:rPr>
+    </w:lvl>
+    <w:lvl w:ilvl="8" w:tentative="1">
+      <w:start w:val="1"/>
+      <w:numFmt w:val="bullet"/>
+      <w:lvlText w:val=""/>
+      <w:lvlJc w:val="left"/>
+      <w:pPr>
+        <w:tabs>
+          <w:tab w:val="num" w:pos="6480"/>
+        </w:tabs>
+        <w:ind w:left="6480" w:hanging="360"/>
+      </w:pPr>
+      <w:rPr>
+        <w:rFonts w:ascii="Wingdings" w:hAnsi="Wingdings" w:hint="default"/>
+        <w:sz w:val="20"/>
+      </w:rPr>
+    </w:lvl>
+  </w:abstractNum>
+  <w:abstractNum w:abstractNumId="1" w15:restartNumberingAfterBreak="0">
+    <w:nsid w:val="04FE44E7"/>
+    <w:multiLevelType w:val="multilevel"/>
+    <w:tmpl w:val="1A4E68EC"/>
+    <w:lvl w:ilvl="0">
+      <w:start w:val="1"/>
+      <w:numFmt w:val="bullet"/>
+      <w:lvlText w:val=""/>
+      <w:lvlJc w:val="left"/>
+      <w:pPr>
+        <w:tabs>
+          <w:tab w:val="num" w:pos="720"/>
+        </w:tabs>
+        <w:ind w:left="720" w:hanging="360"/>
+      </w:pPr>
+      <w:rPr>
+        <w:rFonts w:ascii="Symbol" w:hAnsi="Symbol" w:hint="default"/>
+        <w:sz w:val="20"/>
+      </w:rPr>
+    </w:lvl>
+    <w:lvl w:ilvl="1" w:tentative="1">
+      <w:start w:val="1"/>
+      <w:numFmt w:val="bullet"/>
+      <w:lvlText w:val="o"/>
+      <w:lvlJc w:val="left"/>
+      <w:pPr>
+        <w:tabs>
+          <w:tab w:val="num" w:pos="1440"/>
+        </w:tabs>
+        <w:ind w:left="1440" w:hanging="360"/>
+      </w:pPr>
+      <w:rPr>
+        <w:rFonts w:ascii="Courier New" w:hAnsi="Courier New" w:hint="default"/>
+        <w:sz w:val="20"/>
+      </w:rPr>
+    </w:lvl>
+    <w:lvl w:ilvl="2" w:tentative="1">
+      <w:start w:val="1"/>
+      <w:numFmt w:val="bullet"/>
+      <w:lvlText w:val=""/>
+      <w:lvlJc w:val="left"/>
+      <w:pPr>
+        <w:tabs>
+          <w:tab w:val="num" w:pos="2160"/>
+        </w:tabs>
+        <w:ind w:left="2160" w:hanging="360"/>
+      </w:pPr>
+      <w:rPr>
+        <w:rFonts w:ascii="Wingdings" w:hAnsi="Wingdings" w:hint="default"/>
+        <w:sz w:val="20"/>
+      </w:rPr>
+    </w:lvl>
+    <w:lvl w:ilvl="3" w:tentative="1">
+      <w:start w:val="1"/>
+      <w:numFmt w:val="bullet"/>
+      <w:lvlText w:val=""/>
+      <w:lvlJc w:val="left"/>
+      <w:pPr>
+        <w:tabs>
+          <w:tab w:val="num" w:pos="2880"/>
+        </w:tabs>
+        <w:ind w:left="2880" w:hanging="360"/>
+      </w:pPr>
+      <w:rPr>
+        <w:rFonts w:ascii="Wingdings" w:hAnsi="Wingdings" w:hint="default"/>
+        <w:sz w:val="20"/>
+      </w:rPr>
+    </w:lvl>
+    <w:lvl w:ilvl="4" w:tentative="1">
+      <w:start w:val="1"/>
+      <w:numFmt w:val="bullet"/>
+      <w:lvlText w:val=""/>
+      <w:lvlJc w:val="left"/>
+      <w:pPr>
+        <w:tabs>
+          <w:tab w:val="num" w:pos="3600"/>
+        </w:tabs>
+        <w:ind w:left="3600" w:hanging="360"/>
+      </w:pPr>
+      <w:rPr>
+        <w:rFonts w:ascii="Wingdings" w:hAnsi="Wingdings" w:hint="default"/>
+        <w:sz w:val="20"/>
+      </w:rPr>
+    </w:lvl>
+    <w:lvl w:ilvl="5" w:tentative="1">
+      <w:start w:val="1"/>
+      <w:numFmt w:val="bullet"/>
+      <w:lvlText w:val=""/>
+      <w:lvlJc w:val="left"/>
+      <w:pPr>
+        <w:tabs>
+          <w:tab w:val="num" w:pos="4320"/>
+        </w:tabs>
+        <w:ind w:left="4320" w:hanging="360"/>
+      </w:pPr>
+      <w:rPr>
+        <w:rFonts w:ascii="Wingdings" w:hAnsi="Wingdings" w:hint="default"/>
+        <w:sz w:val="20"/>
+      </w:rPr>
+    </w:lvl>
+    <w:lvl w:ilvl="6" w:tentative="1">
+      <w:start w:val="1"/>
+      <w:numFmt w:val="bullet"/>
+      <w:lvlText w:val=""/>
+      <w:lvlJc w:val="left"/>
+      <w:pPr>
+        <w:tabs>
+          <w:tab w:val="num" w:pos="5040"/>
+        </w:tabs>
+        <w:ind w:left="5040" w:hanging="360"/>
+      </w:pPr>
+      <w:rPr>
+        <w:rFonts w:ascii="Wingdings" w:hAnsi="Wingdings" w:hint="default"/>
+        <w:sz w:val="20"/>
+      </w:rPr>
+    </w:lvl>
+    <w:lvl w:ilvl="7" w:tentative="1">
+      <w:start w:val="1"/>
+      <w:numFmt w:val="bullet"/>
+      <w:lvlText w:val=""/>
+      <w:lvlJc w:val="left"/>
+      <w:pPr>
+        <w:tabs>
+          <w:tab w:val="num" w:pos="5760"/>
+        </w:tabs>
+        <w:ind w:left="5760" w:hanging="360"/>
+      </w:pPr>
+      <w:rPr>
+        <w:rFonts w:ascii="Wingdings" w:hAnsi="Wingdings" w:hint="default"/>
+        <w:sz w:val="20"/>
+      </w:rPr>
+    </w:lvl>
+    <w:lvl w:ilvl="8" w:tentative="1">
+      <w:start w:val="1"/>
+      <w:numFmt w:val="bullet"/>
+      <w:lvlText w:val=""/>
+      <w:lvlJc w:val="left"/>
+      <w:pPr>
+        <w:tabs>
+          <w:tab w:val="num" w:pos="6480"/>
+        </w:tabs>
+        <w:ind w:left="6480" w:hanging="360"/>
+      </w:pPr>
+      <w:rPr>
+        <w:rFonts w:ascii="Wingdings" w:hAnsi="Wingdings" w:hint="default"/>
+        <w:sz w:val="20"/>
+      </w:rPr>
+    </w:lvl>
+  </w:abstractNum>
+  <w:abstractNum w:abstractNumId="2" w15:restartNumberingAfterBreak="0">
     <w:nsid w:val="13FF592F"/>
     <w:multiLevelType w:val="multilevel"/>
-    <w:tmpl w:val="4798ECFA"/>
+    <w:tmpl w:val="31226490"/>
     <w:lvl w:ilvl="0">
       <w:start w:val="1"/>
       <w:numFmt w:val="bullet"/>
@@ -943,26 +2560,314 @@
         <w:sz w:val="20"/>
       </w:rPr>
     </w:lvl>
-    <w:lvl w:ilvl="1" w:tentative="1">
+    <w:lvl w:ilvl="1">
+      <w:numFmt w:val="bullet"/>
+      <w:lvlText w:val="-"/>
+      <w:lvlJc w:val="left"/>
+      <w:pPr>
+        <w:ind w:left="1440" w:hanging="360"/>
+      </w:pPr>
+      <w:rPr>
+        <w:rFonts w:ascii="Aptos" w:eastAsiaTheme="minorHAnsi" w:hAnsi="Aptos" w:cstheme="minorBidi" w:hint="default"/>
+      </w:rPr>
+    </w:lvl>
+    <w:lvl w:ilvl="2" w:tentative="1">
       <w:start w:val="1"/>
       <w:numFmt w:val="bullet"/>
       <w:lvlText w:val=""/>
       <w:lvlJc w:val="left"/>
       <w:pPr>
         <w:tabs>
+          <w:tab w:val="num" w:pos="2160"/>
+        </w:tabs>
+        <w:ind w:left="2160" w:hanging="360"/>
+      </w:pPr>
+      <w:rPr>
+        <w:rFonts w:ascii="Symbol" w:hAnsi="Symbol" w:hint="default"/>
+        <w:sz w:val="20"/>
+      </w:rPr>
+    </w:lvl>
+    <w:lvl w:ilvl="3" w:tentative="1">
+      <w:start w:val="1"/>
+      <w:numFmt w:val="bullet"/>
+      <w:lvlText w:val=""/>
+      <w:lvlJc w:val="left"/>
+      <w:pPr>
+        <w:tabs>
+          <w:tab w:val="num" w:pos="2880"/>
+        </w:tabs>
+        <w:ind w:left="2880" w:hanging="360"/>
+      </w:pPr>
+      <w:rPr>
+        <w:rFonts w:ascii="Symbol" w:hAnsi="Symbol" w:hint="default"/>
+        <w:sz w:val="20"/>
+      </w:rPr>
+    </w:lvl>
+    <w:lvl w:ilvl="4" w:tentative="1">
+      <w:start w:val="1"/>
+      <w:numFmt w:val="bullet"/>
+      <w:lvlText w:val=""/>
+      <w:lvlJc w:val="left"/>
+      <w:pPr>
+        <w:tabs>
+          <w:tab w:val="num" w:pos="3600"/>
+        </w:tabs>
+        <w:ind w:left="3600" w:hanging="360"/>
+      </w:pPr>
+      <w:rPr>
+        <w:rFonts w:ascii="Symbol" w:hAnsi="Symbol" w:hint="default"/>
+        <w:sz w:val="20"/>
+      </w:rPr>
+    </w:lvl>
+    <w:lvl w:ilvl="5" w:tentative="1">
+      <w:start w:val="1"/>
+      <w:numFmt w:val="bullet"/>
+      <w:lvlText w:val=""/>
+      <w:lvlJc w:val="left"/>
+      <w:pPr>
+        <w:tabs>
+          <w:tab w:val="num" w:pos="4320"/>
+        </w:tabs>
+        <w:ind w:left="4320" w:hanging="360"/>
+      </w:pPr>
+      <w:rPr>
+        <w:rFonts w:ascii="Symbol" w:hAnsi="Symbol" w:hint="default"/>
+        <w:sz w:val="20"/>
+      </w:rPr>
+    </w:lvl>
+    <w:lvl w:ilvl="6" w:tentative="1">
+      <w:start w:val="1"/>
+      <w:numFmt w:val="bullet"/>
+      <w:lvlText w:val=""/>
+      <w:lvlJc w:val="left"/>
+      <w:pPr>
+        <w:tabs>
+          <w:tab w:val="num" w:pos="5040"/>
+        </w:tabs>
+        <w:ind w:left="5040" w:hanging="360"/>
+      </w:pPr>
+      <w:rPr>
+        <w:rFonts w:ascii="Symbol" w:hAnsi="Symbol" w:hint="default"/>
+        <w:sz w:val="20"/>
+      </w:rPr>
+    </w:lvl>
+    <w:lvl w:ilvl="7" w:tentative="1">
+      <w:start w:val="1"/>
+      <w:numFmt w:val="bullet"/>
+      <w:lvlText w:val=""/>
+      <w:lvlJc w:val="left"/>
+      <w:pPr>
+        <w:tabs>
+          <w:tab w:val="num" w:pos="5760"/>
+        </w:tabs>
+        <w:ind w:left="5760" w:hanging="360"/>
+      </w:pPr>
+      <w:rPr>
+        <w:rFonts w:ascii="Symbol" w:hAnsi="Symbol" w:hint="default"/>
+        <w:sz w:val="20"/>
+      </w:rPr>
+    </w:lvl>
+    <w:lvl w:ilvl="8" w:tentative="1">
+      <w:start w:val="1"/>
+      <w:numFmt w:val="bullet"/>
+      <w:lvlText w:val=""/>
+      <w:lvlJc w:val="left"/>
+      <w:pPr>
+        <w:tabs>
+          <w:tab w:val="num" w:pos="6480"/>
+        </w:tabs>
+        <w:ind w:left="6480" w:hanging="360"/>
+      </w:pPr>
+      <w:rPr>
+        <w:rFonts w:ascii="Symbol" w:hAnsi="Symbol" w:hint="default"/>
+        <w:sz w:val="20"/>
+      </w:rPr>
+    </w:lvl>
+  </w:abstractNum>
+  <w:abstractNum w:abstractNumId="3" w15:restartNumberingAfterBreak="0">
+    <w:nsid w:val="1B2228E5"/>
+    <w:multiLevelType w:val="multilevel"/>
+    <w:tmpl w:val="31226490"/>
+    <w:lvl w:ilvl="0">
+      <w:start w:val="1"/>
+      <w:numFmt w:val="bullet"/>
+      <w:lvlText w:val=""/>
+      <w:lvlJc w:val="left"/>
+      <w:pPr>
+        <w:tabs>
+          <w:tab w:val="num" w:pos="720"/>
+        </w:tabs>
+        <w:ind w:left="720" w:hanging="360"/>
+      </w:pPr>
+      <w:rPr>
+        <w:rFonts w:ascii="Symbol" w:hAnsi="Symbol" w:hint="default"/>
+        <w:sz w:val="20"/>
+      </w:rPr>
+    </w:lvl>
+    <w:lvl w:ilvl="1">
+      <w:numFmt w:val="bullet"/>
+      <w:lvlText w:val="-"/>
+      <w:lvlJc w:val="left"/>
+      <w:pPr>
+        <w:ind w:left="1440" w:hanging="360"/>
+      </w:pPr>
+      <w:rPr>
+        <w:rFonts w:ascii="Aptos" w:eastAsiaTheme="minorHAnsi" w:hAnsi="Aptos" w:cstheme="minorBidi" w:hint="default"/>
+      </w:rPr>
+    </w:lvl>
+    <w:lvl w:ilvl="2" w:tentative="1">
+      <w:start w:val="1"/>
+      <w:numFmt w:val="bullet"/>
+      <w:lvlText w:val=""/>
+      <w:lvlJc w:val="left"/>
+      <w:pPr>
+        <w:tabs>
+          <w:tab w:val="num" w:pos="2160"/>
+        </w:tabs>
+        <w:ind w:left="2160" w:hanging="360"/>
+      </w:pPr>
+      <w:rPr>
+        <w:rFonts w:ascii="Symbol" w:hAnsi="Symbol" w:hint="default"/>
+        <w:sz w:val="20"/>
+      </w:rPr>
+    </w:lvl>
+    <w:lvl w:ilvl="3" w:tentative="1">
+      <w:start w:val="1"/>
+      <w:numFmt w:val="bullet"/>
+      <w:lvlText w:val=""/>
+      <w:lvlJc w:val="left"/>
+      <w:pPr>
+        <w:tabs>
+          <w:tab w:val="num" w:pos="2880"/>
+        </w:tabs>
+        <w:ind w:left="2880" w:hanging="360"/>
+      </w:pPr>
+      <w:rPr>
+        <w:rFonts w:ascii="Symbol" w:hAnsi="Symbol" w:hint="default"/>
+        <w:sz w:val="20"/>
+      </w:rPr>
+    </w:lvl>
+    <w:lvl w:ilvl="4" w:tentative="1">
+      <w:start w:val="1"/>
+      <w:numFmt w:val="bullet"/>
+      <w:lvlText w:val=""/>
+      <w:lvlJc w:val="left"/>
+      <w:pPr>
+        <w:tabs>
+          <w:tab w:val="num" w:pos="3600"/>
+        </w:tabs>
+        <w:ind w:left="3600" w:hanging="360"/>
+      </w:pPr>
+      <w:rPr>
+        <w:rFonts w:ascii="Symbol" w:hAnsi="Symbol" w:hint="default"/>
+        <w:sz w:val="20"/>
+      </w:rPr>
+    </w:lvl>
+    <w:lvl w:ilvl="5" w:tentative="1">
+      <w:start w:val="1"/>
+      <w:numFmt w:val="bullet"/>
+      <w:lvlText w:val=""/>
+      <w:lvlJc w:val="left"/>
+      <w:pPr>
+        <w:tabs>
+          <w:tab w:val="num" w:pos="4320"/>
+        </w:tabs>
+        <w:ind w:left="4320" w:hanging="360"/>
+      </w:pPr>
+      <w:rPr>
+        <w:rFonts w:ascii="Symbol" w:hAnsi="Symbol" w:hint="default"/>
+        <w:sz w:val="20"/>
+      </w:rPr>
+    </w:lvl>
+    <w:lvl w:ilvl="6" w:tentative="1">
+      <w:start w:val="1"/>
+      <w:numFmt w:val="bullet"/>
+      <w:lvlText w:val=""/>
+      <w:lvlJc w:val="left"/>
+      <w:pPr>
+        <w:tabs>
+          <w:tab w:val="num" w:pos="5040"/>
+        </w:tabs>
+        <w:ind w:left="5040" w:hanging="360"/>
+      </w:pPr>
+      <w:rPr>
+        <w:rFonts w:ascii="Symbol" w:hAnsi="Symbol" w:hint="default"/>
+        <w:sz w:val="20"/>
+      </w:rPr>
+    </w:lvl>
+    <w:lvl w:ilvl="7" w:tentative="1">
+      <w:start w:val="1"/>
+      <w:numFmt w:val="bullet"/>
+      <w:lvlText w:val=""/>
+      <w:lvlJc w:val="left"/>
+      <w:pPr>
+        <w:tabs>
+          <w:tab w:val="num" w:pos="5760"/>
+        </w:tabs>
+        <w:ind w:left="5760" w:hanging="360"/>
+      </w:pPr>
+      <w:rPr>
+        <w:rFonts w:ascii="Symbol" w:hAnsi="Symbol" w:hint="default"/>
+        <w:sz w:val="20"/>
+      </w:rPr>
+    </w:lvl>
+    <w:lvl w:ilvl="8" w:tentative="1">
+      <w:start w:val="1"/>
+      <w:numFmt w:val="bullet"/>
+      <w:lvlText w:val=""/>
+      <w:lvlJc w:val="left"/>
+      <w:pPr>
+        <w:tabs>
+          <w:tab w:val="num" w:pos="6480"/>
+        </w:tabs>
+        <w:ind w:left="6480" w:hanging="360"/>
+      </w:pPr>
+      <w:rPr>
+        <w:rFonts w:ascii="Symbol" w:hAnsi="Symbol" w:hint="default"/>
+        <w:sz w:val="20"/>
+      </w:rPr>
+    </w:lvl>
+  </w:abstractNum>
+  <w:abstractNum w:abstractNumId="4" w15:restartNumberingAfterBreak="0">
+    <w:nsid w:val="255913A6"/>
+    <w:multiLevelType w:val="multilevel"/>
+    <w:tmpl w:val="E7D80B28"/>
+    <w:lvl w:ilvl="0">
+      <w:start w:val="1"/>
+      <w:numFmt w:val="bullet"/>
+      <w:lvlText w:val=""/>
+      <w:lvlJc w:val="left"/>
+      <w:pPr>
+        <w:tabs>
+          <w:tab w:val="num" w:pos="720"/>
+        </w:tabs>
+        <w:ind w:left="720" w:hanging="360"/>
+      </w:pPr>
+      <w:rPr>
+        <w:rFonts w:ascii="Symbol" w:hAnsi="Symbol" w:hint="default"/>
+        <w:sz w:val="20"/>
+      </w:rPr>
+    </w:lvl>
+    <w:lvl w:ilvl="1">
+      <w:start w:val="1"/>
+      <w:numFmt w:val="bullet"/>
+      <w:lvlText w:val="o"/>
+      <w:lvlJc w:val="left"/>
+      <w:pPr>
+        <w:tabs>
           <w:tab w:val="num" w:pos="1440"/>
         </w:tabs>
         <w:ind w:left="1440" w:hanging="360"/>
       </w:pPr>
       <w:rPr>
-        <w:rFonts w:ascii="Symbol" w:hAnsi="Symbol" w:hint="default"/>
+        <w:rFonts w:ascii="Courier New" w:hAnsi="Courier New" w:hint="default"/>
         <w:sz w:val="20"/>
       </w:rPr>
     </w:lvl>
     <w:lvl w:ilvl="2" w:tentative="1">
       <w:start w:val="1"/>
       <w:numFmt w:val="bullet"/>
-      <w:lvlText w:val=""/>
+      <w:lvlText w:val=""/>
       <w:lvlJc w:val="left"/>
       <w:pPr>
         <w:tabs>
@@ -971,14 +2876,14 @@
         <w:ind w:left="2160" w:hanging="360"/>
       </w:pPr>
       <w:rPr>
-        <w:rFonts w:ascii="Symbol" w:hAnsi="Symbol" w:hint="default"/>
+        <w:rFonts w:ascii="Wingdings" w:hAnsi="Wingdings" w:hint="default"/>
         <w:sz w:val="20"/>
       </w:rPr>
     </w:lvl>
     <w:lvl w:ilvl="3" w:tentative="1">
       <w:start w:val="1"/>
       <w:numFmt w:val="bullet"/>
-      <w:lvlText w:val=""/>
+      <w:lvlText w:val=""/>
       <w:lvlJc w:val="left"/>
       <w:pPr>
         <w:tabs>
@@ -987,14 +2892,14 @@
         <w:ind w:left="2880" w:hanging="360"/>
       </w:pPr>
       <w:rPr>
-        <w:rFonts w:ascii="Symbol" w:hAnsi="Symbol" w:hint="default"/>
+        <w:rFonts w:ascii="Wingdings" w:hAnsi="Wingdings" w:hint="default"/>
         <w:sz w:val="20"/>
       </w:rPr>
     </w:lvl>
     <w:lvl w:ilvl="4" w:tentative="1">
       <w:start w:val="1"/>
       <w:numFmt w:val="bullet"/>
-      <w:lvlText w:val=""/>
+      <w:lvlText w:val=""/>
       <w:lvlJc w:val="left"/>
       <w:pPr>
         <w:tabs>
@@ -1003,14 +2908,14 @@
         <w:ind w:left="3600" w:hanging="360"/>
       </w:pPr>
       <w:rPr>
-        <w:rFonts w:ascii="Symbol" w:hAnsi="Symbol" w:hint="default"/>
+        <w:rFonts w:ascii="Wingdings" w:hAnsi="Wingdings" w:hint="default"/>
         <w:sz w:val="20"/>
       </w:rPr>
     </w:lvl>
     <w:lvl w:ilvl="5" w:tentative="1">
       <w:start w:val="1"/>
       <w:numFmt w:val="bullet"/>
-      <w:lvlText w:val=""/>
+      <w:lvlText w:val=""/>
       <w:lvlJc w:val="left"/>
       <w:pPr>
         <w:tabs>
@@ -1019,14 +2924,14 @@
         <w:ind w:left="4320" w:hanging="360"/>
       </w:pPr>
       <w:rPr>
-        <w:rFonts w:ascii="Symbol" w:hAnsi="Symbol" w:hint="default"/>
+        <w:rFonts w:ascii="Wingdings" w:hAnsi="Wingdings" w:hint="default"/>
         <w:sz w:val="20"/>
       </w:rPr>
     </w:lvl>
     <w:lvl w:ilvl="6" w:tentative="1">
       <w:start w:val="1"/>
       <w:numFmt w:val="bullet"/>
-      <w:lvlText w:val=""/>
+      <w:lvlText w:val=""/>
       <w:lvlJc w:val="left"/>
       <w:pPr>
         <w:tabs>
@@ -1035,14 +2940,14 @@
         <w:ind w:left="5040" w:hanging="360"/>
       </w:pPr>
       <w:rPr>
-        <w:rFonts w:ascii="Symbol" w:hAnsi="Symbol" w:hint="default"/>
+        <w:rFonts w:ascii="Wingdings" w:hAnsi="Wingdings" w:hint="default"/>
         <w:sz w:val="20"/>
       </w:rPr>
     </w:lvl>
     <w:lvl w:ilvl="7" w:tentative="1">
       <w:start w:val="1"/>
       <w:numFmt w:val="bullet"/>
-      <w:lvlText w:val=""/>
+      <w:lvlText w:val=""/>
       <w:lvlJc w:val="left"/>
       <w:pPr>
         <w:tabs>
@@ -1051,14 +2956,14 @@
         <w:ind w:left="5760" w:hanging="360"/>
       </w:pPr>
       <w:rPr>
-        <w:rFonts w:ascii="Symbol" w:hAnsi="Symbol" w:hint="default"/>
+        <w:rFonts w:ascii="Wingdings" w:hAnsi="Wingdings" w:hint="default"/>
         <w:sz w:val="20"/>
       </w:rPr>
     </w:lvl>
     <w:lvl w:ilvl="8" w:tentative="1">
       <w:start w:val="1"/>
       <w:numFmt w:val="bullet"/>
-      <w:lvlText w:val=""/>
+      <w:lvlText w:val=""/>
       <w:lvlJc w:val="left"/>
       <w:pPr>
         <w:tabs>
@@ -1067,12 +2972,12 @@
         <w:ind w:left="6480" w:hanging="360"/>
       </w:pPr>
       <w:rPr>
-        <w:rFonts w:ascii="Symbol" w:hAnsi="Symbol" w:hint="default"/>
+        <w:rFonts w:ascii="Wingdings" w:hAnsi="Wingdings" w:hint="default"/>
         <w:sz w:val="20"/>
       </w:rPr>
     </w:lvl>
   </w:abstractNum>
-  <w:abstractNum w:abstractNumId="1" w15:restartNumberingAfterBreak="0">
+  <w:abstractNum w:abstractNumId="5" w15:restartNumberingAfterBreak="0">
     <w:nsid w:val="2D2068CD"/>
     <w:multiLevelType w:val="multilevel"/>
     <w:tmpl w:val="85382132"/>
@@ -1221,7 +3126,752 @@
       </w:rPr>
     </w:lvl>
   </w:abstractNum>
-  <w:abstractNum w:abstractNumId="2" w15:restartNumberingAfterBreak="0">
+  <w:abstractNum w:abstractNumId="6" w15:restartNumberingAfterBreak="0">
+    <w:nsid w:val="2D5608B6"/>
+    <w:multiLevelType w:val="multilevel"/>
+    <w:tmpl w:val="BED4647A"/>
+    <w:lvl w:ilvl="0">
+      <w:start w:val="1"/>
+      <w:numFmt w:val="bullet"/>
+      <w:lvlText w:val=""/>
+      <w:lvlJc w:val="left"/>
+      <w:pPr>
+        <w:tabs>
+          <w:tab w:val="num" w:pos="720"/>
+        </w:tabs>
+        <w:ind w:left="720" w:hanging="360"/>
+      </w:pPr>
+      <w:rPr>
+        <w:rFonts w:ascii="Symbol" w:hAnsi="Symbol" w:hint="default"/>
+        <w:sz w:val="20"/>
+      </w:rPr>
+    </w:lvl>
+    <w:lvl w:ilvl="1" w:tentative="1">
+      <w:start w:val="1"/>
+      <w:numFmt w:val="bullet"/>
+      <w:lvlText w:val="o"/>
+      <w:lvlJc w:val="left"/>
+      <w:pPr>
+        <w:tabs>
+          <w:tab w:val="num" w:pos="1440"/>
+        </w:tabs>
+        <w:ind w:left="1440" w:hanging="360"/>
+      </w:pPr>
+      <w:rPr>
+        <w:rFonts w:ascii="Courier New" w:hAnsi="Courier New" w:hint="default"/>
+        <w:sz w:val="20"/>
+      </w:rPr>
+    </w:lvl>
+    <w:lvl w:ilvl="2" w:tentative="1">
+      <w:start w:val="1"/>
+      <w:numFmt w:val="bullet"/>
+      <w:lvlText w:val=""/>
+      <w:lvlJc w:val="left"/>
+      <w:pPr>
+        <w:tabs>
+          <w:tab w:val="num" w:pos="2160"/>
+        </w:tabs>
+        <w:ind w:left="2160" w:hanging="360"/>
+      </w:pPr>
+      <w:rPr>
+        <w:rFonts w:ascii="Wingdings" w:hAnsi="Wingdings" w:hint="default"/>
+        <w:sz w:val="20"/>
+      </w:rPr>
+    </w:lvl>
+    <w:lvl w:ilvl="3" w:tentative="1">
+      <w:start w:val="1"/>
+      <w:numFmt w:val="bullet"/>
+      <w:lvlText w:val=""/>
+      <w:lvlJc w:val="left"/>
+      <w:pPr>
+        <w:tabs>
+          <w:tab w:val="num" w:pos="2880"/>
+        </w:tabs>
+        <w:ind w:left="2880" w:hanging="360"/>
+      </w:pPr>
+      <w:rPr>
+        <w:rFonts w:ascii="Wingdings" w:hAnsi="Wingdings" w:hint="default"/>
+        <w:sz w:val="20"/>
+      </w:rPr>
+    </w:lvl>
+    <w:lvl w:ilvl="4" w:tentative="1">
+      <w:start w:val="1"/>
+      <w:numFmt w:val="bullet"/>
+      <w:lvlText w:val=""/>
+      <w:lvlJc w:val="left"/>
+      <w:pPr>
+        <w:tabs>
+          <w:tab w:val="num" w:pos="3600"/>
+        </w:tabs>
+        <w:ind w:left="3600" w:hanging="360"/>
+      </w:pPr>
+      <w:rPr>
+        <w:rFonts w:ascii="Wingdings" w:hAnsi="Wingdings" w:hint="default"/>
+        <w:sz w:val="20"/>
+      </w:rPr>
+    </w:lvl>
+    <w:lvl w:ilvl="5" w:tentative="1">
+      <w:start w:val="1"/>
+      <w:numFmt w:val="bullet"/>
+      <w:lvlText w:val=""/>
+      <w:lvlJc w:val="left"/>
+      <w:pPr>
+        <w:tabs>
+          <w:tab w:val="num" w:pos="4320"/>
+        </w:tabs>
+        <w:ind w:left="4320" w:hanging="360"/>
+      </w:pPr>
+      <w:rPr>
+        <w:rFonts w:ascii="Wingdings" w:hAnsi="Wingdings" w:hint="default"/>
+        <w:sz w:val="20"/>
+      </w:rPr>
+    </w:lvl>
+    <w:lvl w:ilvl="6" w:tentative="1">
+      <w:start w:val="1"/>
+      <w:numFmt w:val="bullet"/>
+      <w:lvlText w:val=""/>
+      <w:lvlJc w:val="left"/>
+      <w:pPr>
+        <w:tabs>
+          <w:tab w:val="num" w:pos="5040"/>
+        </w:tabs>
+        <w:ind w:left="5040" w:hanging="360"/>
+      </w:pPr>
+      <w:rPr>
+        <w:rFonts w:ascii="Wingdings" w:hAnsi="Wingdings" w:hint="default"/>
+        <w:sz w:val="20"/>
+      </w:rPr>
+    </w:lvl>
+    <w:lvl w:ilvl="7" w:tentative="1">
+      <w:start w:val="1"/>
+      <w:numFmt w:val="bullet"/>
+      <w:lvlText w:val=""/>
+      <w:lvlJc w:val="left"/>
+      <w:pPr>
+        <w:tabs>
+          <w:tab w:val="num" w:pos="5760"/>
+        </w:tabs>
+        <w:ind w:left="5760" w:hanging="360"/>
+      </w:pPr>
+      <w:rPr>
+        <w:rFonts w:ascii="Wingdings" w:hAnsi="Wingdings" w:hint="default"/>
+        <w:sz w:val="20"/>
+      </w:rPr>
+    </w:lvl>
+    <w:lvl w:ilvl="8" w:tentative="1">
+      <w:start w:val="1"/>
+      <w:numFmt w:val="bullet"/>
+      <w:lvlText w:val=""/>
+      <w:lvlJc w:val="left"/>
+      <w:pPr>
+        <w:tabs>
+          <w:tab w:val="num" w:pos="6480"/>
+        </w:tabs>
+        <w:ind w:left="6480" w:hanging="360"/>
+      </w:pPr>
+      <w:rPr>
+        <w:rFonts w:ascii="Wingdings" w:hAnsi="Wingdings" w:hint="default"/>
+        <w:sz w:val="20"/>
+      </w:rPr>
+    </w:lvl>
+  </w:abstractNum>
+  <w:abstractNum w:abstractNumId="7" w15:restartNumberingAfterBreak="0">
+    <w:nsid w:val="2F5B7CEC"/>
+    <w:multiLevelType w:val="multilevel"/>
+    <w:tmpl w:val="6DC0C28E"/>
+    <w:lvl w:ilvl="0">
+      <w:start w:val="1"/>
+      <w:numFmt w:val="bullet"/>
+      <w:lvlText w:val=""/>
+      <w:lvlJc w:val="left"/>
+      <w:pPr>
+        <w:tabs>
+          <w:tab w:val="num" w:pos="720"/>
+        </w:tabs>
+        <w:ind w:left="720" w:hanging="360"/>
+      </w:pPr>
+      <w:rPr>
+        <w:rFonts w:ascii="Symbol" w:hAnsi="Symbol" w:hint="default"/>
+        <w:sz w:val="20"/>
+      </w:rPr>
+    </w:lvl>
+    <w:lvl w:ilvl="1">
+      <w:start w:val="1"/>
+      <w:numFmt w:val="bullet"/>
+      <w:lvlText w:val="o"/>
+      <w:lvlJc w:val="left"/>
+      <w:pPr>
+        <w:tabs>
+          <w:tab w:val="num" w:pos="1440"/>
+        </w:tabs>
+        <w:ind w:left="1440" w:hanging="360"/>
+      </w:pPr>
+      <w:rPr>
+        <w:rFonts w:ascii="Courier New" w:hAnsi="Courier New" w:hint="default"/>
+        <w:sz w:val="20"/>
+      </w:rPr>
+    </w:lvl>
+    <w:lvl w:ilvl="2" w:tentative="1">
+      <w:start w:val="1"/>
+      <w:numFmt w:val="bullet"/>
+      <w:lvlText w:val=""/>
+      <w:lvlJc w:val="left"/>
+      <w:pPr>
+        <w:tabs>
+          <w:tab w:val="num" w:pos="2160"/>
+        </w:tabs>
+        <w:ind w:left="2160" w:hanging="360"/>
+      </w:pPr>
+      <w:rPr>
+        <w:rFonts w:ascii="Wingdings" w:hAnsi="Wingdings" w:hint="default"/>
+        <w:sz w:val="20"/>
+      </w:rPr>
+    </w:lvl>
+    <w:lvl w:ilvl="3" w:tentative="1">
+      <w:start w:val="1"/>
+      <w:numFmt w:val="bullet"/>
+      <w:lvlText w:val=""/>
+      <w:lvlJc w:val="left"/>
+      <w:pPr>
+        <w:tabs>
+          <w:tab w:val="num" w:pos="2880"/>
+        </w:tabs>
+        <w:ind w:left="2880" w:hanging="360"/>
+      </w:pPr>
+      <w:rPr>
+        <w:rFonts w:ascii="Wingdings" w:hAnsi="Wingdings" w:hint="default"/>
+        <w:sz w:val="20"/>
+      </w:rPr>
+    </w:lvl>
+    <w:lvl w:ilvl="4" w:tentative="1">
+      <w:start w:val="1"/>
+      <w:numFmt w:val="bullet"/>
+      <w:lvlText w:val=""/>
+      <w:lvlJc w:val="left"/>
+      <w:pPr>
+        <w:tabs>
+          <w:tab w:val="num" w:pos="3600"/>
+        </w:tabs>
+        <w:ind w:left="3600" w:hanging="360"/>
+      </w:pPr>
+      <w:rPr>
+        <w:rFonts w:ascii="Wingdings" w:hAnsi="Wingdings" w:hint="default"/>
+        <w:sz w:val="20"/>
+      </w:rPr>
+    </w:lvl>
+    <w:lvl w:ilvl="5" w:tentative="1">
+      <w:start w:val="1"/>
+      <w:numFmt w:val="bullet"/>
+      <w:lvlText w:val=""/>
+      <w:lvlJc w:val="left"/>
+      <w:pPr>
+        <w:tabs>
+          <w:tab w:val="num" w:pos="4320"/>
+        </w:tabs>
+        <w:ind w:left="4320" w:hanging="360"/>
+      </w:pPr>
+      <w:rPr>
+        <w:rFonts w:ascii="Wingdings" w:hAnsi="Wingdings" w:hint="default"/>
+        <w:sz w:val="20"/>
+      </w:rPr>
+    </w:lvl>
+    <w:lvl w:ilvl="6" w:tentative="1">
+      <w:start w:val="1"/>
+      <w:numFmt w:val="bullet"/>
+      <w:lvlText w:val=""/>
+      <w:lvlJc w:val="left"/>
+      <w:pPr>
+        <w:tabs>
+          <w:tab w:val="num" w:pos="5040"/>
+        </w:tabs>
+        <w:ind w:left="5040" w:hanging="360"/>
+      </w:pPr>
+      <w:rPr>
+        <w:rFonts w:ascii="Wingdings" w:hAnsi="Wingdings" w:hint="default"/>
+        <w:sz w:val="20"/>
+      </w:rPr>
+    </w:lvl>
+    <w:lvl w:ilvl="7" w:tentative="1">
+      <w:start w:val="1"/>
+      <w:numFmt w:val="bullet"/>
+      <w:lvlText w:val=""/>
+      <w:lvlJc w:val="left"/>
+      <w:pPr>
+        <w:tabs>
+          <w:tab w:val="num" w:pos="5760"/>
+        </w:tabs>
+        <w:ind w:left="5760" w:hanging="360"/>
+      </w:pPr>
+      <w:rPr>
+        <w:rFonts w:ascii="Wingdings" w:hAnsi="Wingdings" w:hint="default"/>
+        <w:sz w:val="20"/>
+      </w:rPr>
+    </w:lvl>
+    <w:lvl w:ilvl="8" w:tentative="1">
+      <w:start w:val="1"/>
+      <w:numFmt w:val="bullet"/>
+      <w:lvlText w:val=""/>
+      <w:lvlJc w:val="left"/>
+      <w:pPr>
+        <w:tabs>
+          <w:tab w:val="num" w:pos="6480"/>
+        </w:tabs>
+        <w:ind w:left="6480" w:hanging="360"/>
+      </w:pPr>
+      <w:rPr>
+        <w:rFonts w:ascii="Wingdings" w:hAnsi="Wingdings" w:hint="default"/>
+        <w:sz w:val="20"/>
+      </w:rPr>
+    </w:lvl>
+  </w:abstractNum>
+  <w:abstractNum w:abstractNumId="8" w15:restartNumberingAfterBreak="0">
+    <w:nsid w:val="2FE9343F"/>
+    <w:multiLevelType w:val="multilevel"/>
+    <w:tmpl w:val="451493FC"/>
+    <w:lvl w:ilvl="0">
+      <w:start w:val="1"/>
+      <w:numFmt w:val="bullet"/>
+      <w:lvlText w:val=""/>
+      <w:lvlJc w:val="left"/>
+      <w:pPr>
+        <w:tabs>
+          <w:tab w:val="num" w:pos="720"/>
+        </w:tabs>
+        <w:ind w:left="720" w:hanging="360"/>
+      </w:pPr>
+      <w:rPr>
+        <w:rFonts w:ascii="Symbol" w:hAnsi="Symbol" w:hint="default"/>
+        <w:sz w:val="20"/>
+      </w:rPr>
+    </w:lvl>
+    <w:lvl w:ilvl="1" w:tentative="1">
+      <w:start w:val="1"/>
+      <w:numFmt w:val="bullet"/>
+      <w:lvlText w:val="o"/>
+      <w:lvlJc w:val="left"/>
+      <w:pPr>
+        <w:tabs>
+          <w:tab w:val="num" w:pos="1440"/>
+        </w:tabs>
+        <w:ind w:left="1440" w:hanging="360"/>
+      </w:pPr>
+      <w:rPr>
+        <w:rFonts w:ascii="Courier New" w:hAnsi="Courier New" w:hint="default"/>
+        <w:sz w:val="20"/>
+      </w:rPr>
+    </w:lvl>
+    <w:lvl w:ilvl="2" w:tentative="1">
+      <w:start w:val="1"/>
+      <w:numFmt w:val="bullet"/>
+      <w:lvlText w:val=""/>
+      <w:lvlJc w:val="left"/>
+      <w:pPr>
+        <w:tabs>
+          <w:tab w:val="num" w:pos="2160"/>
+        </w:tabs>
+        <w:ind w:left="2160" w:hanging="360"/>
+      </w:pPr>
+      <w:rPr>
+        <w:rFonts w:ascii="Wingdings" w:hAnsi="Wingdings" w:hint="default"/>
+        <w:sz w:val="20"/>
+      </w:rPr>
+    </w:lvl>
+    <w:lvl w:ilvl="3" w:tentative="1">
+      <w:start w:val="1"/>
+      <w:numFmt w:val="bullet"/>
+      <w:lvlText w:val=""/>
+      <w:lvlJc w:val="left"/>
+      <w:pPr>
+        <w:tabs>
+          <w:tab w:val="num" w:pos="2880"/>
+        </w:tabs>
+        <w:ind w:left="2880" w:hanging="360"/>
+      </w:pPr>
+      <w:rPr>
+        <w:rFonts w:ascii="Wingdings" w:hAnsi="Wingdings" w:hint="default"/>
+        <w:sz w:val="20"/>
+      </w:rPr>
+    </w:lvl>
+    <w:lvl w:ilvl="4" w:tentative="1">
+      <w:start w:val="1"/>
+      <w:numFmt w:val="bullet"/>
+      <w:lvlText w:val=""/>
+      <w:lvlJc w:val="left"/>
+      <w:pPr>
+        <w:tabs>
+          <w:tab w:val="num" w:pos="3600"/>
+        </w:tabs>
+        <w:ind w:left="3600" w:hanging="360"/>
+      </w:pPr>
+      <w:rPr>
+        <w:rFonts w:ascii="Wingdings" w:hAnsi="Wingdings" w:hint="default"/>
+        <w:sz w:val="20"/>
+      </w:rPr>
+    </w:lvl>
+    <w:lvl w:ilvl="5" w:tentative="1">
+      <w:start w:val="1"/>
+      <w:numFmt w:val="bullet"/>
+      <w:lvlText w:val=""/>
+      <w:lvlJc w:val="left"/>
+      <w:pPr>
+        <w:tabs>
+          <w:tab w:val="num" w:pos="4320"/>
+        </w:tabs>
+        <w:ind w:left="4320" w:hanging="360"/>
+      </w:pPr>
+      <w:rPr>
+        <w:rFonts w:ascii="Wingdings" w:hAnsi="Wingdings" w:hint="default"/>
+        <w:sz w:val="20"/>
+      </w:rPr>
+    </w:lvl>
+    <w:lvl w:ilvl="6" w:tentative="1">
+      <w:start w:val="1"/>
+      <w:numFmt w:val="bullet"/>
+      <w:lvlText w:val=""/>
+      <w:lvlJc w:val="left"/>
+      <w:pPr>
+        <w:tabs>
+          <w:tab w:val="num" w:pos="5040"/>
+        </w:tabs>
+        <w:ind w:left="5040" w:hanging="360"/>
+      </w:pPr>
+      <w:rPr>
+        <w:rFonts w:ascii="Wingdings" w:hAnsi="Wingdings" w:hint="default"/>
+        <w:sz w:val="20"/>
+      </w:rPr>
+    </w:lvl>
+    <w:lvl w:ilvl="7" w:tentative="1">
+      <w:start w:val="1"/>
+      <w:numFmt w:val="bullet"/>
+      <w:lvlText w:val=""/>
+      <w:lvlJc w:val="left"/>
+      <w:pPr>
+        <w:tabs>
+          <w:tab w:val="num" w:pos="5760"/>
+        </w:tabs>
+        <w:ind w:left="5760" w:hanging="360"/>
+      </w:pPr>
+      <w:rPr>
+        <w:rFonts w:ascii="Wingdings" w:hAnsi="Wingdings" w:hint="default"/>
+        <w:sz w:val="20"/>
+      </w:rPr>
+    </w:lvl>
+    <w:lvl w:ilvl="8" w:tentative="1">
+      <w:start w:val="1"/>
+      <w:numFmt w:val="bullet"/>
+      <w:lvlText w:val=""/>
+      <w:lvlJc w:val="left"/>
+      <w:pPr>
+        <w:tabs>
+          <w:tab w:val="num" w:pos="6480"/>
+        </w:tabs>
+        <w:ind w:left="6480" w:hanging="360"/>
+      </w:pPr>
+      <w:rPr>
+        <w:rFonts w:ascii="Wingdings" w:hAnsi="Wingdings" w:hint="default"/>
+        <w:sz w:val="20"/>
+      </w:rPr>
+    </w:lvl>
+  </w:abstractNum>
+  <w:abstractNum w:abstractNumId="9" w15:restartNumberingAfterBreak="0">
+    <w:nsid w:val="33057C5C"/>
+    <w:multiLevelType w:val="multilevel"/>
+    <w:tmpl w:val="90626F84"/>
+    <w:lvl w:ilvl="0">
+      <w:start w:val="1"/>
+      <w:numFmt w:val="bullet"/>
+      <w:lvlText w:val=""/>
+      <w:lvlJc w:val="left"/>
+      <w:pPr>
+        <w:tabs>
+          <w:tab w:val="num" w:pos="720"/>
+        </w:tabs>
+        <w:ind w:left="720" w:hanging="360"/>
+      </w:pPr>
+      <w:rPr>
+        <w:rFonts w:ascii="Symbol" w:hAnsi="Symbol" w:hint="default"/>
+        <w:sz w:val="20"/>
+      </w:rPr>
+    </w:lvl>
+    <w:lvl w:ilvl="1" w:tentative="1">
+      <w:start w:val="1"/>
+      <w:numFmt w:val="bullet"/>
+      <w:lvlText w:val="o"/>
+      <w:lvlJc w:val="left"/>
+      <w:pPr>
+        <w:tabs>
+          <w:tab w:val="num" w:pos="1440"/>
+        </w:tabs>
+        <w:ind w:left="1440" w:hanging="360"/>
+      </w:pPr>
+      <w:rPr>
+        <w:rFonts w:ascii="Courier New" w:hAnsi="Courier New" w:hint="default"/>
+        <w:sz w:val="20"/>
+      </w:rPr>
+    </w:lvl>
+    <w:lvl w:ilvl="2" w:tentative="1">
+      <w:start w:val="1"/>
+      <w:numFmt w:val="bullet"/>
+      <w:lvlText w:val=""/>
+      <w:lvlJc w:val="left"/>
+      <w:pPr>
+        <w:tabs>
+          <w:tab w:val="num" w:pos="2160"/>
+        </w:tabs>
+        <w:ind w:left="2160" w:hanging="360"/>
+      </w:pPr>
+      <w:rPr>
+        <w:rFonts w:ascii="Wingdings" w:hAnsi="Wingdings" w:hint="default"/>
+        <w:sz w:val="20"/>
+      </w:rPr>
+    </w:lvl>
+    <w:lvl w:ilvl="3" w:tentative="1">
+      <w:start w:val="1"/>
+      <w:numFmt w:val="bullet"/>
+      <w:lvlText w:val=""/>
+      <w:lvlJc w:val="left"/>
+      <w:pPr>
+        <w:tabs>
+          <w:tab w:val="num" w:pos="2880"/>
+        </w:tabs>
+        <w:ind w:left="2880" w:hanging="360"/>
+      </w:pPr>
+      <w:rPr>
+        <w:rFonts w:ascii="Wingdings" w:hAnsi="Wingdings" w:hint="default"/>
+        <w:sz w:val="20"/>
+      </w:rPr>
+    </w:lvl>
+    <w:lvl w:ilvl="4" w:tentative="1">
+      <w:start w:val="1"/>
+      <w:numFmt w:val="bullet"/>
+      <w:lvlText w:val=""/>
+      <w:lvlJc w:val="left"/>
+      <w:pPr>
+        <w:tabs>
+          <w:tab w:val="num" w:pos="3600"/>
+        </w:tabs>
+        <w:ind w:left="3600" w:hanging="360"/>
+      </w:pPr>
+      <w:rPr>
+        <w:rFonts w:ascii="Wingdings" w:hAnsi="Wingdings" w:hint="default"/>
+        <w:sz w:val="20"/>
+      </w:rPr>
+    </w:lvl>
+    <w:lvl w:ilvl="5" w:tentative="1">
+      <w:start w:val="1"/>
+      <w:numFmt w:val="bullet"/>
+      <w:lvlText w:val=""/>
+      <w:lvlJc w:val="left"/>
+      <w:pPr>
+        <w:tabs>
+          <w:tab w:val="num" w:pos="4320"/>
+        </w:tabs>
+        <w:ind w:left="4320" w:hanging="360"/>
+      </w:pPr>
+      <w:rPr>
+        <w:rFonts w:ascii="Wingdings" w:hAnsi="Wingdings" w:hint="default"/>
+        <w:sz w:val="20"/>
+      </w:rPr>
+    </w:lvl>
+    <w:lvl w:ilvl="6" w:tentative="1">
+      <w:start w:val="1"/>
+      <w:numFmt w:val="bullet"/>
+      <w:lvlText w:val=""/>
+      <w:lvlJc w:val="left"/>
+      <w:pPr>
+        <w:tabs>
+          <w:tab w:val="num" w:pos="5040"/>
+        </w:tabs>
+        <w:ind w:left="5040" w:hanging="360"/>
+      </w:pPr>
+      <w:rPr>
+        <w:rFonts w:ascii="Wingdings" w:hAnsi="Wingdings" w:hint="default"/>
+        <w:sz w:val="20"/>
+      </w:rPr>
+    </w:lvl>
+    <w:lvl w:ilvl="7" w:tentative="1">
+      <w:start w:val="1"/>
+      <w:numFmt w:val="bullet"/>
+      <w:lvlText w:val=""/>
+      <w:lvlJc w:val="left"/>
+      <w:pPr>
+        <w:tabs>
+          <w:tab w:val="num" w:pos="5760"/>
+        </w:tabs>
+        <w:ind w:left="5760" w:hanging="360"/>
+      </w:pPr>
+      <w:rPr>
+        <w:rFonts w:ascii="Wingdings" w:hAnsi="Wingdings" w:hint="default"/>
+        <w:sz w:val="20"/>
+      </w:rPr>
+    </w:lvl>
+    <w:lvl w:ilvl="8" w:tentative="1">
+      <w:start w:val="1"/>
+      <w:numFmt w:val="bullet"/>
+      <w:lvlText w:val=""/>
+      <w:lvlJc w:val="left"/>
+      <w:pPr>
+        <w:tabs>
+          <w:tab w:val="num" w:pos="6480"/>
+        </w:tabs>
+        <w:ind w:left="6480" w:hanging="360"/>
+      </w:pPr>
+      <w:rPr>
+        <w:rFonts w:ascii="Wingdings" w:hAnsi="Wingdings" w:hint="default"/>
+        <w:sz w:val="20"/>
+      </w:rPr>
+    </w:lvl>
+  </w:abstractNum>
+  <w:abstractNum w:abstractNumId="10" w15:restartNumberingAfterBreak="0">
+    <w:nsid w:val="3386566D"/>
+    <w:multiLevelType w:val="multilevel"/>
+    <w:tmpl w:val="90626F84"/>
+    <w:lvl w:ilvl="0">
+      <w:start w:val="1"/>
+      <w:numFmt w:val="bullet"/>
+      <w:lvlText w:val=""/>
+      <w:lvlJc w:val="left"/>
+      <w:pPr>
+        <w:tabs>
+          <w:tab w:val="num" w:pos="720"/>
+        </w:tabs>
+        <w:ind w:left="720" w:hanging="360"/>
+      </w:pPr>
+      <w:rPr>
+        <w:rFonts w:ascii="Symbol" w:hAnsi="Symbol" w:hint="default"/>
+        <w:sz w:val="20"/>
+      </w:rPr>
+    </w:lvl>
+    <w:lvl w:ilvl="1" w:tentative="1">
+      <w:start w:val="1"/>
+      <w:numFmt w:val="bullet"/>
+      <w:lvlText w:val="o"/>
+      <w:lvlJc w:val="left"/>
+      <w:pPr>
+        <w:tabs>
+          <w:tab w:val="num" w:pos="1440"/>
+        </w:tabs>
+        <w:ind w:left="1440" w:hanging="360"/>
+      </w:pPr>
+      <w:rPr>
+        <w:rFonts w:ascii="Courier New" w:hAnsi="Courier New" w:hint="default"/>
+        <w:sz w:val="20"/>
+      </w:rPr>
+    </w:lvl>
+    <w:lvl w:ilvl="2" w:tentative="1">
+      <w:start w:val="1"/>
+      <w:numFmt w:val="bullet"/>
+      <w:lvlText w:val=""/>
+      <w:lvlJc w:val="left"/>
+      <w:pPr>
+        <w:tabs>
+          <w:tab w:val="num" w:pos="2160"/>
+        </w:tabs>
+        <w:ind w:left="2160" w:hanging="360"/>
+      </w:pPr>
+      <w:rPr>
+        <w:rFonts w:ascii="Wingdings" w:hAnsi="Wingdings" w:hint="default"/>
+        <w:sz w:val="20"/>
+      </w:rPr>
+    </w:lvl>
+    <w:lvl w:ilvl="3" w:tentative="1">
+      <w:start w:val="1"/>
+      <w:numFmt w:val="bullet"/>
+      <w:lvlText w:val=""/>
+      <w:lvlJc w:val="left"/>
+      <w:pPr>
+        <w:tabs>
+          <w:tab w:val="num" w:pos="2880"/>
+        </w:tabs>
+        <w:ind w:left="2880" w:hanging="360"/>
+      </w:pPr>
+      <w:rPr>
+        <w:rFonts w:ascii="Wingdings" w:hAnsi="Wingdings" w:hint="default"/>
+        <w:sz w:val="20"/>
+      </w:rPr>
+    </w:lvl>
+    <w:lvl w:ilvl="4" w:tentative="1">
+      <w:start w:val="1"/>
+      <w:numFmt w:val="bullet"/>
+      <w:lvlText w:val=""/>
+      <w:lvlJc w:val="left"/>
+      <w:pPr>
+        <w:tabs>
+          <w:tab w:val="num" w:pos="3600"/>
+        </w:tabs>
+        <w:ind w:left="3600" w:hanging="360"/>
+      </w:pPr>
+      <w:rPr>
+        <w:rFonts w:ascii="Wingdings" w:hAnsi="Wingdings" w:hint="default"/>
+        <w:sz w:val="20"/>
+      </w:rPr>
+    </w:lvl>
+    <w:lvl w:ilvl="5" w:tentative="1">
+      <w:start w:val="1"/>
+      <w:numFmt w:val="bullet"/>
+      <w:lvlText w:val=""/>
+      <w:lvlJc w:val="left"/>
+      <w:pPr>
+        <w:tabs>
+          <w:tab w:val="num" w:pos="4320"/>
+        </w:tabs>
+        <w:ind w:left="4320" w:hanging="360"/>
+      </w:pPr>
+      <w:rPr>
+        <w:rFonts w:ascii="Wingdings" w:hAnsi="Wingdings" w:hint="default"/>
+        <w:sz w:val="20"/>
+      </w:rPr>
+    </w:lvl>
+    <w:lvl w:ilvl="6" w:tentative="1">
+      <w:start w:val="1"/>
+      <w:numFmt w:val="bullet"/>
+      <w:lvlText w:val=""/>
+      <w:lvlJc w:val="left"/>
+      <w:pPr>
+        <w:tabs>
+          <w:tab w:val="num" w:pos="5040"/>
+        </w:tabs>
+        <w:ind w:left="5040" w:hanging="360"/>
+      </w:pPr>
+      <w:rPr>
+        <w:rFonts w:ascii="Wingdings" w:hAnsi="Wingdings" w:hint="default"/>
+        <w:sz w:val="20"/>
+      </w:rPr>
+    </w:lvl>
+    <w:lvl w:ilvl="7" w:tentative="1">
+      <w:start w:val="1"/>
+      <w:numFmt w:val="bullet"/>
+      <w:lvlText w:val=""/>
+      <w:lvlJc w:val="left"/>
+      <w:pPr>
+        <w:tabs>
+          <w:tab w:val="num" w:pos="5760"/>
+        </w:tabs>
+        <w:ind w:left="5760" w:hanging="360"/>
+      </w:pPr>
+      <w:rPr>
+        <w:rFonts w:ascii="Wingdings" w:hAnsi="Wingdings" w:hint="default"/>
+        <w:sz w:val="20"/>
+      </w:rPr>
+    </w:lvl>
+    <w:lvl w:ilvl="8" w:tentative="1">
+      <w:start w:val="1"/>
+      <w:numFmt w:val="bullet"/>
+      <w:lvlText w:val=""/>
+      <w:lvlJc w:val="left"/>
+      <w:pPr>
+        <w:tabs>
+          <w:tab w:val="num" w:pos="6480"/>
+        </w:tabs>
+        <w:ind w:left="6480" w:hanging="360"/>
+      </w:pPr>
+      <w:rPr>
+        <w:rFonts w:ascii="Wingdings" w:hAnsi="Wingdings" w:hint="default"/>
+        <w:sz w:val="20"/>
+      </w:rPr>
+    </w:lvl>
+  </w:abstractNum>
+  <w:abstractNum w:abstractNumId="11" w15:restartNumberingAfterBreak="0">
     <w:nsid w:val="34491C17"/>
     <w:multiLevelType w:val="multilevel"/>
     <w:tmpl w:val="9AF8A20A"/>
@@ -1370,7 +4020,716 @@
       </w:rPr>
     </w:lvl>
   </w:abstractNum>
-  <w:abstractNum w:abstractNumId="3" w15:restartNumberingAfterBreak="0">
+  <w:abstractNum w:abstractNumId="12" w15:restartNumberingAfterBreak="0">
+    <w:nsid w:val="484247D0"/>
+    <w:multiLevelType w:val="multilevel"/>
+    <w:tmpl w:val="90626F84"/>
+    <w:lvl w:ilvl="0">
+      <w:start w:val="1"/>
+      <w:numFmt w:val="bullet"/>
+      <w:lvlText w:val=""/>
+      <w:lvlJc w:val="left"/>
+      <w:pPr>
+        <w:tabs>
+          <w:tab w:val="num" w:pos="720"/>
+        </w:tabs>
+        <w:ind w:left="720" w:hanging="360"/>
+      </w:pPr>
+      <w:rPr>
+        <w:rFonts w:ascii="Symbol" w:hAnsi="Symbol" w:hint="default"/>
+        <w:sz w:val="20"/>
+      </w:rPr>
+    </w:lvl>
+    <w:lvl w:ilvl="1">
+      <w:start w:val="1"/>
+      <w:numFmt w:val="bullet"/>
+      <w:lvlText w:val="o"/>
+      <w:lvlJc w:val="left"/>
+      <w:pPr>
+        <w:tabs>
+          <w:tab w:val="num" w:pos="1440"/>
+        </w:tabs>
+        <w:ind w:left="1440" w:hanging="360"/>
+      </w:pPr>
+      <w:rPr>
+        <w:rFonts w:ascii="Courier New" w:hAnsi="Courier New" w:hint="default"/>
+        <w:sz w:val="20"/>
+      </w:rPr>
+    </w:lvl>
+    <w:lvl w:ilvl="2" w:tentative="1">
+      <w:start w:val="1"/>
+      <w:numFmt w:val="bullet"/>
+      <w:lvlText w:val=""/>
+      <w:lvlJc w:val="left"/>
+      <w:pPr>
+        <w:tabs>
+          <w:tab w:val="num" w:pos="2160"/>
+        </w:tabs>
+        <w:ind w:left="2160" w:hanging="360"/>
+      </w:pPr>
+      <w:rPr>
+        <w:rFonts w:ascii="Wingdings" w:hAnsi="Wingdings" w:hint="default"/>
+        <w:sz w:val="20"/>
+      </w:rPr>
+    </w:lvl>
+    <w:lvl w:ilvl="3" w:tentative="1">
+      <w:start w:val="1"/>
+      <w:numFmt w:val="bullet"/>
+      <w:lvlText w:val=""/>
+      <w:lvlJc w:val="left"/>
+      <w:pPr>
+        <w:tabs>
+          <w:tab w:val="num" w:pos="2880"/>
+        </w:tabs>
+        <w:ind w:left="2880" w:hanging="360"/>
+      </w:pPr>
+      <w:rPr>
+        <w:rFonts w:ascii="Wingdings" w:hAnsi="Wingdings" w:hint="default"/>
+        <w:sz w:val="20"/>
+      </w:rPr>
+    </w:lvl>
+    <w:lvl w:ilvl="4" w:tentative="1">
+      <w:start w:val="1"/>
+      <w:numFmt w:val="bullet"/>
+      <w:lvlText w:val=""/>
+      <w:lvlJc w:val="left"/>
+      <w:pPr>
+        <w:tabs>
+          <w:tab w:val="num" w:pos="3600"/>
+        </w:tabs>
+        <w:ind w:left="3600" w:hanging="360"/>
+      </w:pPr>
+      <w:rPr>
+        <w:rFonts w:ascii="Wingdings" w:hAnsi="Wingdings" w:hint="default"/>
+        <w:sz w:val="20"/>
+      </w:rPr>
+    </w:lvl>
+    <w:lvl w:ilvl="5" w:tentative="1">
+      <w:start w:val="1"/>
+      <w:numFmt w:val="bullet"/>
+      <w:lvlText w:val=""/>
+      <w:lvlJc w:val="left"/>
+      <w:pPr>
+        <w:tabs>
+          <w:tab w:val="num" w:pos="4320"/>
+        </w:tabs>
+        <w:ind w:left="4320" w:hanging="360"/>
+      </w:pPr>
+      <w:rPr>
+        <w:rFonts w:ascii="Wingdings" w:hAnsi="Wingdings" w:hint="default"/>
+        <w:sz w:val="20"/>
+      </w:rPr>
+    </w:lvl>
+    <w:lvl w:ilvl="6" w:tentative="1">
+      <w:start w:val="1"/>
+      <w:numFmt w:val="bullet"/>
+      <w:lvlText w:val=""/>
+      <w:lvlJc w:val="left"/>
+      <w:pPr>
+        <w:tabs>
+          <w:tab w:val="num" w:pos="5040"/>
+        </w:tabs>
+        <w:ind w:left="5040" w:hanging="360"/>
+      </w:pPr>
+      <w:rPr>
+        <w:rFonts w:ascii="Wingdings" w:hAnsi="Wingdings" w:hint="default"/>
+        <w:sz w:val="20"/>
+      </w:rPr>
+    </w:lvl>
+    <w:lvl w:ilvl="7" w:tentative="1">
+      <w:start w:val="1"/>
+      <w:numFmt w:val="bullet"/>
+      <w:lvlText w:val=""/>
+      <w:lvlJc w:val="left"/>
+      <w:pPr>
+        <w:tabs>
+          <w:tab w:val="num" w:pos="5760"/>
+        </w:tabs>
+        <w:ind w:left="5760" w:hanging="360"/>
+      </w:pPr>
+      <w:rPr>
+        <w:rFonts w:ascii="Wingdings" w:hAnsi="Wingdings" w:hint="default"/>
+        <w:sz w:val="20"/>
+      </w:rPr>
+    </w:lvl>
+    <w:lvl w:ilvl="8" w:tentative="1">
+      <w:start w:val="1"/>
+      <w:numFmt w:val="bullet"/>
+      <w:lvlText w:val=""/>
+      <w:lvlJc w:val="left"/>
+      <w:pPr>
+        <w:tabs>
+          <w:tab w:val="num" w:pos="6480"/>
+        </w:tabs>
+        <w:ind w:left="6480" w:hanging="360"/>
+      </w:pPr>
+      <w:rPr>
+        <w:rFonts w:ascii="Wingdings" w:hAnsi="Wingdings" w:hint="default"/>
+        <w:sz w:val="20"/>
+      </w:rPr>
+    </w:lvl>
+  </w:abstractNum>
+  <w:abstractNum w:abstractNumId="13" w15:restartNumberingAfterBreak="0">
+    <w:nsid w:val="48B63712"/>
+    <w:multiLevelType w:val="multilevel"/>
+    <w:tmpl w:val="451493FC"/>
+    <w:lvl w:ilvl="0">
+      <w:start w:val="1"/>
+      <w:numFmt w:val="bullet"/>
+      <w:lvlText w:val=""/>
+      <w:lvlJc w:val="left"/>
+      <w:pPr>
+        <w:tabs>
+          <w:tab w:val="num" w:pos="720"/>
+        </w:tabs>
+        <w:ind w:left="720" w:hanging="360"/>
+      </w:pPr>
+      <w:rPr>
+        <w:rFonts w:ascii="Symbol" w:hAnsi="Symbol" w:hint="default"/>
+        <w:sz w:val="20"/>
+      </w:rPr>
+    </w:lvl>
+    <w:lvl w:ilvl="1" w:tentative="1">
+      <w:start w:val="1"/>
+      <w:numFmt w:val="bullet"/>
+      <w:lvlText w:val="o"/>
+      <w:lvlJc w:val="left"/>
+      <w:pPr>
+        <w:tabs>
+          <w:tab w:val="num" w:pos="1440"/>
+        </w:tabs>
+        <w:ind w:left="1440" w:hanging="360"/>
+      </w:pPr>
+      <w:rPr>
+        <w:rFonts w:ascii="Courier New" w:hAnsi="Courier New" w:hint="default"/>
+        <w:sz w:val="20"/>
+      </w:rPr>
+    </w:lvl>
+    <w:lvl w:ilvl="2" w:tentative="1">
+      <w:start w:val="1"/>
+      <w:numFmt w:val="bullet"/>
+      <w:lvlText w:val=""/>
+      <w:lvlJc w:val="left"/>
+      <w:pPr>
+        <w:tabs>
+          <w:tab w:val="num" w:pos="2160"/>
+        </w:tabs>
+        <w:ind w:left="2160" w:hanging="360"/>
+      </w:pPr>
+      <w:rPr>
+        <w:rFonts w:ascii="Wingdings" w:hAnsi="Wingdings" w:hint="default"/>
+        <w:sz w:val="20"/>
+      </w:rPr>
+    </w:lvl>
+    <w:lvl w:ilvl="3" w:tentative="1">
+      <w:start w:val="1"/>
+      <w:numFmt w:val="bullet"/>
+      <w:lvlText w:val=""/>
+      <w:lvlJc w:val="left"/>
+      <w:pPr>
+        <w:tabs>
+          <w:tab w:val="num" w:pos="2880"/>
+        </w:tabs>
+        <w:ind w:left="2880" w:hanging="360"/>
+      </w:pPr>
+      <w:rPr>
+        <w:rFonts w:ascii="Wingdings" w:hAnsi="Wingdings" w:hint="default"/>
+        <w:sz w:val="20"/>
+      </w:rPr>
+    </w:lvl>
+    <w:lvl w:ilvl="4" w:tentative="1">
+      <w:start w:val="1"/>
+      <w:numFmt w:val="bullet"/>
+      <w:lvlText w:val=""/>
+      <w:lvlJc w:val="left"/>
+      <w:pPr>
+        <w:tabs>
+          <w:tab w:val="num" w:pos="3600"/>
+        </w:tabs>
+        <w:ind w:left="3600" w:hanging="360"/>
+      </w:pPr>
+      <w:rPr>
+        <w:rFonts w:ascii="Wingdings" w:hAnsi="Wingdings" w:hint="default"/>
+        <w:sz w:val="20"/>
+      </w:rPr>
+    </w:lvl>
+    <w:lvl w:ilvl="5" w:tentative="1">
+      <w:start w:val="1"/>
+      <w:numFmt w:val="bullet"/>
+      <w:lvlText w:val=""/>
+      <w:lvlJc w:val="left"/>
+      <w:pPr>
+        <w:tabs>
+          <w:tab w:val="num" w:pos="4320"/>
+        </w:tabs>
+        <w:ind w:left="4320" w:hanging="360"/>
+      </w:pPr>
+      <w:rPr>
+        <w:rFonts w:ascii="Wingdings" w:hAnsi="Wingdings" w:hint="default"/>
+        <w:sz w:val="20"/>
+      </w:rPr>
+    </w:lvl>
+    <w:lvl w:ilvl="6" w:tentative="1">
+      <w:start w:val="1"/>
+      <w:numFmt w:val="bullet"/>
+      <w:lvlText w:val=""/>
+      <w:lvlJc w:val="left"/>
+      <w:pPr>
+        <w:tabs>
+          <w:tab w:val="num" w:pos="5040"/>
+        </w:tabs>
+        <w:ind w:left="5040" w:hanging="360"/>
+      </w:pPr>
+      <w:rPr>
+        <w:rFonts w:ascii="Wingdings" w:hAnsi="Wingdings" w:hint="default"/>
+        <w:sz w:val="20"/>
+      </w:rPr>
+    </w:lvl>
+    <w:lvl w:ilvl="7" w:tentative="1">
+      <w:start w:val="1"/>
+      <w:numFmt w:val="bullet"/>
+      <w:lvlText w:val=""/>
+      <w:lvlJc w:val="left"/>
+      <w:pPr>
+        <w:tabs>
+          <w:tab w:val="num" w:pos="5760"/>
+        </w:tabs>
+        <w:ind w:left="5760" w:hanging="360"/>
+      </w:pPr>
+      <w:rPr>
+        <w:rFonts w:ascii="Wingdings" w:hAnsi="Wingdings" w:hint="default"/>
+        <w:sz w:val="20"/>
+      </w:rPr>
+    </w:lvl>
+    <w:lvl w:ilvl="8" w:tentative="1">
+      <w:start w:val="1"/>
+      <w:numFmt w:val="bullet"/>
+      <w:lvlText w:val=""/>
+      <w:lvlJc w:val="left"/>
+      <w:pPr>
+        <w:tabs>
+          <w:tab w:val="num" w:pos="6480"/>
+        </w:tabs>
+        <w:ind w:left="6480" w:hanging="360"/>
+      </w:pPr>
+      <w:rPr>
+        <w:rFonts w:ascii="Wingdings" w:hAnsi="Wingdings" w:hint="default"/>
+        <w:sz w:val="20"/>
+      </w:rPr>
+    </w:lvl>
+  </w:abstractNum>
+  <w:abstractNum w:abstractNumId="14" w15:restartNumberingAfterBreak="0">
+    <w:nsid w:val="492A057B"/>
+    <w:multiLevelType w:val="multilevel"/>
+    <w:tmpl w:val="451493FC"/>
+    <w:lvl w:ilvl="0">
+      <w:start w:val="1"/>
+      <w:numFmt w:val="bullet"/>
+      <w:lvlText w:val=""/>
+      <w:lvlJc w:val="left"/>
+      <w:pPr>
+        <w:tabs>
+          <w:tab w:val="num" w:pos="720"/>
+        </w:tabs>
+        <w:ind w:left="720" w:hanging="360"/>
+      </w:pPr>
+      <w:rPr>
+        <w:rFonts w:ascii="Symbol" w:hAnsi="Symbol" w:hint="default"/>
+        <w:sz w:val="20"/>
+      </w:rPr>
+    </w:lvl>
+    <w:lvl w:ilvl="1" w:tentative="1">
+      <w:start w:val="1"/>
+      <w:numFmt w:val="bullet"/>
+      <w:lvlText w:val="o"/>
+      <w:lvlJc w:val="left"/>
+      <w:pPr>
+        <w:tabs>
+          <w:tab w:val="num" w:pos="1440"/>
+        </w:tabs>
+        <w:ind w:left="1440" w:hanging="360"/>
+      </w:pPr>
+      <w:rPr>
+        <w:rFonts w:ascii="Courier New" w:hAnsi="Courier New" w:hint="default"/>
+        <w:sz w:val="20"/>
+      </w:rPr>
+    </w:lvl>
+    <w:lvl w:ilvl="2" w:tentative="1">
+      <w:start w:val="1"/>
+      <w:numFmt w:val="bullet"/>
+      <w:lvlText w:val=""/>
+      <w:lvlJc w:val="left"/>
+      <w:pPr>
+        <w:tabs>
+          <w:tab w:val="num" w:pos="2160"/>
+        </w:tabs>
+        <w:ind w:left="2160" w:hanging="360"/>
+      </w:pPr>
+      <w:rPr>
+        <w:rFonts w:ascii="Wingdings" w:hAnsi="Wingdings" w:hint="default"/>
+        <w:sz w:val="20"/>
+      </w:rPr>
+    </w:lvl>
+    <w:lvl w:ilvl="3" w:tentative="1">
+      <w:start w:val="1"/>
+      <w:numFmt w:val="bullet"/>
+      <w:lvlText w:val=""/>
+      <w:lvlJc w:val="left"/>
+      <w:pPr>
+        <w:tabs>
+          <w:tab w:val="num" w:pos="2880"/>
+        </w:tabs>
+        <w:ind w:left="2880" w:hanging="360"/>
+      </w:pPr>
+      <w:rPr>
+        <w:rFonts w:ascii="Wingdings" w:hAnsi="Wingdings" w:hint="default"/>
+        <w:sz w:val="20"/>
+      </w:rPr>
+    </w:lvl>
+    <w:lvl w:ilvl="4" w:tentative="1">
+      <w:start w:val="1"/>
+      <w:numFmt w:val="bullet"/>
+      <w:lvlText w:val=""/>
+      <w:lvlJc w:val="left"/>
+      <w:pPr>
+        <w:tabs>
+          <w:tab w:val="num" w:pos="3600"/>
+        </w:tabs>
+        <w:ind w:left="3600" w:hanging="360"/>
+      </w:pPr>
+      <w:rPr>
+        <w:rFonts w:ascii="Wingdings" w:hAnsi="Wingdings" w:hint="default"/>
+        <w:sz w:val="20"/>
+      </w:rPr>
+    </w:lvl>
+    <w:lvl w:ilvl="5" w:tentative="1">
+      <w:start w:val="1"/>
+      <w:numFmt w:val="bullet"/>
+      <w:lvlText w:val=""/>
+      <w:lvlJc w:val="left"/>
+      <w:pPr>
+        <w:tabs>
+          <w:tab w:val="num" w:pos="4320"/>
+        </w:tabs>
+        <w:ind w:left="4320" w:hanging="360"/>
+      </w:pPr>
+      <w:rPr>
+        <w:rFonts w:ascii="Wingdings" w:hAnsi="Wingdings" w:hint="default"/>
+        <w:sz w:val="20"/>
+      </w:rPr>
+    </w:lvl>
+    <w:lvl w:ilvl="6" w:tentative="1">
+      <w:start w:val="1"/>
+      <w:numFmt w:val="bullet"/>
+      <w:lvlText w:val=""/>
+      <w:lvlJc w:val="left"/>
+      <w:pPr>
+        <w:tabs>
+          <w:tab w:val="num" w:pos="5040"/>
+        </w:tabs>
+        <w:ind w:left="5040" w:hanging="360"/>
+      </w:pPr>
+      <w:rPr>
+        <w:rFonts w:ascii="Wingdings" w:hAnsi="Wingdings" w:hint="default"/>
+        <w:sz w:val="20"/>
+      </w:rPr>
+    </w:lvl>
+    <w:lvl w:ilvl="7" w:tentative="1">
+      <w:start w:val="1"/>
+      <w:numFmt w:val="bullet"/>
+      <w:lvlText w:val=""/>
+      <w:lvlJc w:val="left"/>
+      <w:pPr>
+        <w:tabs>
+          <w:tab w:val="num" w:pos="5760"/>
+        </w:tabs>
+        <w:ind w:left="5760" w:hanging="360"/>
+      </w:pPr>
+      <w:rPr>
+        <w:rFonts w:ascii="Wingdings" w:hAnsi="Wingdings" w:hint="default"/>
+        <w:sz w:val="20"/>
+      </w:rPr>
+    </w:lvl>
+    <w:lvl w:ilvl="8" w:tentative="1">
+      <w:start w:val="1"/>
+      <w:numFmt w:val="bullet"/>
+      <w:lvlText w:val=""/>
+      <w:lvlJc w:val="left"/>
+      <w:pPr>
+        <w:tabs>
+          <w:tab w:val="num" w:pos="6480"/>
+        </w:tabs>
+        <w:ind w:left="6480" w:hanging="360"/>
+      </w:pPr>
+      <w:rPr>
+        <w:rFonts w:ascii="Wingdings" w:hAnsi="Wingdings" w:hint="default"/>
+        <w:sz w:val="20"/>
+      </w:rPr>
+    </w:lvl>
+  </w:abstractNum>
+  <w:abstractNum w:abstractNumId="15" w15:restartNumberingAfterBreak="0">
+    <w:nsid w:val="5837769C"/>
+    <w:multiLevelType w:val="multilevel"/>
+    <w:tmpl w:val="451493FC"/>
+    <w:lvl w:ilvl="0">
+      <w:start w:val="1"/>
+      <w:numFmt w:val="bullet"/>
+      <w:lvlText w:val=""/>
+      <w:lvlJc w:val="left"/>
+      <w:pPr>
+        <w:tabs>
+          <w:tab w:val="num" w:pos="720"/>
+        </w:tabs>
+        <w:ind w:left="720" w:hanging="360"/>
+      </w:pPr>
+      <w:rPr>
+        <w:rFonts w:ascii="Symbol" w:hAnsi="Symbol" w:hint="default"/>
+        <w:sz w:val="20"/>
+      </w:rPr>
+    </w:lvl>
+    <w:lvl w:ilvl="1" w:tentative="1">
+      <w:start w:val="1"/>
+      <w:numFmt w:val="bullet"/>
+      <w:lvlText w:val="o"/>
+      <w:lvlJc w:val="left"/>
+      <w:pPr>
+        <w:tabs>
+          <w:tab w:val="num" w:pos="1440"/>
+        </w:tabs>
+        <w:ind w:left="1440" w:hanging="360"/>
+      </w:pPr>
+      <w:rPr>
+        <w:rFonts w:ascii="Courier New" w:hAnsi="Courier New" w:hint="default"/>
+        <w:sz w:val="20"/>
+      </w:rPr>
+    </w:lvl>
+    <w:lvl w:ilvl="2" w:tentative="1">
+      <w:start w:val="1"/>
+      <w:numFmt w:val="bullet"/>
+      <w:lvlText w:val=""/>
+      <w:lvlJc w:val="left"/>
+      <w:pPr>
+        <w:tabs>
+          <w:tab w:val="num" w:pos="2160"/>
+        </w:tabs>
+        <w:ind w:left="2160" w:hanging="360"/>
+      </w:pPr>
+      <w:rPr>
+        <w:rFonts w:ascii="Wingdings" w:hAnsi="Wingdings" w:hint="default"/>
+        <w:sz w:val="20"/>
+      </w:rPr>
+    </w:lvl>
+    <w:lvl w:ilvl="3" w:tentative="1">
+      <w:start w:val="1"/>
+      <w:numFmt w:val="bullet"/>
+      <w:lvlText w:val=""/>
+      <w:lvlJc w:val="left"/>
+      <w:pPr>
+        <w:tabs>
+          <w:tab w:val="num" w:pos="2880"/>
+        </w:tabs>
+        <w:ind w:left="2880" w:hanging="360"/>
+      </w:pPr>
+      <w:rPr>
+        <w:rFonts w:ascii="Wingdings" w:hAnsi="Wingdings" w:hint="default"/>
+        <w:sz w:val="20"/>
+      </w:rPr>
+    </w:lvl>
+    <w:lvl w:ilvl="4" w:tentative="1">
+      <w:start w:val="1"/>
+      <w:numFmt w:val="bullet"/>
+      <w:lvlText w:val=""/>
+      <w:lvlJc w:val="left"/>
+      <w:pPr>
+        <w:tabs>
+          <w:tab w:val="num" w:pos="3600"/>
+        </w:tabs>
+        <w:ind w:left="3600" w:hanging="360"/>
+      </w:pPr>
+      <w:rPr>
+        <w:rFonts w:ascii="Wingdings" w:hAnsi="Wingdings" w:hint="default"/>
+        <w:sz w:val="20"/>
+      </w:rPr>
+    </w:lvl>
+    <w:lvl w:ilvl="5" w:tentative="1">
+      <w:start w:val="1"/>
+      <w:numFmt w:val="bullet"/>
+      <w:lvlText w:val=""/>
+      <w:lvlJc w:val="left"/>
+      <w:pPr>
+        <w:tabs>
+          <w:tab w:val="num" w:pos="4320"/>
+        </w:tabs>
+        <w:ind w:left="4320" w:hanging="360"/>
+      </w:pPr>
+      <w:rPr>
+        <w:rFonts w:ascii="Wingdings" w:hAnsi="Wingdings" w:hint="default"/>
+        <w:sz w:val="20"/>
+      </w:rPr>
+    </w:lvl>
+    <w:lvl w:ilvl="6" w:tentative="1">
+      <w:start w:val="1"/>
+      <w:numFmt w:val="bullet"/>
+      <w:lvlText w:val=""/>
+      <w:lvlJc w:val="left"/>
+      <w:pPr>
+        <w:tabs>
+          <w:tab w:val="num" w:pos="5040"/>
+        </w:tabs>
+        <w:ind w:left="5040" w:hanging="360"/>
+      </w:pPr>
+      <w:rPr>
+        <w:rFonts w:ascii="Wingdings" w:hAnsi="Wingdings" w:hint="default"/>
+        <w:sz w:val="20"/>
+      </w:rPr>
+    </w:lvl>
+    <w:lvl w:ilvl="7" w:tentative="1">
+      <w:start w:val="1"/>
+      <w:numFmt w:val="bullet"/>
+      <w:lvlText w:val=""/>
+      <w:lvlJc w:val="left"/>
+      <w:pPr>
+        <w:tabs>
+          <w:tab w:val="num" w:pos="5760"/>
+        </w:tabs>
+        <w:ind w:left="5760" w:hanging="360"/>
+      </w:pPr>
+      <w:rPr>
+        <w:rFonts w:ascii="Wingdings" w:hAnsi="Wingdings" w:hint="default"/>
+        <w:sz w:val="20"/>
+      </w:rPr>
+    </w:lvl>
+    <w:lvl w:ilvl="8" w:tentative="1">
+      <w:start w:val="1"/>
+      <w:numFmt w:val="bullet"/>
+      <w:lvlText w:val=""/>
+      <w:lvlJc w:val="left"/>
+      <w:pPr>
+        <w:tabs>
+          <w:tab w:val="num" w:pos="6480"/>
+        </w:tabs>
+        <w:ind w:left="6480" w:hanging="360"/>
+      </w:pPr>
+      <w:rPr>
+        <w:rFonts w:ascii="Wingdings" w:hAnsi="Wingdings" w:hint="default"/>
+        <w:sz w:val="20"/>
+      </w:rPr>
+    </w:lvl>
+  </w:abstractNum>
+  <w:abstractNum w:abstractNumId="16" w15:restartNumberingAfterBreak="0">
+    <w:nsid w:val="587A11E4"/>
+    <w:multiLevelType w:val="hybridMultilevel"/>
+    <w:tmpl w:val="3134DD42"/>
+    <w:lvl w:ilvl="0" w:tplc="2C0A0003">
+      <w:start w:val="1"/>
+      <w:numFmt w:val="bullet"/>
+      <w:lvlText w:val="o"/>
+      <w:lvlJc w:val="left"/>
+      <w:pPr>
+        <w:ind w:left="1440" w:hanging="360"/>
+      </w:pPr>
+      <w:rPr>
+        <w:rFonts w:ascii="Courier New" w:hAnsi="Courier New" w:cs="Courier New" w:hint="default"/>
+      </w:rPr>
+    </w:lvl>
+    <w:lvl w:ilvl="1" w:tplc="2C0A0003" w:tentative="1">
+      <w:start w:val="1"/>
+      <w:numFmt w:val="bullet"/>
+      <w:lvlText w:val="o"/>
+      <w:lvlJc w:val="left"/>
+      <w:pPr>
+        <w:ind w:left="2160" w:hanging="360"/>
+      </w:pPr>
+      <w:rPr>
+        <w:rFonts w:ascii="Courier New" w:hAnsi="Courier New" w:cs="Courier New" w:hint="default"/>
+      </w:rPr>
+    </w:lvl>
+    <w:lvl w:ilvl="2" w:tplc="2C0A0005" w:tentative="1">
+      <w:start w:val="1"/>
+      <w:numFmt w:val="bullet"/>
+      <w:lvlText w:val=""/>
+      <w:lvlJc w:val="left"/>
+      <w:pPr>
+        <w:ind w:left="2880" w:hanging="360"/>
+      </w:pPr>
+      <w:rPr>
+        <w:rFonts w:ascii="Wingdings" w:hAnsi="Wingdings" w:hint="default"/>
+      </w:rPr>
+    </w:lvl>
+    <w:lvl w:ilvl="3" w:tplc="2C0A0001" w:tentative="1">
+      <w:start w:val="1"/>
+      <w:numFmt w:val="bullet"/>
+      <w:lvlText w:val=""/>
+      <w:lvlJc w:val="left"/>
+      <w:pPr>
+        <w:ind w:left="3600" w:hanging="360"/>
+      </w:pPr>
+      <w:rPr>
+        <w:rFonts w:ascii="Symbol" w:hAnsi="Symbol" w:hint="default"/>
+      </w:rPr>
+    </w:lvl>
+    <w:lvl w:ilvl="4" w:tplc="2C0A0003" w:tentative="1">
+      <w:start w:val="1"/>
+      <w:numFmt w:val="bullet"/>
+      <w:lvlText w:val="o"/>
+      <w:lvlJc w:val="left"/>
+      <w:pPr>
+        <w:ind w:left="4320" w:hanging="360"/>
+      </w:pPr>
+      <w:rPr>
+        <w:rFonts w:ascii="Courier New" w:hAnsi="Courier New" w:cs="Courier New" w:hint="default"/>
+      </w:rPr>
+    </w:lvl>
+    <w:lvl w:ilvl="5" w:tplc="2C0A0005" w:tentative="1">
+      <w:start w:val="1"/>
+      <w:numFmt w:val="bullet"/>
+      <w:lvlText w:val=""/>
+      <w:lvlJc w:val="left"/>
+      <w:pPr>
+        <w:ind w:left="5040" w:hanging="360"/>
+      </w:pPr>
+      <w:rPr>
+        <w:rFonts w:ascii="Wingdings" w:hAnsi="Wingdings" w:hint="default"/>
+      </w:rPr>
+    </w:lvl>
+    <w:lvl w:ilvl="6" w:tplc="2C0A0001" w:tentative="1">
+      <w:start w:val="1"/>
+      <w:numFmt w:val="bullet"/>
+      <w:lvlText w:val=""/>
+      <w:lvlJc w:val="left"/>
+      <w:pPr>
+        <w:ind w:left="5760" w:hanging="360"/>
+      </w:pPr>
+      <w:rPr>
+        <w:rFonts w:ascii="Symbol" w:hAnsi="Symbol" w:hint="default"/>
+      </w:rPr>
+    </w:lvl>
+    <w:lvl w:ilvl="7" w:tplc="2C0A0003" w:tentative="1">
+      <w:start w:val="1"/>
+      <w:numFmt w:val="bullet"/>
+      <w:lvlText w:val="o"/>
+      <w:lvlJc w:val="left"/>
+      <w:pPr>
+        <w:ind w:left="6480" w:hanging="360"/>
+      </w:pPr>
+      <w:rPr>
+        <w:rFonts w:ascii="Courier New" w:hAnsi="Courier New" w:cs="Courier New" w:hint="default"/>
+      </w:rPr>
+    </w:lvl>
+    <w:lvl w:ilvl="8" w:tplc="2C0A0005" w:tentative="1">
+      <w:start w:val="1"/>
+      <w:numFmt w:val="bullet"/>
+      <w:lvlText w:val=""/>
+      <w:lvlJc w:val="left"/>
+      <w:pPr>
+        <w:ind w:left="7200" w:hanging="360"/>
+      </w:pPr>
+      <w:rPr>
+        <w:rFonts w:ascii="Wingdings" w:hAnsi="Wingdings" w:hint="default"/>
+      </w:rPr>
+    </w:lvl>
+  </w:abstractNum>
+  <w:abstractNum w:abstractNumId="17" w15:restartNumberingAfterBreak="0">
     <w:nsid w:val="5A4B48AC"/>
     <w:multiLevelType w:val="multilevel"/>
     <w:tmpl w:val="5016D8D2"/>
@@ -1519,7 +4878,305 @@
       </w:rPr>
     </w:lvl>
   </w:abstractNum>
-  <w:abstractNum w:abstractNumId="4" w15:restartNumberingAfterBreak="0">
+  <w:abstractNum w:abstractNumId="18" w15:restartNumberingAfterBreak="0">
+    <w:nsid w:val="5CE450E1"/>
+    <w:multiLevelType w:val="multilevel"/>
+    <w:tmpl w:val="2B78F2FA"/>
+    <w:lvl w:ilvl="0">
+      <w:start w:val="1"/>
+      <w:numFmt w:val="bullet"/>
+      <w:lvlText w:val=""/>
+      <w:lvlJc w:val="left"/>
+      <w:pPr>
+        <w:tabs>
+          <w:tab w:val="num" w:pos="720"/>
+        </w:tabs>
+        <w:ind w:left="720" w:hanging="360"/>
+      </w:pPr>
+      <w:rPr>
+        <w:rFonts w:ascii="Symbol" w:hAnsi="Symbol" w:hint="default"/>
+        <w:sz w:val="20"/>
+      </w:rPr>
+    </w:lvl>
+    <w:lvl w:ilvl="1" w:tentative="1">
+      <w:start w:val="1"/>
+      <w:numFmt w:val="bullet"/>
+      <w:lvlText w:val="o"/>
+      <w:lvlJc w:val="left"/>
+      <w:pPr>
+        <w:tabs>
+          <w:tab w:val="num" w:pos="1440"/>
+        </w:tabs>
+        <w:ind w:left="1440" w:hanging="360"/>
+      </w:pPr>
+      <w:rPr>
+        <w:rFonts w:ascii="Courier New" w:hAnsi="Courier New" w:hint="default"/>
+        <w:sz w:val="20"/>
+      </w:rPr>
+    </w:lvl>
+    <w:lvl w:ilvl="2" w:tentative="1">
+      <w:start w:val="1"/>
+      <w:numFmt w:val="bullet"/>
+      <w:lvlText w:val=""/>
+      <w:lvlJc w:val="left"/>
+      <w:pPr>
+        <w:tabs>
+          <w:tab w:val="num" w:pos="2160"/>
+        </w:tabs>
+        <w:ind w:left="2160" w:hanging="360"/>
+      </w:pPr>
+      <w:rPr>
+        <w:rFonts w:ascii="Wingdings" w:hAnsi="Wingdings" w:hint="default"/>
+        <w:sz w:val="20"/>
+      </w:rPr>
+    </w:lvl>
+    <w:lvl w:ilvl="3" w:tentative="1">
+      <w:start w:val="1"/>
+      <w:numFmt w:val="bullet"/>
+      <w:lvlText w:val=""/>
+      <w:lvlJc w:val="left"/>
+      <w:pPr>
+        <w:tabs>
+          <w:tab w:val="num" w:pos="2880"/>
+        </w:tabs>
+        <w:ind w:left="2880" w:hanging="360"/>
+      </w:pPr>
+      <w:rPr>
+        <w:rFonts w:ascii="Wingdings" w:hAnsi="Wingdings" w:hint="default"/>
+        <w:sz w:val="20"/>
+      </w:rPr>
+    </w:lvl>
+    <w:lvl w:ilvl="4" w:tentative="1">
+      <w:start w:val="1"/>
+      <w:numFmt w:val="bullet"/>
+      <w:lvlText w:val=""/>
+      <w:lvlJc w:val="left"/>
+      <w:pPr>
+        <w:tabs>
+          <w:tab w:val="num" w:pos="3600"/>
+        </w:tabs>
+        <w:ind w:left="3600" w:hanging="360"/>
+      </w:pPr>
+      <w:rPr>
+        <w:rFonts w:ascii="Wingdings" w:hAnsi="Wingdings" w:hint="default"/>
+        <w:sz w:val="20"/>
+      </w:rPr>
+    </w:lvl>
+    <w:lvl w:ilvl="5" w:tentative="1">
+      <w:start w:val="1"/>
+      <w:numFmt w:val="bullet"/>
+      <w:lvlText w:val=""/>
+      <w:lvlJc w:val="left"/>
+      <w:pPr>
+        <w:tabs>
+          <w:tab w:val="num" w:pos="4320"/>
+        </w:tabs>
+        <w:ind w:left="4320" w:hanging="360"/>
+      </w:pPr>
+      <w:rPr>
+        <w:rFonts w:ascii="Wingdings" w:hAnsi="Wingdings" w:hint="default"/>
+        <w:sz w:val="20"/>
+      </w:rPr>
+    </w:lvl>
+    <w:lvl w:ilvl="6" w:tentative="1">
+      <w:start w:val="1"/>
+      <w:numFmt w:val="bullet"/>
+      <w:lvlText w:val=""/>
+      <w:lvlJc w:val="left"/>
+      <w:pPr>
+        <w:tabs>
+          <w:tab w:val="num" w:pos="5040"/>
+        </w:tabs>
+        <w:ind w:left="5040" w:hanging="360"/>
+      </w:pPr>
+      <w:rPr>
+        <w:rFonts w:ascii="Wingdings" w:hAnsi="Wingdings" w:hint="default"/>
+        <w:sz w:val="20"/>
+      </w:rPr>
+    </w:lvl>
+    <w:lvl w:ilvl="7" w:tentative="1">
+      <w:start w:val="1"/>
+      <w:numFmt w:val="bullet"/>
+      <w:lvlText w:val=""/>
+      <w:lvlJc w:val="left"/>
+      <w:pPr>
+        <w:tabs>
+          <w:tab w:val="num" w:pos="5760"/>
+        </w:tabs>
+        <w:ind w:left="5760" w:hanging="360"/>
+      </w:pPr>
+      <w:rPr>
+        <w:rFonts w:ascii="Wingdings" w:hAnsi="Wingdings" w:hint="default"/>
+        <w:sz w:val="20"/>
+      </w:rPr>
+    </w:lvl>
+    <w:lvl w:ilvl="8" w:tentative="1">
+      <w:start w:val="1"/>
+      <w:numFmt w:val="bullet"/>
+      <w:lvlText w:val=""/>
+      <w:lvlJc w:val="left"/>
+      <w:pPr>
+        <w:tabs>
+          <w:tab w:val="num" w:pos="6480"/>
+        </w:tabs>
+        <w:ind w:left="6480" w:hanging="360"/>
+      </w:pPr>
+      <w:rPr>
+        <w:rFonts w:ascii="Wingdings" w:hAnsi="Wingdings" w:hint="default"/>
+        <w:sz w:val="20"/>
+      </w:rPr>
+    </w:lvl>
+  </w:abstractNum>
+  <w:abstractNum w:abstractNumId="19" w15:restartNumberingAfterBreak="0">
+    <w:nsid w:val="61745AFF"/>
+    <w:multiLevelType w:val="multilevel"/>
+    <w:tmpl w:val="451493FC"/>
+    <w:lvl w:ilvl="0">
+      <w:start w:val="1"/>
+      <w:numFmt w:val="bullet"/>
+      <w:lvlText w:val=""/>
+      <w:lvlJc w:val="left"/>
+      <w:pPr>
+        <w:tabs>
+          <w:tab w:val="num" w:pos="720"/>
+        </w:tabs>
+        <w:ind w:left="720" w:hanging="360"/>
+      </w:pPr>
+      <w:rPr>
+        <w:rFonts w:ascii="Symbol" w:hAnsi="Symbol" w:hint="default"/>
+        <w:sz w:val="20"/>
+      </w:rPr>
+    </w:lvl>
+    <w:lvl w:ilvl="1">
+      <w:start w:val="1"/>
+      <w:numFmt w:val="bullet"/>
+      <w:lvlText w:val="o"/>
+      <w:lvlJc w:val="left"/>
+      <w:pPr>
+        <w:tabs>
+          <w:tab w:val="num" w:pos="1440"/>
+        </w:tabs>
+        <w:ind w:left="1440" w:hanging="360"/>
+      </w:pPr>
+      <w:rPr>
+        <w:rFonts w:ascii="Courier New" w:hAnsi="Courier New" w:hint="default"/>
+        <w:sz w:val="20"/>
+      </w:rPr>
+    </w:lvl>
+    <w:lvl w:ilvl="2" w:tentative="1">
+      <w:start w:val="1"/>
+      <w:numFmt w:val="bullet"/>
+      <w:lvlText w:val=""/>
+      <w:lvlJc w:val="left"/>
+      <w:pPr>
+        <w:tabs>
+          <w:tab w:val="num" w:pos="2160"/>
+        </w:tabs>
+        <w:ind w:left="2160" w:hanging="360"/>
+      </w:pPr>
+      <w:rPr>
+        <w:rFonts w:ascii="Wingdings" w:hAnsi="Wingdings" w:hint="default"/>
+        <w:sz w:val="20"/>
+      </w:rPr>
+    </w:lvl>
+    <w:lvl w:ilvl="3" w:tentative="1">
+      <w:start w:val="1"/>
+      <w:numFmt w:val="bullet"/>
+      <w:lvlText w:val=""/>
+      <w:lvlJc w:val="left"/>
+      <w:pPr>
+        <w:tabs>
+          <w:tab w:val="num" w:pos="2880"/>
+        </w:tabs>
+        <w:ind w:left="2880" w:hanging="360"/>
+      </w:pPr>
+      <w:rPr>
+        <w:rFonts w:ascii="Wingdings" w:hAnsi="Wingdings" w:hint="default"/>
+        <w:sz w:val="20"/>
+      </w:rPr>
+    </w:lvl>
+    <w:lvl w:ilvl="4" w:tentative="1">
+      <w:start w:val="1"/>
+      <w:numFmt w:val="bullet"/>
+      <w:lvlText w:val=""/>
+      <w:lvlJc w:val="left"/>
+      <w:pPr>
+        <w:tabs>
+          <w:tab w:val="num" w:pos="3600"/>
+        </w:tabs>
+        <w:ind w:left="3600" w:hanging="360"/>
+      </w:pPr>
+      <w:rPr>
+        <w:rFonts w:ascii="Wingdings" w:hAnsi="Wingdings" w:hint="default"/>
+        <w:sz w:val="20"/>
+      </w:rPr>
+    </w:lvl>
+    <w:lvl w:ilvl="5" w:tentative="1">
+      <w:start w:val="1"/>
+      <w:numFmt w:val="bullet"/>
+      <w:lvlText w:val=""/>
+      <w:lvlJc w:val="left"/>
+      <w:pPr>
+        <w:tabs>
+          <w:tab w:val="num" w:pos="4320"/>
+        </w:tabs>
+        <w:ind w:left="4320" w:hanging="360"/>
+      </w:pPr>
+      <w:rPr>
+        <w:rFonts w:ascii="Wingdings" w:hAnsi="Wingdings" w:hint="default"/>
+        <w:sz w:val="20"/>
+      </w:rPr>
+    </w:lvl>
+    <w:lvl w:ilvl="6" w:tentative="1">
+      <w:start w:val="1"/>
+      <w:numFmt w:val="bullet"/>
+      <w:lvlText w:val=""/>
+      <w:lvlJc w:val="left"/>
+      <w:pPr>
+        <w:tabs>
+          <w:tab w:val="num" w:pos="5040"/>
+        </w:tabs>
+        <w:ind w:left="5040" w:hanging="360"/>
+      </w:pPr>
+      <w:rPr>
+        <w:rFonts w:ascii="Wingdings" w:hAnsi="Wingdings" w:hint="default"/>
+        <w:sz w:val="20"/>
+      </w:rPr>
+    </w:lvl>
+    <w:lvl w:ilvl="7" w:tentative="1">
+      <w:start w:val="1"/>
+      <w:numFmt w:val="bullet"/>
+      <w:lvlText w:val=""/>
+      <w:lvlJc w:val="left"/>
+      <w:pPr>
+        <w:tabs>
+          <w:tab w:val="num" w:pos="5760"/>
+        </w:tabs>
+        <w:ind w:left="5760" w:hanging="360"/>
+      </w:pPr>
+      <w:rPr>
+        <w:rFonts w:ascii="Wingdings" w:hAnsi="Wingdings" w:hint="default"/>
+        <w:sz w:val="20"/>
+      </w:rPr>
+    </w:lvl>
+    <w:lvl w:ilvl="8" w:tentative="1">
+      <w:start w:val="1"/>
+      <w:numFmt w:val="bullet"/>
+      <w:lvlText w:val=""/>
+      <w:lvlJc w:val="left"/>
+      <w:pPr>
+        <w:tabs>
+          <w:tab w:val="num" w:pos="6480"/>
+        </w:tabs>
+        <w:ind w:left="6480" w:hanging="360"/>
+      </w:pPr>
+      <w:rPr>
+        <w:rFonts w:ascii="Wingdings" w:hAnsi="Wingdings" w:hint="default"/>
+        <w:sz w:val="20"/>
+      </w:rPr>
+    </w:lvl>
+  </w:abstractNum>
+  <w:abstractNum w:abstractNumId="20" w15:restartNumberingAfterBreak="0">
     <w:nsid w:val="61BA65FB"/>
     <w:multiLevelType w:val="multilevel"/>
     <w:tmpl w:val="31CA6D64"/>
@@ -1632,20 +5289,480 @@
       </w:pPr>
     </w:lvl>
   </w:abstractNum>
+  <w:abstractNum w:abstractNumId="21" w15:restartNumberingAfterBreak="0">
+    <w:nsid w:val="64FB4CD7"/>
+    <w:multiLevelType w:val="multilevel"/>
+    <w:tmpl w:val="787A6BDE"/>
+    <w:lvl w:ilvl="0">
+      <w:start w:val="1"/>
+      <w:numFmt w:val="decimal"/>
+      <w:lvlText w:val="%1."/>
+      <w:lvlJc w:val="left"/>
+      <w:pPr>
+        <w:tabs>
+          <w:tab w:val="num" w:pos="720"/>
+        </w:tabs>
+        <w:ind w:left="720" w:hanging="360"/>
+      </w:pPr>
+      <w:rPr>
+        <w:rFonts w:asciiTheme="minorHAnsi" w:eastAsiaTheme="minorHAnsi" w:hAnsiTheme="minorHAnsi" w:cstheme="minorBidi"/>
+        <w:sz w:val="20"/>
+      </w:rPr>
+    </w:lvl>
+    <w:lvl w:ilvl="1">
+      <w:start w:val="1"/>
+      <w:numFmt w:val="lowerLetter"/>
+      <w:lvlText w:val="%2."/>
+      <w:lvlJc w:val="left"/>
+      <w:pPr>
+        <w:ind w:left="1440" w:hanging="360"/>
+      </w:pPr>
+      <w:rPr>
+        <w:rFonts w:asciiTheme="minorHAnsi" w:eastAsiaTheme="minorHAnsi" w:hAnsiTheme="minorHAnsi" w:cstheme="minorBidi"/>
+      </w:rPr>
+    </w:lvl>
+    <w:lvl w:ilvl="2" w:tentative="1">
+      <w:start w:val="1"/>
+      <w:numFmt w:val="bullet"/>
+      <w:lvlText w:val=""/>
+      <w:lvlJc w:val="left"/>
+      <w:pPr>
+        <w:tabs>
+          <w:tab w:val="num" w:pos="2160"/>
+        </w:tabs>
+        <w:ind w:left="2160" w:hanging="360"/>
+      </w:pPr>
+      <w:rPr>
+        <w:rFonts w:ascii="Symbol" w:hAnsi="Symbol" w:hint="default"/>
+        <w:sz w:val="20"/>
+      </w:rPr>
+    </w:lvl>
+    <w:lvl w:ilvl="3" w:tentative="1">
+      <w:start w:val="1"/>
+      <w:numFmt w:val="bullet"/>
+      <w:lvlText w:val=""/>
+      <w:lvlJc w:val="left"/>
+      <w:pPr>
+        <w:tabs>
+          <w:tab w:val="num" w:pos="2880"/>
+        </w:tabs>
+        <w:ind w:left="2880" w:hanging="360"/>
+      </w:pPr>
+      <w:rPr>
+        <w:rFonts w:ascii="Symbol" w:hAnsi="Symbol" w:hint="default"/>
+        <w:sz w:val="20"/>
+      </w:rPr>
+    </w:lvl>
+    <w:lvl w:ilvl="4" w:tentative="1">
+      <w:start w:val="1"/>
+      <w:numFmt w:val="bullet"/>
+      <w:lvlText w:val=""/>
+      <w:lvlJc w:val="left"/>
+      <w:pPr>
+        <w:tabs>
+          <w:tab w:val="num" w:pos="3600"/>
+        </w:tabs>
+        <w:ind w:left="3600" w:hanging="360"/>
+      </w:pPr>
+      <w:rPr>
+        <w:rFonts w:ascii="Symbol" w:hAnsi="Symbol" w:hint="default"/>
+        <w:sz w:val="20"/>
+      </w:rPr>
+    </w:lvl>
+    <w:lvl w:ilvl="5" w:tentative="1">
+      <w:start w:val="1"/>
+      <w:numFmt w:val="bullet"/>
+      <w:lvlText w:val=""/>
+      <w:lvlJc w:val="left"/>
+      <w:pPr>
+        <w:tabs>
+          <w:tab w:val="num" w:pos="4320"/>
+        </w:tabs>
+        <w:ind w:left="4320" w:hanging="360"/>
+      </w:pPr>
+      <w:rPr>
+        <w:rFonts w:ascii="Symbol" w:hAnsi="Symbol" w:hint="default"/>
+        <w:sz w:val="20"/>
+      </w:rPr>
+    </w:lvl>
+    <w:lvl w:ilvl="6" w:tentative="1">
+      <w:start w:val="1"/>
+      <w:numFmt w:val="bullet"/>
+      <w:lvlText w:val=""/>
+      <w:lvlJc w:val="left"/>
+      <w:pPr>
+        <w:tabs>
+          <w:tab w:val="num" w:pos="5040"/>
+        </w:tabs>
+        <w:ind w:left="5040" w:hanging="360"/>
+      </w:pPr>
+      <w:rPr>
+        <w:rFonts w:ascii="Symbol" w:hAnsi="Symbol" w:hint="default"/>
+        <w:sz w:val="20"/>
+      </w:rPr>
+    </w:lvl>
+    <w:lvl w:ilvl="7" w:tentative="1">
+      <w:start w:val="1"/>
+      <w:numFmt w:val="bullet"/>
+      <w:lvlText w:val=""/>
+      <w:lvlJc w:val="left"/>
+      <w:pPr>
+        <w:tabs>
+          <w:tab w:val="num" w:pos="5760"/>
+        </w:tabs>
+        <w:ind w:left="5760" w:hanging="360"/>
+      </w:pPr>
+      <w:rPr>
+        <w:rFonts w:ascii="Symbol" w:hAnsi="Symbol" w:hint="default"/>
+        <w:sz w:val="20"/>
+      </w:rPr>
+    </w:lvl>
+    <w:lvl w:ilvl="8" w:tentative="1">
+      <w:start w:val="1"/>
+      <w:numFmt w:val="bullet"/>
+      <w:lvlText w:val=""/>
+      <w:lvlJc w:val="left"/>
+      <w:pPr>
+        <w:tabs>
+          <w:tab w:val="num" w:pos="6480"/>
+        </w:tabs>
+        <w:ind w:left="6480" w:hanging="360"/>
+      </w:pPr>
+      <w:rPr>
+        <w:rFonts w:ascii="Symbol" w:hAnsi="Symbol" w:hint="default"/>
+        <w:sz w:val="20"/>
+      </w:rPr>
+    </w:lvl>
+  </w:abstractNum>
+  <w:abstractNum w:abstractNumId="22" w15:restartNumberingAfterBreak="0">
+    <w:nsid w:val="71272B1B"/>
+    <w:multiLevelType w:val="hybridMultilevel"/>
+    <w:tmpl w:val="F1783B18"/>
+    <w:lvl w:ilvl="0" w:tplc="86CE1544">
+      <w:start w:val="1"/>
+      <w:numFmt w:val="bullet"/>
+      <w:lvlText w:val=""/>
+      <w:lvlJc w:val="left"/>
+      <w:pPr>
+        <w:tabs>
+          <w:tab w:val="num" w:pos="720"/>
+        </w:tabs>
+        <w:ind w:left="720" w:hanging="360"/>
+      </w:pPr>
+      <w:rPr>
+        <w:rFonts w:ascii="Symbol" w:hAnsi="Symbol" w:hint="default"/>
+        <w:sz w:val="20"/>
+      </w:rPr>
+    </w:lvl>
+    <w:lvl w:ilvl="1" w:tplc="2F205338">
+      <w:start w:val="1"/>
+      <w:numFmt w:val="decimal"/>
+      <w:lvlText w:val="%2."/>
+      <w:lvlJc w:val="left"/>
+      <w:pPr>
+        <w:tabs>
+          <w:tab w:val="num" w:pos="1440"/>
+        </w:tabs>
+        <w:ind w:left="1440" w:hanging="360"/>
+      </w:pPr>
+    </w:lvl>
+    <w:lvl w:ilvl="2" w:tplc="0FE41F9E" w:tentative="1">
+      <w:start w:val="1"/>
+      <w:numFmt w:val="bullet"/>
+      <w:lvlText w:val=""/>
+      <w:lvlJc w:val="left"/>
+      <w:pPr>
+        <w:tabs>
+          <w:tab w:val="num" w:pos="2160"/>
+        </w:tabs>
+        <w:ind w:left="2160" w:hanging="360"/>
+      </w:pPr>
+      <w:rPr>
+        <w:rFonts w:ascii="Wingdings" w:hAnsi="Wingdings" w:hint="default"/>
+        <w:sz w:val="20"/>
+      </w:rPr>
+    </w:lvl>
+    <w:lvl w:ilvl="3" w:tplc="5B86AE58" w:tentative="1">
+      <w:start w:val="1"/>
+      <w:numFmt w:val="bullet"/>
+      <w:lvlText w:val=""/>
+      <w:lvlJc w:val="left"/>
+      <w:pPr>
+        <w:tabs>
+          <w:tab w:val="num" w:pos="2880"/>
+        </w:tabs>
+        <w:ind w:left="2880" w:hanging="360"/>
+      </w:pPr>
+      <w:rPr>
+        <w:rFonts w:ascii="Wingdings" w:hAnsi="Wingdings" w:hint="default"/>
+        <w:sz w:val="20"/>
+      </w:rPr>
+    </w:lvl>
+    <w:lvl w:ilvl="4" w:tplc="1924D69C" w:tentative="1">
+      <w:start w:val="1"/>
+      <w:numFmt w:val="bullet"/>
+      <w:lvlText w:val=""/>
+      <w:lvlJc w:val="left"/>
+      <w:pPr>
+        <w:tabs>
+          <w:tab w:val="num" w:pos="3600"/>
+        </w:tabs>
+        <w:ind w:left="3600" w:hanging="360"/>
+      </w:pPr>
+      <w:rPr>
+        <w:rFonts w:ascii="Wingdings" w:hAnsi="Wingdings" w:hint="default"/>
+        <w:sz w:val="20"/>
+      </w:rPr>
+    </w:lvl>
+    <w:lvl w:ilvl="5" w:tplc="B7AE04E6" w:tentative="1">
+      <w:start w:val="1"/>
+      <w:numFmt w:val="bullet"/>
+      <w:lvlText w:val=""/>
+      <w:lvlJc w:val="left"/>
+      <w:pPr>
+        <w:tabs>
+          <w:tab w:val="num" w:pos="4320"/>
+        </w:tabs>
+        <w:ind w:left="4320" w:hanging="360"/>
+      </w:pPr>
+      <w:rPr>
+        <w:rFonts w:ascii="Wingdings" w:hAnsi="Wingdings" w:hint="default"/>
+        <w:sz w:val="20"/>
+      </w:rPr>
+    </w:lvl>
+    <w:lvl w:ilvl="6" w:tplc="5FC2FE66" w:tentative="1">
+      <w:start w:val="1"/>
+      <w:numFmt w:val="bullet"/>
+      <w:lvlText w:val=""/>
+      <w:lvlJc w:val="left"/>
+      <w:pPr>
+        <w:tabs>
+          <w:tab w:val="num" w:pos="5040"/>
+        </w:tabs>
+        <w:ind w:left="5040" w:hanging="360"/>
+      </w:pPr>
+      <w:rPr>
+        <w:rFonts w:ascii="Wingdings" w:hAnsi="Wingdings" w:hint="default"/>
+        <w:sz w:val="20"/>
+      </w:rPr>
+    </w:lvl>
+    <w:lvl w:ilvl="7" w:tplc="31283550" w:tentative="1">
+      <w:start w:val="1"/>
+      <w:numFmt w:val="bullet"/>
+      <w:lvlText w:val=""/>
+      <w:lvlJc w:val="left"/>
+      <w:pPr>
+        <w:tabs>
+          <w:tab w:val="num" w:pos="5760"/>
+        </w:tabs>
+        <w:ind w:left="5760" w:hanging="360"/>
+      </w:pPr>
+      <w:rPr>
+        <w:rFonts w:ascii="Wingdings" w:hAnsi="Wingdings" w:hint="default"/>
+        <w:sz w:val="20"/>
+      </w:rPr>
+    </w:lvl>
+    <w:lvl w:ilvl="8" w:tplc="9DB0E96C" w:tentative="1">
+      <w:start w:val="1"/>
+      <w:numFmt w:val="bullet"/>
+      <w:lvlText w:val=""/>
+      <w:lvlJc w:val="left"/>
+      <w:pPr>
+        <w:tabs>
+          <w:tab w:val="num" w:pos="6480"/>
+        </w:tabs>
+        <w:ind w:left="6480" w:hanging="360"/>
+      </w:pPr>
+      <w:rPr>
+        <w:rFonts w:ascii="Wingdings" w:hAnsi="Wingdings" w:hint="default"/>
+        <w:sz w:val="20"/>
+      </w:rPr>
+    </w:lvl>
+  </w:abstractNum>
+  <w:abstractNum w:abstractNumId="23" w15:restartNumberingAfterBreak="0">
+    <w:nsid w:val="79AD2AE7"/>
+    <w:multiLevelType w:val="hybridMultilevel"/>
+    <w:tmpl w:val="35BE16EA"/>
+    <w:lvl w:ilvl="0" w:tplc="2C0A0003">
+      <w:start w:val="1"/>
+      <w:numFmt w:val="bullet"/>
+      <w:lvlText w:val="o"/>
+      <w:lvlJc w:val="left"/>
+      <w:pPr>
+        <w:ind w:left="1440" w:hanging="360"/>
+      </w:pPr>
+      <w:rPr>
+        <w:rFonts w:ascii="Courier New" w:hAnsi="Courier New" w:cs="Courier New" w:hint="default"/>
+      </w:rPr>
+    </w:lvl>
+    <w:lvl w:ilvl="1" w:tplc="2C0A0003" w:tentative="1">
+      <w:start w:val="1"/>
+      <w:numFmt w:val="bullet"/>
+      <w:lvlText w:val="o"/>
+      <w:lvlJc w:val="left"/>
+      <w:pPr>
+        <w:ind w:left="2160" w:hanging="360"/>
+      </w:pPr>
+      <w:rPr>
+        <w:rFonts w:ascii="Courier New" w:hAnsi="Courier New" w:cs="Courier New" w:hint="default"/>
+      </w:rPr>
+    </w:lvl>
+    <w:lvl w:ilvl="2" w:tplc="2C0A0005" w:tentative="1">
+      <w:start w:val="1"/>
+      <w:numFmt w:val="bullet"/>
+      <w:lvlText w:val=""/>
+      <w:lvlJc w:val="left"/>
+      <w:pPr>
+        <w:ind w:left="2880" w:hanging="360"/>
+      </w:pPr>
+      <w:rPr>
+        <w:rFonts w:ascii="Wingdings" w:hAnsi="Wingdings" w:hint="default"/>
+      </w:rPr>
+    </w:lvl>
+    <w:lvl w:ilvl="3" w:tplc="2C0A0001" w:tentative="1">
+      <w:start w:val="1"/>
+      <w:numFmt w:val="bullet"/>
+      <w:lvlText w:val=""/>
+      <w:lvlJc w:val="left"/>
+      <w:pPr>
+        <w:ind w:left="3600" w:hanging="360"/>
+      </w:pPr>
+      <w:rPr>
+        <w:rFonts w:ascii="Symbol" w:hAnsi="Symbol" w:hint="default"/>
+      </w:rPr>
+    </w:lvl>
+    <w:lvl w:ilvl="4" w:tplc="2C0A0003" w:tentative="1">
+      <w:start w:val="1"/>
+      <w:numFmt w:val="bullet"/>
+      <w:lvlText w:val="o"/>
+      <w:lvlJc w:val="left"/>
+      <w:pPr>
+        <w:ind w:left="4320" w:hanging="360"/>
+      </w:pPr>
+      <w:rPr>
+        <w:rFonts w:ascii="Courier New" w:hAnsi="Courier New" w:cs="Courier New" w:hint="default"/>
+      </w:rPr>
+    </w:lvl>
+    <w:lvl w:ilvl="5" w:tplc="2C0A0005" w:tentative="1">
+      <w:start w:val="1"/>
+      <w:numFmt w:val="bullet"/>
+      <w:lvlText w:val=""/>
+      <w:lvlJc w:val="left"/>
+      <w:pPr>
+        <w:ind w:left="5040" w:hanging="360"/>
+      </w:pPr>
+      <w:rPr>
+        <w:rFonts w:ascii="Wingdings" w:hAnsi="Wingdings" w:hint="default"/>
+      </w:rPr>
+    </w:lvl>
+    <w:lvl w:ilvl="6" w:tplc="2C0A0001" w:tentative="1">
+      <w:start w:val="1"/>
+      <w:numFmt w:val="bullet"/>
+      <w:lvlText w:val=""/>
+      <w:lvlJc w:val="left"/>
+      <w:pPr>
+        <w:ind w:left="5760" w:hanging="360"/>
+      </w:pPr>
+      <w:rPr>
+        <w:rFonts w:ascii="Symbol" w:hAnsi="Symbol" w:hint="default"/>
+      </w:rPr>
+    </w:lvl>
+    <w:lvl w:ilvl="7" w:tplc="2C0A0003" w:tentative="1">
+      <w:start w:val="1"/>
+      <w:numFmt w:val="bullet"/>
+      <w:lvlText w:val="o"/>
+      <w:lvlJc w:val="left"/>
+      <w:pPr>
+        <w:ind w:left="6480" w:hanging="360"/>
+      </w:pPr>
+      <w:rPr>
+        <w:rFonts w:ascii="Courier New" w:hAnsi="Courier New" w:cs="Courier New" w:hint="default"/>
+      </w:rPr>
+    </w:lvl>
+    <w:lvl w:ilvl="8" w:tplc="2C0A0005" w:tentative="1">
+      <w:start w:val="1"/>
+      <w:numFmt w:val="bullet"/>
+      <w:lvlText w:val=""/>
+      <w:lvlJc w:val="left"/>
+      <w:pPr>
+        <w:ind w:left="7200" w:hanging="360"/>
+      </w:pPr>
+      <w:rPr>
+        <w:rFonts w:ascii="Wingdings" w:hAnsi="Wingdings" w:hint="default"/>
+      </w:rPr>
+    </w:lvl>
+  </w:abstractNum>
   <w:num w:numId="1" w16cid:durableId="307905385">
+    <w:abstractNumId w:val="20"/>
+  </w:num>
+  <w:num w:numId="2" w16cid:durableId="1286304423">
+    <w:abstractNumId w:val="17"/>
+  </w:num>
+  <w:num w:numId="3" w16cid:durableId="2058822278">
+    <w:abstractNumId w:val="11"/>
+  </w:num>
+  <w:num w:numId="4" w16cid:durableId="1708751099">
+    <w:abstractNumId w:val="5"/>
+  </w:num>
+  <w:num w:numId="5" w16cid:durableId="1909728743">
+    <w:abstractNumId w:val="2"/>
+  </w:num>
+  <w:num w:numId="6" w16cid:durableId="416173121">
+    <w:abstractNumId w:val="3"/>
+  </w:num>
+  <w:num w:numId="7" w16cid:durableId="1645046336">
+    <w:abstractNumId w:val="21"/>
+  </w:num>
+  <w:num w:numId="8" w16cid:durableId="785008826">
     <w:abstractNumId w:val="4"/>
   </w:num>
-  <w:num w:numId="2" w16cid:durableId="1286304423">
-    <w:abstractNumId w:val="3"/>
+  <w:num w:numId="9" w16cid:durableId="1134131389">
+    <w:abstractNumId w:val="12"/>
   </w:num>
-  <w:num w:numId="3" w16cid:durableId="2058822278">
-    <w:abstractNumId w:val="2"/>
+  <w:num w:numId="10" w16cid:durableId="427312839">
+    <w:abstractNumId w:val="7"/>
   </w:num>
-  <w:num w:numId="4" w16cid:durableId="1708751099">
+  <w:num w:numId="11" w16cid:durableId="1148131898">
+    <w:abstractNumId w:val="22"/>
+  </w:num>
+  <w:num w:numId="12" w16cid:durableId="1430538014">
+    <w:abstractNumId w:val="15"/>
+  </w:num>
+  <w:num w:numId="13" w16cid:durableId="995299816">
+    <w:abstractNumId w:val="0"/>
+  </w:num>
+  <w:num w:numId="14" w16cid:durableId="74204466">
+    <w:abstractNumId w:val="6"/>
+  </w:num>
+  <w:num w:numId="15" w16cid:durableId="2012947908">
+    <w:abstractNumId w:val="18"/>
+  </w:num>
+  <w:num w:numId="16" w16cid:durableId="1424567188">
     <w:abstractNumId w:val="1"/>
   </w:num>
-  <w:num w:numId="5" w16cid:durableId="1909728743">
-    <w:abstractNumId w:val="0"/>
+  <w:num w:numId="17" w16cid:durableId="438184502">
+    <w:abstractNumId w:val="9"/>
+  </w:num>
+  <w:num w:numId="18" w16cid:durableId="753549325">
+    <w:abstractNumId w:val="23"/>
+  </w:num>
+  <w:num w:numId="19" w16cid:durableId="1293364588">
+    <w:abstractNumId w:val="10"/>
+  </w:num>
+  <w:num w:numId="20" w16cid:durableId="952521038">
+    <w:abstractNumId w:val="16"/>
+  </w:num>
+  <w:num w:numId="21" w16cid:durableId="1089427929">
+    <w:abstractNumId w:val="19"/>
+  </w:num>
+  <w:num w:numId="22" w16cid:durableId="41440223">
+    <w:abstractNumId w:val="8"/>
+  </w:num>
+  <w:num w:numId="23" w16cid:durableId="1969238237">
+    <w:abstractNumId w:val="13"/>
+  </w:num>
+  <w:num w:numId="24" w16cid:durableId="1860392264">
+    <w:abstractNumId w:val="14"/>
   </w:num>
 </w:numbering>
 </file>
@@ -2566,6 +6683,22 @@
       <w:spacing w:val="5"/>
     </w:rPr>
   </w:style>
+  <w:style w:type="paragraph" w:styleId="NormalWeb">
+    <w:name w:val="Normal (Web)"/>
+    <w:basedOn w:val="Normal"/>
+    <w:uiPriority w:val="99"/>
+    <w:unhideWhenUsed/>
+    <w:rsid w:val="00CF7671"/>
+    <w:pPr>
+      <w:spacing w:before="100" w:beforeAutospacing="1" w:after="100" w:afterAutospacing="1" w:line="240" w:lineRule="auto"/>
+    </w:pPr>
+    <w:rPr>
+      <w:rFonts w:ascii="Times New Roman" w:eastAsia="Times New Roman" w:hAnsi="Times New Roman" w:cs="Times New Roman"/>
+      <w:kern w:val="0"/>
+      <w:lang w:eastAsia="es-AR"/>
+      <w14:ligatures w14:val="none"/>
+    </w:rPr>
+  </w:style>
 </w:styles>
 </file>
 

</xml_diff>

<commit_message>
v26.6 Final: Visor de comprobantes y optimización general (Código Fuente)
</commit_message>
<xml_diff>
--- a/Proyecto - APP Caja Chica ALM.docx
+++ b/Proyecto - APP Caja Chica ALM.docx
@@ -7,12 +7,18 @@
         <w:rPr>
           <w:b/>
           <w:bCs/>
+          <w:sz w:val="32"/>
+          <w:szCs w:val="32"/>
+          <w:u w:val="single"/>
         </w:rPr>
       </w:pPr>
       <w:r>
         <w:rPr>
           <w:b/>
           <w:bCs/>
+          <w:sz w:val="32"/>
+          <w:szCs w:val="32"/>
+          <w:u w:val="single"/>
         </w:rPr>
         <w:t>Propuesta de Proyecto: Aplicación "Control de Caja Chica"</w:t>
       </w:r>
@@ -209,7 +215,7 @@
     </w:p>
     <w:p>
       <w:r>
-        <w:t>Para los Colaboradores (Cuentadantes)</w:t>
+        <w:t xml:space="preserve">Para los Colaboradores </w:t>
       </w:r>
     </w:p>
     <w:p>
@@ -403,6 +409,9 @@
       <w:r>
         <w:t xml:space="preserve"> de la factura o foto original respaldatoria de cada movimiento financiero.</w:t>
       </w:r>
+      <w:r>
+        <w:t xml:space="preserve"> (a programar)</w:t>
+      </w:r>
     </w:p>
     <w:p>
       <w:pPr>
@@ -494,7 +503,15 @@
         <w:t>Lectura Inteligente (Google ML Kit)</w:t>
       </w:r>
       <w:r>
-        <w:t>: Machine Learning ejecutándose directamente en los dispositivos sin consumo extra de datos.</w:t>
+        <w:t xml:space="preserve">: Machine </w:t>
+      </w:r>
+      <w:proofErr w:type="spellStart"/>
+      <w:r>
+        <w:t>Learning</w:t>
+      </w:r>
+      <w:proofErr w:type="spellEnd"/>
+      <w:r>
+        <w:t xml:space="preserve"> ejecutándose directamente en los dispositivos sin consumo extra de datos.</w:t>
       </w:r>
     </w:p>
     <w:p>
@@ -509,7 +526,23 @@
           <w:b/>
           <w:bCs/>
         </w:rPr>
-        <w:t>6. Identidad Visual (Look and Feel)</w:t>
+        <w:t xml:space="preserve">6. Identidad Visual (Look and </w:t>
+      </w:r>
+      <w:proofErr w:type="spellStart"/>
+      <w:r>
+        <w:rPr>
+          <w:b/>
+          <w:bCs/>
+        </w:rPr>
+        <w:t>Feel</w:t>
+      </w:r>
+      <w:proofErr w:type="spellEnd"/>
+      <w:r>
+        <w:rPr>
+          <w:b/>
+          <w:bCs/>
+        </w:rPr>
+        <w:t>)</w:t>
       </w:r>
     </w:p>
     <w:p>
@@ -606,30 +639,26 @@
           <w:ilvl w:val="0"/>
           <w:numId w:val="5"/>
         </w:numPr>
+      </w:pPr>
+      <w:r>
         <w:rPr>
           <w:b/>
           <w:bCs/>
         </w:rPr>
-      </w:pPr>
+        <w:t>Mejo</w:t>
+      </w:r>
       <w:r>
         <w:rPr>
           <w:b/>
           <w:bCs/>
         </w:rPr>
-        <w:t>Mejo</w:t>
+        <w:t>r</w:t>
       </w:r>
       <w:r>
         <w:rPr>
           <w:b/>
           <w:bCs/>
         </w:rPr>
-        <w:t>r</w:t>
-      </w:r>
-      <w:r>
-        <w:rPr>
-          <w:b/>
-          <w:bCs/>
-        </w:rPr>
         <w:t>a en la Toma de Decisiones</w:t>
       </w:r>
       <w:r>
@@ -643,39 +672,120 @@
       </w:r>
       <w:r>
         <w:br/>
-      </w:r>
-      <w:r>
-        <w:rPr>
-          <w:b/>
-          <w:bCs/>
-        </w:rPr>
-        <w:t xml:space="preserve">visualización a modo de ejemplo de la </w:t>
-      </w:r>
-      <w:r>
-        <w:rPr>
-          <w:b/>
-          <w:bCs/>
-        </w:rPr>
-        <w:t>página</w:t>
-      </w:r>
-      <w:r>
-        <w:rPr>
-          <w:b/>
-          <w:bCs/>
-        </w:rPr>
-        <w:t xml:space="preserve"> web</w:t>
       </w:r>
     </w:p>
     <w:p>
+      <w:pPr>
+        <w:ind w:left="360"/>
+        <w:jc w:val="center"/>
+        <w:rPr>
+          <w:rStyle w:val="Ttulodellibro"/>
+          <w:sz w:val="32"/>
+          <w:szCs w:val="32"/>
+          <w:u w:val="single"/>
+        </w:rPr>
+      </w:pPr>
+      <w:r>
+        <w:rPr>
+          <w:rStyle w:val="Ttulodellibro"/>
+          <w:sz w:val="32"/>
+          <w:szCs w:val="32"/>
+          <w:u w:val="single"/>
+        </w:rPr>
+        <w:t>Visualización de la aplicación</w:t>
+      </w:r>
+    </w:p>
+    <w:p>
+      <w:pPr>
+        <w:rPr>
+          <w:rStyle w:val="Ttulodellibro"/>
+          <w:b w:val="0"/>
+          <w:bCs w:val="0"/>
+          <w:i w:val="0"/>
+          <w:iCs w:val="0"/>
+        </w:rPr>
+      </w:pPr>
+      <w:r>
+        <w:rPr>
+          <w:rStyle w:val="Ttulodellibro"/>
+          <w:b w:val="0"/>
+          <w:bCs w:val="0"/>
+          <w:i w:val="0"/>
+          <w:iCs w:val="0"/>
+        </w:rPr>
+        <w:t>Teléfono Movil</w:t>
+      </w:r>
+      <w:r>
+        <w:rPr>
+          <w:rStyle w:val="Ttulodellibro"/>
+          <w:b w:val="0"/>
+          <w:bCs w:val="0"/>
+          <w:i w:val="0"/>
+          <w:iCs w:val="0"/>
+        </w:rPr>
+        <w:t xml:space="preserve"> y Ordenador</w:t>
+      </w:r>
+      <w:r>
+        <w:rPr>
+          <w:rStyle w:val="Ttulodellibro"/>
+          <w:b w:val="0"/>
+          <w:bCs w:val="0"/>
+          <w:i w:val="0"/>
+          <w:iCs w:val="0"/>
+        </w:rPr>
+        <w:t>:</w:t>
+      </w:r>
+      <w:r>
+        <w:rPr>
+          <w:rStyle w:val="Ttulodellibro"/>
+          <w:b w:val="0"/>
+          <w:bCs w:val="0"/>
+          <w:i w:val="0"/>
+          <w:iCs w:val="0"/>
+        </w:rPr>
+        <w:t xml:space="preserve"> </w:t>
+      </w:r>
+    </w:p>
+    <w:p>
+      <w:pPr>
+        <w:rPr>
+          <w:rStyle w:val="Ttulodellibro"/>
+          <w:b w:val="0"/>
+          <w:bCs w:val="0"/>
+          <w:i w:val="0"/>
+          <w:iCs w:val="0"/>
+        </w:rPr>
+      </w:pPr>
+      <w:r>
+        <w:rPr>
+          <w:rStyle w:val="Ttulodellibro"/>
+          <w:b w:val="0"/>
+          <w:bCs w:val="0"/>
+          <w:i w:val="0"/>
+          <w:iCs w:val="0"/>
+        </w:rPr>
+        <w:t>Usuario</w:t>
+      </w:r>
+      <w:r>
+        <w:rPr>
+          <w:rStyle w:val="Ttulodellibro"/>
+          <w:b w:val="0"/>
+          <w:bCs w:val="0"/>
+          <w:i w:val="0"/>
+          <w:iCs w:val="0"/>
+        </w:rPr>
+        <w:br/>
+      </w:r>
       <w:r>
         <w:rPr>
           <w:noProof/>
+          <w:spacing w:val="5"/>
         </w:rPr>
         <w:drawing>
-          <wp:inline distT="0" distB="0" distL="0" distR="0" wp14:anchorId="68DDCE13" wp14:editId="294B0057">
-            <wp:extent cx="3606393" cy="2547036"/>
+          <wp:inline distT="0" distB="0" distL="0" distR="0" wp14:anchorId="7A94D058" wp14:editId="0DDBD75B">
+            <wp:extent cx="1780674" cy="3956928"/>
             <wp:effectExtent l="0" t="0" r="0" b="5715"/>
-            <wp:docPr id="162569666" name="Imagen 1"/>
+            <wp:docPr id="481543187" name="Imagen 9"/>
             <wp:cNvGraphicFramePr>
               <a:graphicFrameLocks xmlns:a="http://schemas.openxmlformats.org/drawingml/2006/main" noChangeAspect="1"/>
             </wp:cNvGraphicFramePr>
@@ -683,19 +793,25 @@
               <a:graphicData uri="http://schemas.openxmlformats.org/drawingml/2006/picture">
                 <pic:pic xmlns:pic="http://schemas.openxmlformats.org/drawingml/2006/picture">
                   <pic:nvPicPr>
-                    <pic:cNvPr id="162569666" name=""/>
+                    <pic:cNvPr id="481543187" name="Imagen 481543187"/>
                     <pic:cNvPicPr/>
                   </pic:nvPicPr>
                   <pic:blipFill>
-                    <a:blip r:embed="rId5"/>
+                    <a:blip r:embed="rId5" cstate="print">
+                      <a:extLst>
+                        <a:ext uri="{28A0092B-C50C-407E-A947-70E740481C1C}">
+                          <a14:useLocalDpi xmlns:a14="http://schemas.microsoft.com/office/drawing/2010/main" val="0"/>
+                        </a:ext>
+                      </a:extLst>
+                    </a:blip>
                     <a:stretch>
                       <a:fillRect/>
                     </a:stretch>
                   </pic:blipFill>
                   <pic:spPr>
-                    <a:xfrm>
+                    <a:xfrm rot="10800000" flipH="1" flipV="1">
                       <a:off x="0" y="0"/>
-                      <a:ext cx="3621199" cy="2557493"/>
+                      <a:ext cx="1786928" cy="3970826"/>
                     </a:xfrm>
                     <a:prstGeom prst="rect">
                       <a:avLst/>
@@ -708,17 +824,15 @@
         </w:drawing>
       </w:r>
       <w:r>
-        <w:br/>
-      </w:r>
-      <w:r>
         <w:rPr>
           <w:noProof/>
+          <w:spacing w:val="5"/>
         </w:rPr>
         <w:drawing>
-          <wp:inline distT="0" distB="0" distL="0" distR="0" wp14:anchorId="532ADFE2" wp14:editId="73CAB57F">
-            <wp:extent cx="3581606" cy="2538375"/>
-            <wp:effectExtent l="0" t="0" r="0" b="0"/>
-            <wp:docPr id="1106135917" name="Imagen 1"/>
+          <wp:inline distT="0" distB="0" distL="0" distR="0" wp14:anchorId="424428DF" wp14:editId="2AF2BC63">
+            <wp:extent cx="1781093" cy="3957858"/>
+            <wp:effectExtent l="0" t="0" r="0" b="5080"/>
+            <wp:docPr id="1813316371" name="Imagen 8"/>
             <wp:cNvGraphicFramePr>
               <a:graphicFrameLocks xmlns:a="http://schemas.openxmlformats.org/drawingml/2006/main" noChangeAspect="1"/>
             </wp:cNvGraphicFramePr>
@@ -726,11 +840,17 @@
               <a:graphicData uri="http://schemas.openxmlformats.org/drawingml/2006/picture">
                 <pic:pic xmlns:pic="http://schemas.openxmlformats.org/drawingml/2006/picture">
                   <pic:nvPicPr>
-                    <pic:cNvPr id="1106135917" name=""/>
+                    <pic:cNvPr id="1813316371" name="Imagen 1813316371"/>
                     <pic:cNvPicPr/>
                   </pic:nvPicPr>
                   <pic:blipFill>
-                    <a:blip r:embed="rId6"/>
+                    <a:blip r:embed="rId6" cstate="print">
+                      <a:extLst>
+                        <a:ext uri="{28A0092B-C50C-407E-A947-70E740481C1C}">
+                          <a14:useLocalDpi xmlns:a14="http://schemas.microsoft.com/office/drawing/2010/main" val="0"/>
+                        </a:ext>
+                      </a:extLst>
+                    </a:blip>
                     <a:stretch>
                       <a:fillRect/>
                     </a:stretch>
@@ -738,7 +858,7 @@
                   <pic:spPr>
                     <a:xfrm>
                       <a:off x="0" y="0"/>
-                      <a:ext cx="3584283" cy="2540272"/>
+                      <a:ext cx="1788304" cy="3973882"/>
                     </a:xfrm>
                     <a:prstGeom prst="rect">
                       <a:avLst/>
@@ -751,20 +871,15 @@
         </w:drawing>
       </w:r>
       <w:r>
-        <w:br/>
-      </w:r>
-    </w:p>
-    <w:p>
-      <w:r>
         <w:rPr>
           <w:noProof/>
-        </w:rPr>
-        <w:lastRenderedPageBreak/>
+          <w:spacing w:val="5"/>
+        </w:rPr>
         <w:drawing>
-          <wp:inline distT="0" distB="0" distL="0" distR="0" wp14:anchorId="34B5AC6E" wp14:editId="71B452CD">
-            <wp:extent cx="1629724" cy="3211372"/>
-            <wp:effectExtent l="0" t="0" r="8890" b="8255"/>
-            <wp:docPr id="1219306374" name="Imagen 1"/>
+          <wp:inline distT="0" distB="0" distL="0" distR="0" wp14:anchorId="7F691A31" wp14:editId="2A0207D2">
+            <wp:extent cx="1773141" cy="3940190"/>
+            <wp:effectExtent l="0" t="0" r="0" b="3175"/>
+            <wp:docPr id="1987672427" name="Imagen 7"/>
             <wp:cNvGraphicFramePr>
               <a:graphicFrameLocks xmlns:a="http://schemas.openxmlformats.org/drawingml/2006/main" noChangeAspect="1"/>
             </wp:cNvGraphicFramePr>
@@ -772,19 +887,25 @@
               <a:graphicData uri="http://schemas.openxmlformats.org/drawingml/2006/picture">
                 <pic:pic xmlns:pic="http://schemas.openxmlformats.org/drawingml/2006/picture">
                   <pic:nvPicPr>
-                    <pic:cNvPr id="1219306374" name=""/>
+                    <pic:cNvPr id="1987672427" name="Imagen 1987672427"/>
                     <pic:cNvPicPr/>
                   </pic:nvPicPr>
                   <pic:blipFill>
-                    <a:blip r:embed="rId7"/>
+                    <a:blip r:embed="rId7" cstate="print">
+                      <a:extLst>
+                        <a:ext uri="{28A0092B-C50C-407E-A947-70E740481C1C}">
+                          <a14:useLocalDpi xmlns:a14="http://schemas.microsoft.com/office/drawing/2010/main" val="0"/>
+                        </a:ext>
+                      </a:extLst>
+                    </a:blip>
                     <a:stretch>
                       <a:fillRect/>
                     </a:stretch>
                   </pic:blipFill>
                   <pic:spPr>
-                    <a:xfrm>
+                    <a:xfrm rot="10800000" flipH="1" flipV="1">
                       <a:off x="0" y="0"/>
-                      <a:ext cx="1643489" cy="3238495"/>
+                      <a:ext cx="1797515" cy="3994353"/>
                     </a:xfrm>
                     <a:prstGeom prst="rect">
                       <a:avLst/>
@@ -799,12 +920,14 @@
       <w:r>
         <w:rPr>
           <w:noProof/>
-        </w:rPr>
+          <w:spacing w:val="5"/>
+        </w:rPr>
+        <w:lastRenderedPageBreak/>
         <w:drawing>
-          <wp:inline distT="0" distB="0" distL="0" distR="0" wp14:anchorId="574D9896" wp14:editId="602FC713">
-            <wp:extent cx="1645920" cy="3226442"/>
-            <wp:effectExtent l="0" t="0" r="0" b="0"/>
-            <wp:docPr id="2038815429" name="Imagen 1"/>
+          <wp:inline distT="0" distB="0" distL="0" distR="0" wp14:anchorId="5E7B9996" wp14:editId="3634FE06">
+            <wp:extent cx="1780436" cy="3956400"/>
+            <wp:effectExtent l="0" t="0" r="0" b="6350"/>
+            <wp:docPr id="882225170" name="Imagen 6"/>
             <wp:cNvGraphicFramePr>
               <a:graphicFrameLocks xmlns:a="http://schemas.openxmlformats.org/drawingml/2006/main" noChangeAspect="1"/>
             </wp:cNvGraphicFramePr>
@@ -812,19 +935,25 @@
               <a:graphicData uri="http://schemas.openxmlformats.org/drawingml/2006/picture">
                 <pic:pic xmlns:pic="http://schemas.openxmlformats.org/drawingml/2006/picture">
                   <pic:nvPicPr>
-                    <pic:cNvPr id="2038815429" name=""/>
+                    <pic:cNvPr id="882225170" name="Imagen 882225170"/>
                     <pic:cNvPicPr/>
                   </pic:nvPicPr>
                   <pic:blipFill>
-                    <a:blip r:embed="rId8"/>
+                    <a:blip r:embed="rId8" cstate="print">
+                      <a:extLst>
+                        <a:ext uri="{28A0092B-C50C-407E-A947-70E740481C1C}">
+                          <a14:useLocalDpi xmlns:a14="http://schemas.microsoft.com/office/drawing/2010/main" val="0"/>
+                        </a:ext>
+                      </a:extLst>
+                    </a:blip>
                     <a:stretch>
                       <a:fillRect/>
                     </a:stretch>
                   </pic:blipFill>
                   <pic:spPr>
-                    <a:xfrm>
+                    <a:xfrm rot="10800000" flipH="1" flipV="1">
                       <a:off x="0" y="0"/>
-                      <a:ext cx="1663782" cy="3261456"/>
+                      <a:ext cx="1780436" cy="3956400"/>
                     </a:xfrm>
                     <a:prstGeom prst="rect">
                       <a:avLst/>
@@ -836,1394 +965,490 @@
           </wp:inline>
         </w:drawing>
       </w:r>
+      <w:r>
+        <w:rPr>
+          <w:noProof/>
+          <w:spacing w:val="5"/>
+        </w:rPr>
+        <w:drawing>
+          <wp:inline distT="0" distB="0" distL="0" distR="0" wp14:anchorId="634BAF10" wp14:editId="73C06022">
+            <wp:extent cx="1780436" cy="3956400"/>
+            <wp:effectExtent l="0" t="0" r="0" b="6350"/>
+            <wp:docPr id="1514754865" name="Imagen 1"/>
+            <wp:cNvGraphicFramePr>
+              <a:graphicFrameLocks xmlns:a="http://schemas.openxmlformats.org/drawingml/2006/main" noChangeAspect="1"/>
+            </wp:cNvGraphicFramePr>
+            <a:graphic xmlns:a="http://schemas.openxmlformats.org/drawingml/2006/main">
+              <a:graphicData uri="http://schemas.openxmlformats.org/drawingml/2006/picture">
+                <pic:pic xmlns:pic="http://schemas.openxmlformats.org/drawingml/2006/picture">
+                  <pic:nvPicPr>
+                    <pic:cNvPr id="1514754865" name="Imagen 1514754865"/>
+                    <pic:cNvPicPr/>
+                  </pic:nvPicPr>
+                  <pic:blipFill>
+                    <a:blip r:embed="rId9" cstate="print">
+                      <a:extLst>
+                        <a:ext uri="{28A0092B-C50C-407E-A947-70E740481C1C}">
+                          <a14:useLocalDpi xmlns:a14="http://schemas.microsoft.com/office/drawing/2010/main" val="0"/>
+                        </a:ext>
+                      </a:extLst>
+                    </a:blip>
+                    <a:stretch>
+                      <a:fillRect/>
+                    </a:stretch>
+                  </pic:blipFill>
+                  <pic:spPr>
+                    <a:xfrm>
+                      <a:off x="0" y="0"/>
+                      <a:ext cx="1780436" cy="3956400"/>
+                    </a:xfrm>
+                    <a:prstGeom prst="rect">
+                      <a:avLst/>
+                    </a:prstGeom>
+                  </pic:spPr>
+                </pic:pic>
+              </a:graphicData>
+            </a:graphic>
+          </wp:inline>
+        </w:drawing>
+      </w:r>
+      <w:r>
+        <w:rPr>
+          <w:noProof/>
+          <w:spacing w:val="5"/>
+        </w:rPr>
+        <w:drawing>
+          <wp:inline distT="0" distB="0" distL="0" distR="0" wp14:anchorId="05C7B947" wp14:editId="0B5C6CA3">
+            <wp:extent cx="1780439" cy="3956400"/>
+            <wp:effectExtent l="0" t="0" r="0" b="6350"/>
+            <wp:docPr id="834647080" name="Imagen 4"/>
+            <wp:cNvGraphicFramePr>
+              <a:graphicFrameLocks xmlns:a="http://schemas.openxmlformats.org/drawingml/2006/main" noChangeAspect="1"/>
+            </wp:cNvGraphicFramePr>
+            <a:graphic xmlns:a="http://schemas.openxmlformats.org/drawingml/2006/main">
+              <a:graphicData uri="http://schemas.openxmlformats.org/drawingml/2006/picture">
+                <pic:pic xmlns:pic="http://schemas.openxmlformats.org/drawingml/2006/picture">
+                  <pic:nvPicPr>
+                    <pic:cNvPr id="834647080" name="Imagen 834647080"/>
+                    <pic:cNvPicPr/>
+                  </pic:nvPicPr>
+                  <pic:blipFill>
+                    <a:blip r:embed="rId10" cstate="print">
+                      <a:extLst>
+                        <a:ext uri="{28A0092B-C50C-407E-A947-70E740481C1C}">
+                          <a14:useLocalDpi xmlns:a14="http://schemas.microsoft.com/office/drawing/2010/main" val="0"/>
+                        </a:ext>
+                      </a:extLst>
+                    </a:blip>
+                    <a:stretch>
+                      <a:fillRect/>
+                    </a:stretch>
+                  </pic:blipFill>
+                  <pic:spPr>
+                    <a:xfrm>
+                      <a:off x="0" y="0"/>
+                      <a:ext cx="1780439" cy="3956400"/>
+                    </a:xfrm>
+                    <a:prstGeom prst="rect">
+                      <a:avLst/>
+                    </a:prstGeom>
+                  </pic:spPr>
+                </pic:pic>
+              </a:graphicData>
+            </a:graphic>
+          </wp:inline>
+        </w:drawing>
+      </w:r>
+      <w:r>
+        <w:rPr>
+          <w:noProof/>
+          <w:spacing w:val="5"/>
+        </w:rPr>
+        <w:drawing>
+          <wp:inline distT="0" distB="0" distL="0" distR="0" wp14:anchorId="01C559B3" wp14:editId="4DB09BF9">
+            <wp:extent cx="1780438" cy="3956400"/>
+            <wp:effectExtent l="0" t="0" r="0" b="6350"/>
+            <wp:docPr id="665841940" name="Imagen 5"/>
+            <wp:cNvGraphicFramePr>
+              <a:graphicFrameLocks xmlns:a="http://schemas.openxmlformats.org/drawingml/2006/main" noChangeAspect="1"/>
+            </wp:cNvGraphicFramePr>
+            <a:graphic xmlns:a="http://schemas.openxmlformats.org/drawingml/2006/main">
+              <a:graphicData uri="http://schemas.openxmlformats.org/drawingml/2006/picture">
+                <pic:pic xmlns:pic="http://schemas.openxmlformats.org/drawingml/2006/picture">
+                  <pic:nvPicPr>
+                    <pic:cNvPr id="665841940" name="Imagen 665841940"/>
+                    <pic:cNvPicPr/>
+                  </pic:nvPicPr>
+                  <pic:blipFill>
+                    <a:blip r:embed="rId11" cstate="print">
+                      <a:extLst>
+                        <a:ext uri="{28A0092B-C50C-407E-A947-70E740481C1C}">
+                          <a14:useLocalDpi xmlns:a14="http://schemas.microsoft.com/office/drawing/2010/main" val="0"/>
+                        </a:ext>
+                      </a:extLst>
+                    </a:blip>
+                    <a:stretch>
+                      <a:fillRect/>
+                    </a:stretch>
+                  </pic:blipFill>
+                  <pic:spPr>
+                    <a:xfrm>
+                      <a:off x="0" y="0"/>
+                      <a:ext cx="1780438" cy="3956400"/>
+                    </a:xfrm>
+                    <a:prstGeom prst="rect">
+                      <a:avLst/>
+                    </a:prstGeom>
+                  </pic:spPr>
+                </pic:pic>
+              </a:graphicData>
+            </a:graphic>
+          </wp:inline>
+        </w:drawing>
+      </w:r>
+      <w:r>
+        <w:rPr>
+          <w:noProof/>
+          <w:spacing w:val="5"/>
+        </w:rPr>
+        <w:drawing>
+          <wp:inline distT="0" distB="0" distL="0" distR="0" wp14:anchorId="4757E2C5" wp14:editId="3D5DAC87">
+            <wp:extent cx="1780438" cy="3956400"/>
+            <wp:effectExtent l="0" t="0" r="0" b="6350"/>
+            <wp:docPr id="1198951095" name="Imagen 3"/>
+            <wp:cNvGraphicFramePr>
+              <a:graphicFrameLocks xmlns:a="http://schemas.openxmlformats.org/drawingml/2006/main" noChangeAspect="1"/>
+            </wp:cNvGraphicFramePr>
+            <a:graphic xmlns:a="http://schemas.openxmlformats.org/drawingml/2006/main">
+              <a:graphicData uri="http://schemas.openxmlformats.org/drawingml/2006/picture">
+                <pic:pic xmlns:pic="http://schemas.openxmlformats.org/drawingml/2006/picture">
+                  <pic:nvPicPr>
+                    <pic:cNvPr id="1198951095" name="Imagen 1198951095"/>
+                    <pic:cNvPicPr/>
+                  </pic:nvPicPr>
+                  <pic:blipFill>
+                    <a:blip r:embed="rId12" cstate="print">
+                      <a:extLst>
+                        <a:ext uri="{28A0092B-C50C-407E-A947-70E740481C1C}">
+                          <a14:useLocalDpi xmlns:a14="http://schemas.microsoft.com/office/drawing/2010/main" val="0"/>
+                        </a:ext>
+                      </a:extLst>
+                    </a:blip>
+                    <a:stretch>
+                      <a:fillRect/>
+                    </a:stretch>
+                  </pic:blipFill>
+                  <pic:spPr>
+                    <a:xfrm rot="10800000" flipH="1" flipV="1">
+                      <a:off x="0" y="0"/>
+                      <a:ext cx="1780438" cy="3956400"/>
+                    </a:xfrm>
+                    <a:prstGeom prst="rect">
+                      <a:avLst/>
+                    </a:prstGeom>
+                  </pic:spPr>
+                </pic:pic>
+              </a:graphicData>
+            </a:graphic>
+          </wp:inline>
+        </w:drawing>
+      </w:r>
+      <w:r>
+        <w:rPr>
+          <w:noProof/>
+          <w:spacing w:val="5"/>
+        </w:rPr>
+        <w:drawing>
+          <wp:inline distT="0" distB="0" distL="0" distR="0" wp14:anchorId="04FE66E0" wp14:editId="2706725A">
+            <wp:extent cx="1780438" cy="3956400"/>
+            <wp:effectExtent l="0" t="0" r="0" b="6350"/>
+            <wp:docPr id="988162831" name="Imagen 2"/>
+            <wp:cNvGraphicFramePr>
+              <a:graphicFrameLocks xmlns:a="http://schemas.openxmlformats.org/drawingml/2006/main" noChangeAspect="1"/>
+            </wp:cNvGraphicFramePr>
+            <a:graphic xmlns:a="http://schemas.openxmlformats.org/drawingml/2006/main">
+              <a:graphicData uri="http://schemas.openxmlformats.org/drawingml/2006/picture">
+                <pic:pic xmlns:pic="http://schemas.openxmlformats.org/drawingml/2006/picture">
+                  <pic:nvPicPr>
+                    <pic:cNvPr id="988162831" name="Imagen 988162831"/>
+                    <pic:cNvPicPr/>
+                  </pic:nvPicPr>
+                  <pic:blipFill>
+                    <a:blip r:embed="rId13" cstate="print">
+                      <a:extLst>
+                        <a:ext uri="{28A0092B-C50C-407E-A947-70E740481C1C}">
+                          <a14:useLocalDpi xmlns:a14="http://schemas.microsoft.com/office/drawing/2010/main" val="0"/>
+                        </a:ext>
+                      </a:extLst>
+                    </a:blip>
+                    <a:stretch>
+                      <a:fillRect/>
+                    </a:stretch>
+                  </pic:blipFill>
+                  <pic:spPr>
+                    <a:xfrm>
+                      <a:off x="0" y="0"/>
+                      <a:ext cx="1780438" cy="3956400"/>
+                    </a:xfrm>
+                    <a:prstGeom prst="rect">
+                      <a:avLst/>
+                    </a:prstGeom>
+                  </pic:spPr>
+                </pic:pic>
+              </a:graphicData>
+            </a:graphic>
+          </wp:inline>
+        </w:drawing>
+      </w:r>
     </w:p>
     <w:p>
-      <w:r>
-        <w:t>Especificación UI/UX y Funcional</w:t>
-      </w:r>
+      <w:pPr>
+        <w:ind w:left="360"/>
+        <w:rPr>
+          <w:rStyle w:val="Ttulodellibro"/>
+          <w:sz w:val="32"/>
+          <w:szCs w:val="32"/>
+          <w:u w:val="single"/>
+        </w:rPr>
+      </w:pPr>
     </w:p>
     <w:p>
       <w:r>
-        <w:rPr>
-          <w:b/>
-          <w:bCs/>
-        </w:rPr>
-        <w:t>Proyecto:</w:t>
-      </w:r>
-      <w:r>
-        <w:t xml:space="preserve"> App de Gestión de Gastos - Agropecuaria Las Marias </w:t>
-      </w:r>
-      <w:r>
-        <w:br/>
-      </w:r>
-      <w:r>
-        <w:rPr>
-          <w:b/>
-          <w:bCs/>
-        </w:rPr>
-        <w:t>Plataforma:</w:t>
-      </w:r>
-      <w:r>
-        <w:t xml:space="preserve"> Aplicación Móvil (con fase de prueba inicial en entorno Web). </w:t>
-      </w:r>
-      <w:r>
-        <w:br/>
-      </w:r>
-      <w:r>
-        <w:rPr>
-          <w:b/>
-          <w:bCs/>
-        </w:rPr>
-        <w:t>Estado Previo:</w:t>
-      </w:r>
-      <w:r>
-        <w:t xml:space="preserve"> Pantalla de Inicio/Login finalizada y controlada (NO MODIFICAR).</w:t>
+        <w:t>Administrador</w:t>
       </w:r>
     </w:p>
     <w:p>
-      <w:pPr>
-        <w:rPr>
-          <w:b/>
-          <w:bCs/>
-        </w:rPr>
-      </w:pPr>
-      <w:r>
-        <w:rPr>
-          <w:b/>
-          <w:bCs/>
-        </w:rPr>
-        <w:t>1. Guía de Estilo y UI (Interfaz de Usuario)</w:t>
-      </w:r>
-    </w:p>
-    <w:p>
-      <w:pPr>
-        <w:numPr>
-          <w:ilvl w:val="0"/>
-          <w:numId w:val="8"/>
-        </w:numPr>
-      </w:pPr>
-      <w:r>
-        <w:rPr>
-          <w:b/>
-          <w:bCs/>
-        </w:rPr>
-        <w:t>Estética:</w:t>
-      </w:r>
-      <w:r>
-        <w:t xml:space="preserve"> Diseño minimalista, limpio</w:t>
-      </w:r>
-      <w:r>
-        <w:t>,</w:t>
-      </w:r>
-      <w:r>
-        <w:t xml:space="preserve"> amigable</w:t>
-      </w:r>
-      <w:r>
-        <w:t xml:space="preserve"> y profesional</w:t>
-      </w:r>
-      <w:r>
-        <w:t>. Optimizado estrictamente para dimensiones de teléfonos móviles.</w:t>
-      </w:r>
-    </w:p>
-    <w:p>
-      <w:pPr>
-        <w:numPr>
-          <w:ilvl w:val="0"/>
-          <w:numId w:val="8"/>
-        </w:numPr>
-      </w:pPr>
-      <w:r>
-        <w:rPr>
-          <w:b/>
-          <w:bCs/>
-        </w:rPr>
-        <w:t>Paleta de Colores:</w:t>
-      </w:r>
-      <w:r>
-        <w:t xml:space="preserve"> * Primarios: Blanco y Negro.</w:t>
-      </w:r>
-    </w:p>
-    <w:p>
-      <w:pPr>
-        <w:numPr>
-          <w:ilvl w:val="1"/>
-          <w:numId w:val="8"/>
-        </w:numPr>
-      </w:pPr>
-      <w:r>
-        <w:t>Corporativos: Naranja (#ba4817) y Amarillo (#e5a102).</w:t>
-      </w:r>
-    </w:p>
-    <w:p>
-      <w:pPr>
-        <w:numPr>
-          <w:ilvl w:val="0"/>
-          <w:numId w:val="8"/>
-        </w:numPr>
-      </w:pPr>
-      <w:r>
-        <w:rPr>
-          <w:b/>
-          <w:bCs/>
-        </w:rPr>
-        <w:t>Navegación:</w:t>
-      </w:r>
-      <w:r>
-        <w:t xml:space="preserve"> Menú Hamburguesa (esquina superior izquierda).</w:t>
-      </w:r>
-    </w:p>
-    <w:p>
-      <w:pPr>
-        <w:numPr>
-          <w:ilvl w:val="1"/>
-          <w:numId w:val="8"/>
-        </w:numPr>
-      </w:pPr>
-      <w:r>
-        <w:rPr>
-          <w:i/>
-          <w:iCs/>
-        </w:rPr>
-        <w:t>Cabecera del menú:</w:t>
-      </w:r>
-      <w:r>
-        <w:t xml:space="preserve"> Nombre del usuario activo. Avatar circular con las iniciales del usuario (Ej: Javier Cordoba = "JC").</w:t>
-      </w:r>
-    </w:p>
-    <w:p>
-      <w:pPr>
-        <w:numPr>
-          <w:ilvl w:val="1"/>
-          <w:numId w:val="8"/>
-        </w:numPr>
-      </w:pPr>
-      <w:r>
-        <w:rPr>
-          <w:i/>
-          <w:iCs/>
-        </w:rPr>
-        <w:t>Pie del menú:</w:t>
-      </w:r>
-      <w:r>
-        <w:t xml:space="preserve"> Logo/Texto de identidad: "Agropecuaria Las Marias".</w:t>
-      </w:r>
-    </w:p>
-    <w:p>
-      <w:pPr>
-        <w:numPr>
-          <w:ilvl w:val="1"/>
-          <w:numId w:val="8"/>
-        </w:numPr>
-      </w:pPr>
-      <w:r>
-        <w:rPr>
-          <w:i/>
-          <w:iCs/>
-        </w:rPr>
-        <w:t>Opciones del menú:</w:t>
-      </w:r>
-      <w:r>
-        <w:t xml:space="preserve"> Dashboard, Nuevo Registro, Historial, Perfil (cada uno con un icono minimalista representativo).</w:t>
-      </w:r>
-    </w:p>
-    <w:p>
-      <w:pPr>
-        <w:rPr>
-          <w:b/>
-          <w:bCs/>
-        </w:rPr>
-      </w:pPr>
-      <w:r>
-        <w:rPr>
-          <w:b/>
-          <w:bCs/>
-        </w:rPr>
-        <w:t>2. Vistas de la Aplicación (Navegación)</w:t>
-      </w:r>
-    </w:p>
-    <w:p>
-      <w:r>
-        <w:rPr>
-          <w:b/>
-          <w:bCs/>
-        </w:rPr>
-        <w:t>A. Dashboard (Pantalla Principal)</w:t>
-      </w:r>
-    </w:p>
-    <w:p>
-      <w:pPr>
-        <w:numPr>
-          <w:ilvl w:val="0"/>
-          <w:numId w:val="9"/>
-        </w:numPr>
-      </w:pPr>
-      <w:r>
-        <w:rPr>
-          <w:b/>
-          <w:bCs/>
-        </w:rPr>
-        <w:t>Saludo:</w:t>
-      </w:r>
-      <w:r>
-        <w:t xml:space="preserve"> "Hola, [Nombre de Usuario]".</w:t>
-      </w:r>
-    </w:p>
-    <w:p>
-      <w:pPr>
-        <w:numPr>
-          <w:ilvl w:val="0"/>
-          <w:numId w:val="9"/>
-        </w:numPr>
-      </w:pPr>
-      <w:r>
-        <w:rPr>
-          <w:b/>
-          <w:bCs/>
+      <w:r>
+        <w:rPr>
+          <w:noProof/>
         </w:rPr>
         <w:lastRenderedPageBreak/>
-        <w:t>Tarjetas de Saldo (2 columnas):</w:t>
-      </w:r>
-      <w:r>
-        <w:t xml:space="preserve"> Globos/Tarjetas mostrando el saldo disponible en pesos ($), divididos en Efectivo y Tarjeta. Se calculan dinámicamente según los registros.</w:t>
-      </w:r>
-    </w:p>
-    <w:p>
-      <w:pPr>
-        <w:numPr>
-          <w:ilvl w:val="0"/>
-          <w:numId w:val="9"/>
-        </w:numPr>
-      </w:pPr>
-      <w:r>
-        <w:rPr>
-          <w:b/>
-          <w:bCs/>
-        </w:rPr>
-        <w:t>Tarjetas de Resumen (4 cuadrantes):</w:t>
-      </w:r>
-      <w:r>
-        <w:t xml:space="preserve"> Cantidad de movimientos, Dinero Ingresado, Dinero Egresado, Total Gastos. Afectados por un filtro temporal (Diario, Semanal, Mensual</w:t>
-      </w:r>
-      <w:r>
-        <w:t>, Anual</w:t>
-      </w:r>
-      <w:r>
-        <w:t>).</w:t>
-      </w:r>
-    </w:p>
-    <w:p>
-      <w:pPr>
-        <w:numPr>
-          <w:ilvl w:val="0"/>
-          <w:numId w:val="9"/>
-        </w:numPr>
-      </w:pPr>
-      <w:r>
-        <w:rPr>
-          <w:b/>
-          <w:bCs/>
-        </w:rPr>
-        <w:t>Gráfico Analítico:</w:t>
-      </w:r>
-      <w:r>
-        <w:t xml:space="preserve"> Gráfico de barras/columnas de gastos segmentados por establecimiento (ADM, PL, FL, SI, LC, LH, E7, EM). Afectado por filtro temporal (Diario a Anual).</w:t>
-      </w:r>
-    </w:p>
-    <w:p>
-      <w:pPr>
-        <w:numPr>
-          <w:ilvl w:val="0"/>
-          <w:numId w:val="9"/>
-        </w:numPr>
-      </w:pPr>
-      <w:r>
-        <w:rPr>
-          <w:b/>
-          <w:bCs/>
-        </w:rPr>
-        <w:t>Últimos Movimientos:</w:t>
-      </w:r>
-      <w:r>
-        <w:t xml:space="preserve"> Lista resumida.</w:t>
-      </w:r>
-    </w:p>
-    <w:p>
-      <w:pPr>
-        <w:numPr>
-          <w:ilvl w:val="1"/>
-          <w:numId w:val="9"/>
-        </w:numPr>
-      </w:pPr>
-      <w:r>
-        <w:rPr>
-          <w:i/>
-          <w:iCs/>
-        </w:rPr>
-        <w:t>Acción 1:</w:t>
-      </w:r>
-      <w:r>
-        <w:t xml:space="preserve"> Icono de "Tacho de basura" para eliminar el registro (recalcula el saldo automáticamente).</w:t>
-      </w:r>
-    </w:p>
-    <w:p>
-      <w:pPr>
-        <w:numPr>
-          <w:ilvl w:val="1"/>
-          <w:numId w:val="9"/>
-        </w:numPr>
-      </w:pPr>
-      <w:r>
-        <w:rPr>
-          <w:i/>
-          <w:iCs/>
-        </w:rPr>
-        <w:t>Acción 2:</w:t>
-      </w:r>
-      <w:r>
-        <w:t xml:space="preserve"> Icono de "</w:t>
-      </w:r>
-      <w:proofErr w:type="gramStart"/>
-      <w:r>
-        <w:t>Ticket</w:t>
-      </w:r>
-      <w:proofErr w:type="gramEnd"/>
-      <w:r>
-        <w:t>" (solo visible si el registro se hizo vía PDF/PNG). Al presionarlo, abre el comprobante original para visualización e impresión.</w:t>
-      </w:r>
-    </w:p>
-    <w:p>
-      <w:pPr>
-        <w:pStyle w:val="Prrafodelista"/>
-        <w:numPr>
-          <w:ilvl w:val="0"/>
-          <w:numId w:val="9"/>
-        </w:numPr>
-      </w:pPr>
-      <w:r>
-        <w:rPr>
-          <w:b/>
-          <w:bCs/>
-        </w:rPr>
-        <w:t>Nueva Función:</w:t>
-      </w:r>
-      <w:r>
-        <w:t xml:space="preserve"> Exportación de Egresos.</w:t>
-      </w:r>
-      <w:r>
-        <w:t xml:space="preserve"> Debajo del Gráfico Analítico o junto a los filtros de tiempo, se incluirá un botón dual de "Exportar (Excel) / Imprimir".</w:t>
-      </w:r>
-    </w:p>
-    <w:p>
-      <w:pPr>
-        <w:numPr>
-          <w:ilvl w:val="1"/>
-          <w:numId w:val="9"/>
-        </w:numPr>
-      </w:pPr>
-      <w:r>
-        <w:t>Comportamiento:</w:t>
-      </w:r>
-      <w:r>
-        <w:t xml:space="preserve"> Al hacer clic, el sistema compilará únicamente los </w:t>
-      </w:r>
-      <w:r>
-        <w:t>movimientos de salida (gastos)</w:t>
-      </w:r>
-      <w:r>
-        <w:t xml:space="preserve"> correspondientes al filtro temporal activo en ese momento (Diario, Semanal, Mensual o Anual).</w:t>
-      </w:r>
-    </w:p>
-    <w:p>
-      <w:r>
-        <w:rPr>
-          <w:b/>
-          <w:bCs/>
-        </w:rPr>
-        <w:t>B. Nuevo Registro (Ingresos y Egresos)</w:t>
-      </w:r>
-    </w:p>
-    <w:p>
-      <w:pPr>
-        <w:numPr>
-          <w:ilvl w:val="0"/>
-          <w:numId w:val="10"/>
-        </w:numPr>
-      </w:pPr>
-      <w:r>
-        <w:rPr>
-          <w:b/>
-          <w:bCs/>
-        </w:rPr>
-        <w:t>Selector Superior:</w:t>
-      </w:r>
-      <w:r>
-        <w:t xml:space="preserve"> Botón tipo "Toggle" o pestañas redondeadas para elegir entre "Ingreso" o "Egreso". Todo movimiento guarda automáticamente la Fecha y Hora exactas de la carga.</w:t>
-      </w:r>
-    </w:p>
-    <w:p>
-      <w:pPr>
-        <w:numPr>
-          <w:ilvl w:val="0"/>
-          <w:numId w:val="10"/>
-        </w:numPr>
-      </w:pPr>
-      <w:r>
-        <w:rPr>
-          <w:b/>
-          <w:bCs/>
-        </w:rPr>
-        <w:t>Flujo de Ingreso:</w:t>
-      </w:r>
-      <w:r>
-        <w:t xml:space="preserve"> * Campos: Descripción (Texto), Monto (Numérico, sin puntuación), Asignación (Desplegable de los 8 establecimientos).</w:t>
-      </w:r>
-    </w:p>
-    <w:p>
-      <w:pPr>
-        <w:numPr>
-          <w:ilvl w:val="1"/>
-          <w:numId w:val="10"/>
-        </w:numPr>
-      </w:pPr>
-      <w:r>
-        <w:t>Acción: Botón "Registrar". Limpia campos tras el éxito. Valida que no haya campos vacíos.</w:t>
-      </w:r>
-    </w:p>
-    <w:p>
-      <w:pPr>
-        <w:numPr>
-          <w:ilvl w:val="0"/>
-          <w:numId w:val="10"/>
-        </w:numPr>
-      </w:pPr>
-      <w:r>
-        <w:rPr>
-          <w:b/>
-          <w:bCs/>
-        </w:rPr>
-        <w:t>Flujo de Egreso (3 Métodos):</w:t>
-      </w:r>
-    </w:p>
-    <w:p>
-      <w:pPr>
-        <w:numPr>
-          <w:ilvl w:val="1"/>
-          <w:numId w:val="11"/>
-        </w:numPr>
-      </w:pPr>
-      <w:r>
-        <w:rPr>
-          <w:i/>
-          <w:iCs/>
-        </w:rPr>
-        <w:t>Importar PDF.</w:t>
-      </w:r>
-    </w:p>
-    <w:p>
-      <w:pPr>
-        <w:numPr>
-          <w:ilvl w:val="1"/>
-          <w:numId w:val="11"/>
-        </w:numPr>
-      </w:pPr>
-      <w:r>
-        <w:rPr>
-          <w:i/>
-          <w:iCs/>
-        </w:rPr>
-        <w:t>Importar/Tomar Foto (PNG).</w:t>
-      </w:r>
-    </w:p>
-    <w:p>
-      <w:pPr>
-        <w:numPr>
-          <w:ilvl w:val="1"/>
-          <w:numId w:val="11"/>
-        </w:numPr>
-      </w:pPr>
-      <w:r>
-        <w:rPr>
-          <w:i/>
-          <w:iCs/>
-        </w:rPr>
-        <w:t>Registro Manual.</w:t>
-      </w:r>
-    </w:p>
-    <w:p>
-      <w:pPr>
-        <w:numPr>
-          <w:ilvl w:val="0"/>
-          <w:numId w:val="10"/>
-        </w:numPr>
-      </w:pPr>
-      <w:r>
-        <w:rPr>
-          <w:b/>
-          <w:bCs/>
-        </w:rPr>
-        <w:lastRenderedPageBreak/>
-        <w:t>Motor de Extracción Automática (OCR):</w:t>
-      </w:r>
-      <w:r>
-        <w:t xml:space="preserve"> Para los métodos 1 y 2, el sistema debe extraer automáticamente los datos para evitar por completo la carga manual por parte del usuario. </w:t>
-      </w:r>
-      <w:proofErr w:type="gramStart"/>
-      <w:r>
-        <w:t>Los campos a extraer</w:t>
-      </w:r>
-      <w:proofErr w:type="gramEnd"/>
-      <w:r>
-        <w:t>/llenar son:</w:t>
-      </w:r>
-    </w:p>
-    <w:p>
-      <w:pPr>
-        <w:numPr>
-          <w:ilvl w:val="1"/>
-          <w:numId w:val="10"/>
-        </w:numPr>
-      </w:pPr>
-      <w:r>
-        <w:t xml:space="preserve">Tipo de Comprobante (A, B, C o </w:t>
-      </w:r>
-      <w:proofErr w:type="gramStart"/>
-      <w:r>
-        <w:t>Ticket</w:t>
-      </w:r>
-      <w:proofErr w:type="gramEnd"/>
-      <w:r>
-        <w:t>).</w:t>
-      </w:r>
-    </w:p>
-    <w:p>
-      <w:pPr>
-        <w:numPr>
-          <w:ilvl w:val="1"/>
-          <w:numId w:val="10"/>
-        </w:numPr>
-      </w:pPr>
-      <w:r>
-        <w:t>Nº de Factura, Fecha, Descripción, Monto Total, Subtotal.</w:t>
-      </w:r>
-    </w:p>
-    <w:p>
-      <w:pPr>
-        <w:numPr>
-          <w:ilvl w:val="1"/>
-          <w:numId w:val="10"/>
-        </w:numPr>
-      </w:pPr>
-      <w:r>
-        <w:t>IVA (21%, 10.5%, 27%, No Gravado. Capacidad para registrar 2 IVAs simultáneos).</w:t>
-      </w:r>
-    </w:p>
-    <w:p>
-      <w:pPr>
-        <w:numPr>
-          <w:ilvl w:val="1"/>
-          <w:numId w:val="10"/>
-        </w:numPr>
-      </w:pPr>
-      <w:r>
-        <w:rPr>
-          <w:i/>
-          <w:iCs/>
-        </w:rPr>
-        <w:t>Inputs manuales requeridos:</w:t>
-      </w:r>
-      <w:r>
-        <w:t xml:space="preserve"> Forma de pago (Efectivo/Tarjeta) y Establecimiento destino</w:t>
-      </w:r>
-      <w:r>
-        <w:t xml:space="preserve"> a través de una lista desplegable</w:t>
-      </w:r>
-      <w:r>
-        <w:t>.</w:t>
-      </w:r>
-    </w:p>
-    <w:p>
-      <w:pPr>
-        <w:numPr>
-          <w:ilvl w:val="1"/>
-          <w:numId w:val="10"/>
-        </w:numPr>
-      </w:pPr>
-      <w:r>
-        <w:rPr>
-          <w:i/>
-          <w:iCs/>
-        </w:rPr>
-        <w:t>Nota:</w:t>
-      </w:r>
-      <w:r>
-        <w:t xml:space="preserve"> Todos los datos auto-extraídos deben ser editables por el usuario para corregir errores de lectura del OCR.</w:t>
-      </w:r>
-    </w:p>
-    <w:p>
-      <w:pPr>
-        <w:numPr>
-          <w:ilvl w:val="0"/>
-          <w:numId w:val="10"/>
-        </w:numPr>
-      </w:pPr>
-      <w:r>
-        <w:rPr>
-          <w:b/>
-          <w:bCs/>
-        </w:rPr>
-        <w:t>Validación Final:</w:t>
-      </w:r>
-      <w:r>
-        <w:t xml:space="preserve"> Botón "Registrar". Confirma la carga exitosa, limpia los campos y bloquea el envío si faltan datos.</w:t>
-      </w:r>
-    </w:p>
-    <w:p>
-      <w:r>
-        <w:rPr>
-          <w:b/>
-          <w:bCs/>
-        </w:rPr>
-        <w:t>C. Historial</w:t>
-      </w:r>
-    </w:p>
-    <w:p>
-      <w:pPr>
-        <w:numPr>
-          <w:ilvl w:val="0"/>
-          <w:numId w:val="12"/>
-        </w:numPr>
-      </w:pPr>
-      <w:r>
-        <w:rPr>
-          <w:b/>
-          <w:bCs/>
-        </w:rPr>
-        <w:t>Filtros:</w:t>
-      </w:r>
-      <w:r>
-        <w:t xml:space="preserve"> Día, Semana, Mes.</w:t>
-      </w:r>
-    </w:p>
-    <w:p>
-      <w:pPr>
-        <w:numPr>
-          <w:ilvl w:val="0"/>
-          <w:numId w:val="12"/>
-        </w:numPr>
-      </w:pPr>
-      <w:r>
-        <w:rPr>
-          <w:b/>
-          <w:bCs/>
-        </w:rPr>
-        <w:t>Diseño de Lista:</w:t>
-      </w:r>
-      <w:r>
-        <w:t xml:space="preserve"> Tarjetas individuales con bordes redondeados.</w:t>
-      </w:r>
-    </w:p>
-    <w:p>
-      <w:pPr>
-        <w:numPr>
-          <w:ilvl w:val="0"/>
-          <w:numId w:val="12"/>
-        </w:numPr>
-      </w:pPr>
-      <w:r>
-        <w:rPr>
-          <w:b/>
-          <w:bCs/>
-        </w:rPr>
-        <w:t>Datos por Tarjeta:</w:t>
-      </w:r>
-      <w:r>
-        <w:t xml:space="preserve"> Descripción, Monto, Fecha de carga, Método (Efectivo/Tarjeta).</w:t>
-      </w:r>
-    </w:p>
-    <w:p>
-      <w:pPr>
-        <w:numPr>
-          <w:ilvl w:val="0"/>
-          <w:numId w:val="12"/>
-        </w:numPr>
-      </w:pPr>
-      <w:r>
-        <w:rPr>
-          <w:b/>
-          <w:bCs/>
-        </w:rPr>
-        <w:t>Acción Rápida:</w:t>
-      </w:r>
-      <w:r>
-        <w:t xml:space="preserve"> Botón "Nuevo" en la esquina superior derecha que redirige a la vista "Nuevo Registro".</w:t>
-      </w:r>
-    </w:p>
-    <w:p>
-      <w:pPr>
-        <w:pStyle w:val="NormalWeb"/>
-        <w:numPr>
-          <w:ilvl w:val="0"/>
-          <w:numId w:val="12"/>
-        </w:numPr>
-      </w:pPr>
-      <w:r>
-        <w:rPr>
-          <w:b/>
-          <w:bCs/>
-        </w:rPr>
-        <w:t>Nueva Función:</w:t>
-      </w:r>
-      <w:r>
-        <w:t xml:space="preserve"> Reporte General.</w:t>
-      </w:r>
-      <w:r>
-        <w:t xml:space="preserve"> En la parte superior de la vista de Historial, junto al botón de "Nuevo", se agregará un botón de "Exportar (Excel) / Imprimir Reporte".</w:t>
-      </w:r>
-    </w:p>
-    <w:p>
-      <w:pPr>
-        <w:pStyle w:val="NormalWeb"/>
-        <w:numPr>
-          <w:ilvl w:val="0"/>
-          <w:numId w:val="20"/>
-        </w:numPr>
-      </w:pPr>
-      <w:r>
-        <w:t>Comportamiento:</w:t>
-      </w:r>
-      <w:r>
-        <w:t xml:space="preserve"> Esto descargará el listado completo de los movimientos en pantalla, incluyendo </w:t>
-      </w:r>
-      <w:r>
-        <w:t>tanto Ingresos como Egresos</w:t>
-      </w:r>
-      <w:r>
-        <w:t>, filtrados por el rango de tiempo seleccionado (Diario a Anual).</w:t>
-      </w:r>
-    </w:p>
-    <w:p>
-      <w:pPr>
-        <w:ind w:left="720"/>
-      </w:pPr>
-    </w:p>
-    <w:p>
-      <w:r>
-        <w:rPr>
-          <w:b/>
-          <w:bCs/>
-        </w:rPr>
-        <w:t>D. Perfil</w:t>
-      </w:r>
-    </w:p>
-    <w:p>
-      <w:pPr>
-        <w:numPr>
-          <w:ilvl w:val="0"/>
-          <w:numId w:val="13"/>
-        </w:numPr>
-      </w:pPr>
-      <w:r>
-        <w:rPr>
-          <w:b/>
-          <w:bCs/>
-        </w:rPr>
-        <w:t>Visualización:</w:t>
-      </w:r>
-      <w:r>
-        <w:t xml:space="preserve"> Datos cargados en el registro inicial.</w:t>
-      </w:r>
-    </w:p>
-    <w:p>
-      <w:pPr>
-        <w:numPr>
-          <w:ilvl w:val="0"/>
-          <w:numId w:val="13"/>
-        </w:numPr>
-      </w:pPr>
-      <w:r>
-        <w:rPr>
-          <w:b/>
-          <w:bCs/>
-        </w:rPr>
-        <w:t>Edición:</w:t>
-      </w:r>
-      <w:r>
-        <w:t xml:space="preserve"> Permite agregar Número Telefónico, Establecimiento a cargo y un campo de texto libre para "Comentarios".</w:t>
-      </w:r>
-    </w:p>
-    <w:p>
-      <w:pPr>
-        <w:rPr>
-          <w:b/>
-          <w:bCs/>
-        </w:rPr>
-      </w:pPr>
-      <w:r>
-        <w:rPr>
-          <w:b/>
-          <w:bCs/>
-        </w:rPr>
-        <w:t>3. Requisitos Administrativos y de Arquitectura</w:t>
-      </w:r>
-    </w:p>
-    <w:p>
-      <w:pPr>
-        <w:numPr>
-          <w:ilvl w:val="0"/>
-          <w:numId w:val="14"/>
-        </w:numPr>
-      </w:pPr>
-      <w:r>
-        <w:rPr>
-          <w:b/>
-          <w:bCs/>
-        </w:rPr>
-        <w:lastRenderedPageBreak/>
-        <w:t>Entorno de Pruebas:</w:t>
-      </w:r>
-      <w:r>
-        <w:t xml:space="preserve"> El diseño debe renderizarse primero en una versión Web responsiva para que el cliente apruebe la UI y pruebe las funciones antes del empaquetado móvil.</w:t>
-      </w:r>
-    </w:p>
-    <w:p>
-      <w:pPr>
-        <w:numPr>
-          <w:ilvl w:val="0"/>
-          <w:numId w:val="14"/>
-        </w:numPr>
-      </w:pPr>
-      <w:r>
-        <w:rPr>
-          <w:b/>
-          <w:bCs/>
-        </w:rPr>
-        <w:t>Panel de Administrador:</w:t>
-      </w:r>
-      <w:r>
-        <w:t xml:space="preserve"> El rol de administrador debe tener permisos globales para navegar, visualizar y auditar los registros y movimientos de cualquier usuario del sistema.</w:t>
-      </w:r>
-    </w:p>
-    <w:p>
-      <w:pPr>
-        <w:numPr>
-          <w:ilvl w:val="0"/>
-          <w:numId w:val="14"/>
-        </w:numPr>
-      </w:pPr>
-      <w:r>
-        <w:rPr>
-          <w:b/>
-          <w:bCs/>
-        </w:rPr>
-        <w:t>Grabación de Prueba:</w:t>
-      </w:r>
-      <w:r>
-        <w:t xml:space="preserve"> No realizar la grabación de prueba o visualización.</w:t>
-      </w:r>
-    </w:p>
-    <w:p>
-      <w:pPr>
-        <w:rPr>
-          <w:b/>
-          <w:bCs/>
-        </w:rPr>
-      </w:pPr>
-      <w:r>
-        <w:rPr>
-          <w:b/>
-          <w:bCs/>
-        </w:rPr>
-        <w:t>Definiciones Técnicas Finales</w:t>
-      </w:r>
-    </w:p>
-    <w:p>
-      <w:r>
-        <w:rPr>
-          <w:b/>
-          <w:bCs/>
-        </w:rPr>
-        <w:t>1. Motor de Extracción (OCR) Recomendado</w:t>
-      </w:r>
-      <w:r>
-        <w:t xml:space="preserve"> Para lidiar con la complejidad y variabilidad de las facturas argentinas (A, B, C y </w:t>
-      </w:r>
-      <w:proofErr w:type="gramStart"/>
-      <w:r>
-        <w:t>tickets</w:t>
-      </w:r>
-      <w:proofErr w:type="gramEnd"/>
-      <w:r>
-        <w:t xml:space="preserve">), la mejor opción actual en el mercado es utilizar </w:t>
-      </w:r>
-      <w:r>
-        <w:rPr>
-          <w:b/>
-          <w:bCs/>
-        </w:rPr>
-        <w:t>Google Cloud Document AI</w:t>
-      </w:r>
-      <w:r>
-        <w:t xml:space="preserve"> o </w:t>
-      </w:r>
-      <w:r>
-        <w:rPr>
-          <w:b/>
-          <w:bCs/>
-        </w:rPr>
-        <w:t>AWS Textract</w:t>
-      </w:r>
-      <w:r>
-        <w:t>.</w:t>
-      </w:r>
-    </w:p>
-    <w:p>
-      <w:pPr>
-        <w:numPr>
-          <w:ilvl w:val="0"/>
-          <w:numId w:val="15"/>
-        </w:numPr>
-      </w:pPr>
-      <w:r>
-        <w:rPr>
-          <w:b/>
-          <w:bCs/>
-        </w:rPr>
-        <w:t>¿Por qué?</w:t>
-      </w:r>
-      <w:r>
-        <w:t xml:space="preserve"> A diferencia de un OCR tradicional que solo lee texto suelto, estas son herramientas de Inteligencia Artificial entrenadas específicamente para "entender" facturas. Buscan automáticamente pares de datos (ejemplo: encuentran la palabra "Total" o "IVA" y capturan el número que está al lado, sin importar el formato de la imprenta).</w:t>
-      </w:r>
-    </w:p>
-    <w:p>
-      <w:r>
-        <w:rPr>
-          <w:b/>
-          <w:bCs/>
-        </w:rPr>
-        <w:t>2. Experiencia de Carga (UI/UX) y Procesamiento</w:t>
-      </w:r>
-      <w:r>
-        <w:t xml:space="preserve"> El procesamiento de imágenes y lectura de PDFs tomará unos segundos. Para manejar esto, el escaneo se ejecutará en un proceso en segundo plano (background thread). En la interfaz se mostrará un indicador de carga animado (un </w:t>
-      </w:r>
-      <w:r>
-        <w:rPr>
-          <w:i/>
-          <w:iCs/>
-        </w:rPr>
-        <w:t>spinner</w:t>
-      </w:r>
-      <w:r>
-        <w:t xml:space="preserve"> o barra de progreso) acompañado de un texto como </w:t>
-      </w:r>
-      <w:r>
-        <w:rPr>
-          <w:i/>
-          <w:iCs/>
-        </w:rPr>
-        <w:t>"Analizando comprobante..."</w:t>
-      </w:r>
-      <w:r>
-        <w:t>. Esto asegurará que la interfaz siga respondiendo a las interacciones del sistema y evitará por completo que la pantalla colapse o se quede congelada de forma permanente esperando el resultado. Además, se incluirá un límite de tiempo (timeout): si el archivo es ilegible o el servicio tarda demasiado, el proceso se interrumpirá mostrando un mensaje de error amigable para que el usuario pueda hacer la carga manual, asegurando que la aplicación nunca quede tildada.</w:t>
-      </w:r>
-    </w:p>
-    <w:p>
-      <w:r>
-        <w:rPr>
-          <w:b/>
-          <w:bCs/>
-        </w:rPr>
-        <w:t>3. Sistema de Roles y Base de Datos</w:t>
-      </w:r>
-      <w:r>
-        <w:t xml:space="preserve"> Se implementará un sistema de permisos basado en atributos en la base de datos central. Cada cuenta creada tendrá un campo oculto (por ejemplo: rol: "usuario" o rol: "administrador"). Al iniciar sesión con tu cuenta de administrador, la aplicación leerá este permiso y desbloqueará dinámicamente una vista especial en el Dashboard que te permitirá desplegar una lista de todos los usuarios, entrar a sus perfiles y auditar o editar sus movimientos.</w:t>
-      </w:r>
-    </w:p>
-    <w:p>
-      <w:r>
-        <w:rPr>
-          <w:b/>
-          <w:bCs/>
-        </w:rPr>
-        <w:t>4. Política de Retención de Archivos</w:t>
-      </w:r>
-      <w:r>
-        <w:t xml:space="preserve"> Para optimizar costos de servidor y liberar espacio, se programará una tarea automatizada (conocida como </w:t>
-      </w:r>
-      <w:r>
-        <w:rPr>
-          <w:i/>
-          <w:iCs/>
-        </w:rPr>
-        <w:t>Cron Job</w:t>
-      </w:r>
-      <w:r>
-        <w:t xml:space="preserve">) en el servidor (backend). Este proceso se ejecutará de forma silenciosa todos los días a la madrugada. Su función será escanear el almacenamiento en la nube, identificar </w:t>
-      </w:r>
-      <w:r>
-        <w:lastRenderedPageBreak/>
-        <w:t>todas las imágenes y PDFs cuya fecha de subida sea mayor a 60 días (2 meses) y eliminarlos permanentemente. Los datos de texto del gasto (monto, fecha, descripción) permanecerán intactos en el historial.</w:t>
-      </w:r>
-    </w:p>
-    <w:p>
-      <w:r>
-        <w:rPr>
-          <w:b/>
-          <w:bCs/>
-        </w:rPr>
-        <w:t>5. Arquitectura "Offline-First" (Sin Conexión)</w:t>
-      </w:r>
-      <w:r>
-        <w:t xml:space="preserve"> Dado que los establecimientos tienen nula o baja conectividad, la aplicación se programará bajo una arquitectura "Primero Fuera de Línea".</w:t>
-      </w:r>
-    </w:p>
-    <w:p>
-      <w:pPr>
-        <w:numPr>
-          <w:ilvl w:val="0"/>
-          <w:numId w:val="16"/>
-        </w:numPr>
-      </w:pPr>
-      <w:r>
-        <w:rPr>
-          <w:b/>
-          <w:bCs/>
-        </w:rPr>
-        <w:t>Funcionamiento:</w:t>
-      </w:r>
-      <w:r>
-        <w:t xml:space="preserve"> La </w:t>
-      </w:r>
-      <w:proofErr w:type="gramStart"/>
-      <w:r>
-        <w:t>app</w:t>
-      </w:r>
-      <w:proofErr w:type="gramEnd"/>
-      <w:r>
-        <w:t xml:space="preserve"> tendrá una base de datos local (dentro del mismo teléfono). Cuando un usuario registre un gasto en "El Moro", la </w:t>
-      </w:r>
-      <w:proofErr w:type="gramStart"/>
-      <w:r>
-        <w:t>app</w:t>
-      </w:r>
-      <w:proofErr w:type="gramEnd"/>
-      <w:r>
-        <w:t xml:space="preserve"> lo guardará instantáneamente en el teléfono con un estado de </w:t>
-      </w:r>
-      <w:r>
-        <w:rPr>
-          <w:i/>
-          <w:iCs/>
-        </w:rPr>
-        <w:t>"Pendiente de sincronización"</w:t>
-      </w:r>
-      <w:r>
-        <w:t>, permitiendo al usuario seguir trabajando sin interrupciones ni errores de conexión.</w:t>
-      </w:r>
-    </w:p>
-    <w:p>
-      <w:pPr>
-        <w:numPr>
-          <w:ilvl w:val="0"/>
-          <w:numId w:val="16"/>
-        </w:numPr>
-      </w:pPr>
-      <w:r>
-        <w:rPr>
-          <w:b/>
-          <w:bCs/>
-        </w:rPr>
-        <w:t>Sincronización Automática:</w:t>
-      </w:r>
-      <w:r>
-        <w:t xml:space="preserve"> Un servicio en segundo plano monitoreará constantemente el estado de la red. En el momento en que el teléfono detecte señal de internet (3G/4G o Wi-Fi), la aplicación enviará automáticamente los registros pendientes a la base de datos principal en la nube.</w:t>
-      </w:r>
-    </w:p>
-    <w:p>
-      <w:pPr>
-        <w:pStyle w:val="Prrafodelista"/>
-        <w:numPr>
-          <w:ilvl w:val="0"/>
-          <w:numId w:val="7"/>
-        </w:numPr>
-      </w:pPr>
-      <w:r>
-        <w:rPr>
-          <w:b/>
-          <w:bCs/>
-        </w:rPr>
-        <w:t xml:space="preserve">Impresión o exportación a Excel: </w:t>
-      </w:r>
-      <w:r>
-        <w:t>Para que esta función sea realmente útil, el Excel resultante se estructurará como una base de datos limpia (con columnas separadas para fechas, montos, establecimientos y categorías). Esta estructura tabular ordenada es ideal para que los datos queden listos por si más adelante querés aplicarles macros o cruzar información rápidamente sin tener que andar acomodando celdas a mano.</w:t>
-      </w:r>
-    </w:p>
-    <w:p>
-      <w:pPr>
-        <w:pStyle w:val="Prrafodelista"/>
-      </w:pPr>
-      <w:r>
-        <w:t xml:space="preserve">Además, compilar meses o años enteros de historial en un archivo puede tomar un par de segundos. Para evitar el problema de que la pantalla de carga quede tildada o el usuario piense que la </w:t>
-      </w:r>
-      <w:proofErr w:type="gramStart"/>
-      <w:r>
-        <w:t>app</w:t>
-      </w:r>
-      <w:proofErr w:type="gramEnd"/>
-      <w:r>
-        <w:t xml:space="preserve"> se trabó, esta acción mostrará un indicador de "Generando archivo..." claro y animado, manteniendo la interfaz fluida en todo momento.</w:t>
-      </w:r>
-    </w:p>
-    <w:p>
-      <w:pPr>
-        <w:pStyle w:val="Prrafodelista"/>
-      </w:pPr>
-    </w:p>
-    <w:p>
-      <w:pPr>
-        <w:pStyle w:val="Prrafodelista"/>
-        <w:rPr>
-          <w:b/>
-          <w:bCs/>
-        </w:rPr>
-      </w:pPr>
-      <w:r>
-        <w:rPr>
-          <w:b/>
-          <w:bCs/>
-        </w:rPr>
-        <w:t>Actualizaciones Finales al Documento de Diseño</w:t>
-      </w:r>
-    </w:p>
-    <w:p>
-      <w:pPr>
-        <w:pStyle w:val="Prrafodelista"/>
-      </w:pPr>
-      <w:r>
-        <w:rPr>
-          <w:b/>
-          <w:bCs/>
-        </w:rPr>
-        <w:t>1. Formato de Exportación a Excel (Diseño Híbrido)</w:t>
-      </w:r>
-    </w:p>
-    <w:p>
-      <w:pPr>
-        <w:pStyle w:val="Prrafodelista"/>
-        <w:numPr>
-          <w:ilvl w:val="0"/>
-          <w:numId w:val="21"/>
-        </w:numPr>
-      </w:pPr>
-      <w:r>
-        <w:t>Al seleccionar la opción "Exportar (Excel)", el sistema generará un archivo .xlsx estructurado en dos solapas (hojas) para satisfacer ambas necesidades:</w:t>
-      </w:r>
-    </w:p>
-    <w:p>
-      <w:pPr>
-        <w:pStyle w:val="Prrafodelista"/>
-        <w:numPr>
-          <w:ilvl w:val="1"/>
-          <w:numId w:val="21"/>
-        </w:numPr>
-      </w:pPr>
-      <w:r>
-        <w:rPr>
-          <w:b/>
-          <w:bCs/>
-        </w:rPr>
-        <w:t>Hoja 1 - Reporte Ejecutivo:</w:t>
-      </w:r>
-      <w:r>
-        <w:t xml:space="preserve"> Contendrá un diseño visual atractivo con el logo de "Agropecuaria Las Marias", los colores corporativos (Naranja y Amarillo), la fecha de emisión, el rango del filtro aplicado y los totales sumariados al final de la tabla.</w:t>
-      </w:r>
-    </w:p>
-    <w:p>
-      <w:pPr>
-        <w:pStyle w:val="Prrafodelista"/>
-        <w:numPr>
-          <w:ilvl w:val="1"/>
-          <w:numId w:val="21"/>
-        </w:numPr>
-      </w:pPr>
-      <w:r>
-        <w:rPr>
-          <w:b/>
-          <w:bCs/>
-        </w:rPr>
-        <w:t>Hoja 2 - Base de Datos Plana:</w:t>
-      </w:r>
-      <w:r>
-        <w:t xml:space="preserve"> Contendrá los mismos </w:t>
-      </w:r>
-      <w:proofErr w:type="gramStart"/>
-      <w:r>
-        <w:t>datos</w:t>
-      </w:r>
-      <w:proofErr w:type="gramEnd"/>
-      <w:r>
-        <w:t xml:space="preserve"> pero en un formato de tabla cruda (sin estilos visuales complejos ni celdas </w:t>
-      </w:r>
-      <w:r>
-        <w:lastRenderedPageBreak/>
-        <w:t>combinadas), lista para ser importada a otros sistemas, utilizar macros o facilitar el trabajo contable.</w:t>
-      </w:r>
-    </w:p>
-    <w:p>
-      <w:pPr>
-        <w:pStyle w:val="Prrafodelista"/>
-      </w:pPr>
-      <w:r>
-        <w:rPr>
-          <w:b/>
-          <w:bCs/>
-        </w:rPr>
-        <w:t>2. Formato de Impresión (PDF A4)</w:t>
-      </w:r>
-    </w:p>
-    <w:p>
-      <w:pPr>
-        <w:pStyle w:val="Prrafodelista"/>
-        <w:numPr>
-          <w:ilvl w:val="0"/>
-          <w:numId w:val="22"/>
-        </w:numPr>
-      </w:pPr>
-      <w:r>
-        <w:t xml:space="preserve">Al presionar el botón "Imprimir", la aplicación no dependerá del Excel. En su lugar, generará automáticamente un documento </w:t>
-      </w:r>
-      <w:r>
-        <w:rPr>
-          <w:b/>
-          <w:bCs/>
-        </w:rPr>
-        <w:t>PDF maquetado específicamente para tamaño de hoja A4</w:t>
-      </w:r>
-      <w:r>
-        <w:t>.</w:t>
-      </w:r>
-    </w:p>
-    <w:p>
-      <w:pPr>
-        <w:pStyle w:val="Prrafodelista"/>
-        <w:numPr>
-          <w:ilvl w:val="0"/>
-          <w:numId w:val="22"/>
-        </w:numPr>
-      </w:pPr>
-      <w:r>
-        <w:t>Este PDF incluirá el membrete de la empresa, el detalle de los movimientos (Ingresos/Egresos según el filtro) y estará optimizado en blanco, negro y escala de grises para no gastar tinta innecesariamente, manteniendo detalles sutiles en los colores corporativos.</w:t>
-      </w:r>
-    </w:p>
-    <w:p>
-      <w:pPr>
-        <w:pStyle w:val="Prrafodelista"/>
-      </w:pPr>
-      <w:r>
-        <w:rPr>
-          <w:b/>
-          <w:bCs/>
-        </w:rPr>
-        <w:t>3. Permisos de Exportación e Impresión</w:t>
-      </w:r>
-    </w:p>
-    <w:p>
-      <w:pPr>
-        <w:pStyle w:val="Prrafodelista"/>
-        <w:numPr>
-          <w:ilvl w:val="0"/>
-          <w:numId w:val="23"/>
-        </w:numPr>
-      </w:pPr>
-      <w:r>
-        <w:rPr>
-          <w:b/>
-          <w:bCs/>
-        </w:rPr>
-        <w:t>Acceso Universal:</w:t>
-      </w:r>
-      <w:r>
-        <w:t xml:space="preserve"> La función de exportar a Excel y generar el PDF de impresión estará habilitada para todos los usuarios.</w:t>
-      </w:r>
-    </w:p>
-    <w:p>
-      <w:pPr>
-        <w:pStyle w:val="Prrafodelista"/>
-        <w:numPr>
-          <w:ilvl w:val="0"/>
-          <w:numId w:val="23"/>
-        </w:numPr>
-      </w:pPr>
-      <w:r>
-        <w:rPr>
-          <w:b/>
-          <w:bCs/>
-        </w:rPr>
-        <w:t>Lógica de Datos:</w:t>
-      </w:r>
-      <w:r>
-        <w:t xml:space="preserve"> Los empleados estándar solo podrán generar reportes y descargar la información correspondiente a </w:t>
-      </w:r>
-      <w:r>
-        <w:rPr>
-          <w:i/>
-          <w:iCs/>
-        </w:rPr>
-        <w:t>sus propios</w:t>
-      </w:r>
-      <w:r>
-        <w:t xml:space="preserve"> movimientos cargados. El usuario Administrador, desde su vista global, podrá generar reportes que incluyan los movimientos de todos los empleados y establecimientos.</w:t>
-      </w:r>
-    </w:p>
-    <w:p>
-      <w:pPr>
-        <w:pStyle w:val="Prrafodelista"/>
-      </w:pPr>
-      <w:r>
-        <w:rPr>
-          <w:b/>
-          <w:bCs/>
-        </w:rPr>
-        <w:t>4. Nota Técnica de Rendimiento (Prevención de Cuelgues)</w:t>
-      </w:r>
-    </w:p>
-    <w:p>
-      <w:pPr>
-        <w:pStyle w:val="Prrafodelista"/>
-        <w:numPr>
-          <w:ilvl w:val="0"/>
-          <w:numId w:val="24"/>
-        </w:numPr>
-      </w:pPr>
-      <w:r>
-        <w:t>Tanto la generación de reportes (Excel/PDF) como la extracción automática de datos (OCR) de facturas son procesos pesados. Para asegurar el rendimiento óptimo, estas tareas se ejecutarán de forma asíncrona.</w:t>
-      </w:r>
-    </w:p>
-    <w:p>
-      <w:pPr>
-        <w:pStyle w:val="Prrafodelista"/>
-        <w:numPr>
-          <w:ilvl w:val="0"/>
-          <w:numId w:val="24"/>
-        </w:numPr>
-      </w:pPr>
-      <w:r>
-        <w:t xml:space="preserve">Esto garantiza que la pantalla de carga se mantenga siempre fluida con su respectivo símbolo animado, </w:t>
-      </w:r>
-      <w:r>
-        <w:rPr>
-          <w:b/>
-          <w:bCs/>
-        </w:rPr>
-        <w:t>solucionando y previniendo definitivamente que la pantalla quede tildada o congelada</w:t>
-      </w:r>
-      <w:r>
-        <w:t xml:space="preserve"> mientras el sistema procesa la información</w:t>
-      </w:r>
-    </w:p>
-    <w:p>
-      <w:pPr>
-        <w:pStyle w:val="Prrafodelista"/>
-      </w:pPr>
+        <w:drawing>
+          <wp:inline distT="0" distB="0" distL="0" distR="0" wp14:anchorId="21994BD0" wp14:editId="40801CC0">
+            <wp:extent cx="1780437" cy="3956400"/>
+            <wp:effectExtent l="0" t="0" r="0" b="6350"/>
+            <wp:docPr id="442810455" name="Imagen 14"/>
+            <wp:cNvGraphicFramePr>
+              <a:graphicFrameLocks xmlns:a="http://schemas.openxmlformats.org/drawingml/2006/main" noChangeAspect="1"/>
+            </wp:cNvGraphicFramePr>
+            <a:graphic xmlns:a="http://schemas.openxmlformats.org/drawingml/2006/main">
+              <a:graphicData uri="http://schemas.openxmlformats.org/drawingml/2006/picture">
+                <pic:pic xmlns:pic="http://schemas.openxmlformats.org/drawingml/2006/picture">
+                  <pic:nvPicPr>
+                    <pic:cNvPr id="442810455" name="Imagen 442810455"/>
+                    <pic:cNvPicPr/>
+                  </pic:nvPicPr>
+                  <pic:blipFill>
+                    <a:blip r:embed="rId14" cstate="print">
+                      <a:extLst>
+                        <a:ext uri="{28A0092B-C50C-407E-A947-70E740481C1C}">
+                          <a14:useLocalDpi xmlns:a14="http://schemas.microsoft.com/office/drawing/2010/main" val="0"/>
+                        </a:ext>
+                      </a:extLst>
+                    </a:blip>
+                    <a:stretch>
+                      <a:fillRect/>
+                    </a:stretch>
+                  </pic:blipFill>
+                  <pic:spPr>
+                    <a:xfrm>
+                      <a:off x="0" y="0"/>
+                      <a:ext cx="1780437" cy="3956400"/>
+                    </a:xfrm>
+                    <a:prstGeom prst="rect">
+                      <a:avLst/>
+                    </a:prstGeom>
+                  </pic:spPr>
+                </pic:pic>
+              </a:graphicData>
+            </a:graphic>
+          </wp:inline>
+        </w:drawing>
+      </w:r>
+      <w:r>
+        <w:rPr>
+          <w:noProof/>
+        </w:rPr>
+        <w:drawing>
+          <wp:inline distT="0" distB="0" distL="0" distR="0" wp14:anchorId="744D16AD" wp14:editId="3B6F864D">
+            <wp:extent cx="1780437" cy="3956400"/>
+            <wp:effectExtent l="0" t="0" r="0" b="6350"/>
+            <wp:docPr id="1580528063" name="Imagen 13"/>
+            <wp:cNvGraphicFramePr>
+              <a:graphicFrameLocks xmlns:a="http://schemas.openxmlformats.org/drawingml/2006/main" noChangeAspect="1"/>
+            </wp:cNvGraphicFramePr>
+            <a:graphic xmlns:a="http://schemas.openxmlformats.org/drawingml/2006/main">
+              <a:graphicData uri="http://schemas.openxmlformats.org/drawingml/2006/picture">
+                <pic:pic xmlns:pic="http://schemas.openxmlformats.org/drawingml/2006/picture">
+                  <pic:nvPicPr>
+                    <pic:cNvPr id="1580528063" name="Imagen 1580528063"/>
+                    <pic:cNvPicPr/>
+                  </pic:nvPicPr>
+                  <pic:blipFill>
+                    <a:blip r:embed="rId15" cstate="print">
+                      <a:extLst>
+                        <a:ext uri="{28A0092B-C50C-407E-A947-70E740481C1C}">
+                          <a14:useLocalDpi xmlns:a14="http://schemas.microsoft.com/office/drawing/2010/main" val="0"/>
+                        </a:ext>
+                      </a:extLst>
+                    </a:blip>
+                    <a:stretch>
+                      <a:fillRect/>
+                    </a:stretch>
+                  </pic:blipFill>
+                  <pic:spPr>
+                    <a:xfrm>
+                      <a:off x="0" y="0"/>
+                      <a:ext cx="1780437" cy="3956400"/>
+                    </a:xfrm>
+                    <a:prstGeom prst="rect">
+                      <a:avLst/>
+                    </a:prstGeom>
+                  </pic:spPr>
+                </pic:pic>
+              </a:graphicData>
+            </a:graphic>
+          </wp:inline>
+        </w:drawing>
+      </w:r>
+      <w:r>
+        <w:rPr>
+          <w:noProof/>
+        </w:rPr>
+        <w:drawing>
+          <wp:inline distT="0" distB="0" distL="0" distR="0" wp14:anchorId="39A265A1" wp14:editId="09CDE8FA">
+            <wp:extent cx="1780437" cy="3956400"/>
+            <wp:effectExtent l="0" t="0" r="0" b="6350"/>
+            <wp:docPr id="5435406" name="Imagen 12"/>
+            <wp:cNvGraphicFramePr>
+              <a:graphicFrameLocks xmlns:a="http://schemas.openxmlformats.org/drawingml/2006/main" noChangeAspect="1"/>
+            </wp:cNvGraphicFramePr>
+            <a:graphic xmlns:a="http://schemas.openxmlformats.org/drawingml/2006/main">
+              <a:graphicData uri="http://schemas.openxmlformats.org/drawingml/2006/picture">
+                <pic:pic xmlns:pic="http://schemas.openxmlformats.org/drawingml/2006/picture">
+                  <pic:nvPicPr>
+                    <pic:cNvPr id="5435406" name="Imagen 5435406"/>
+                    <pic:cNvPicPr/>
+                  </pic:nvPicPr>
+                  <pic:blipFill>
+                    <a:blip r:embed="rId16" cstate="print">
+                      <a:extLst>
+                        <a:ext uri="{28A0092B-C50C-407E-A947-70E740481C1C}">
+                          <a14:useLocalDpi xmlns:a14="http://schemas.microsoft.com/office/drawing/2010/main" val="0"/>
+                        </a:ext>
+                      </a:extLst>
+                    </a:blip>
+                    <a:stretch>
+                      <a:fillRect/>
+                    </a:stretch>
+                  </pic:blipFill>
+                  <pic:spPr>
+                    <a:xfrm>
+                      <a:off x="0" y="0"/>
+                      <a:ext cx="1780437" cy="3956400"/>
+                    </a:xfrm>
+                    <a:prstGeom prst="rect">
+                      <a:avLst/>
+                    </a:prstGeom>
+                  </pic:spPr>
+                </pic:pic>
+              </a:graphicData>
+            </a:graphic>
+          </wp:inline>
+        </w:drawing>
+      </w:r>
+      <w:r>
+        <w:rPr>
+          <w:noProof/>
+        </w:rPr>
+        <w:drawing>
+          <wp:inline distT="0" distB="0" distL="0" distR="0" wp14:anchorId="08F1E66A" wp14:editId="214FB48A">
+            <wp:extent cx="1780437" cy="3956400"/>
+            <wp:effectExtent l="0" t="0" r="0" b="6350"/>
+            <wp:docPr id="1624631675" name="Imagen 11"/>
+            <wp:cNvGraphicFramePr>
+              <a:graphicFrameLocks xmlns:a="http://schemas.openxmlformats.org/drawingml/2006/main" noChangeAspect="1"/>
+            </wp:cNvGraphicFramePr>
+            <a:graphic xmlns:a="http://schemas.openxmlformats.org/drawingml/2006/main">
+              <a:graphicData uri="http://schemas.openxmlformats.org/drawingml/2006/picture">
+                <pic:pic xmlns:pic="http://schemas.openxmlformats.org/drawingml/2006/picture">
+                  <pic:nvPicPr>
+                    <pic:cNvPr id="1624631675" name="Imagen 1624631675"/>
+                    <pic:cNvPicPr/>
+                  </pic:nvPicPr>
+                  <pic:blipFill>
+                    <a:blip r:embed="rId17" cstate="print">
+                      <a:extLst>
+                        <a:ext uri="{28A0092B-C50C-407E-A947-70E740481C1C}">
+                          <a14:useLocalDpi xmlns:a14="http://schemas.microsoft.com/office/drawing/2010/main" val="0"/>
+                        </a:ext>
+                      </a:extLst>
+                    </a:blip>
+                    <a:stretch>
+                      <a:fillRect/>
+                    </a:stretch>
+                  </pic:blipFill>
+                  <pic:spPr>
+                    <a:xfrm>
+                      <a:off x="0" y="0"/>
+                      <a:ext cx="1780437" cy="3956400"/>
+                    </a:xfrm>
+                    <a:prstGeom prst="rect">
+                      <a:avLst/>
+                    </a:prstGeom>
+                  </pic:spPr>
+                </pic:pic>
+              </a:graphicData>
+            </a:graphic>
+          </wp:inline>
+        </w:drawing>
+      </w:r>
+      <w:r>
+        <w:rPr>
+          <w:noProof/>
+        </w:rPr>
+        <w:drawing>
+          <wp:inline distT="0" distB="0" distL="0" distR="0" wp14:anchorId="4375A1A4" wp14:editId="6F68C4B8">
+            <wp:extent cx="1780437" cy="3956400"/>
+            <wp:effectExtent l="0" t="0" r="0" b="6350"/>
+            <wp:docPr id="1177271268" name="Imagen 10"/>
+            <wp:cNvGraphicFramePr>
+              <a:graphicFrameLocks xmlns:a="http://schemas.openxmlformats.org/drawingml/2006/main" noChangeAspect="1"/>
+            </wp:cNvGraphicFramePr>
+            <a:graphic xmlns:a="http://schemas.openxmlformats.org/drawingml/2006/main">
+              <a:graphicData uri="http://schemas.openxmlformats.org/drawingml/2006/picture">
+                <pic:pic xmlns:pic="http://schemas.openxmlformats.org/drawingml/2006/picture">
+                  <pic:nvPicPr>
+                    <pic:cNvPr id="1177271268" name="Imagen 1177271268"/>
+                    <pic:cNvPicPr/>
+                  </pic:nvPicPr>
+                  <pic:blipFill>
+                    <a:blip r:embed="rId18" cstate="print">
+                      <a:extLst>
+                        <a:ext uri="{28A0092B-C50C-407E-A947-70E740481C1C}">
+                          <a14:useLocalDpi xmlns:a14="http://schemas.microsoft.com/office/drawing/2010/main" val="0"/>
+                        </a:ext>
+                      </a:extLst>
+                    </a:blip>
+                    <a:stretch>
+                      <a:fillRect/>
+                    </a:stretch>
+                  </pic:blipFill>
+                  <pic:spPr>
+                    <a:xfrm>
+                      <a:off x="0" y="0"/>
+                      <a:ext cx="1780437" cy="3956400"/>
+                    </a:xfrm>
+                    <a:prstGeom prst="rect">
+                      <a:avLst/>
+                    </a:prstGeom>
+                  </pic:spPr>
+                </pic:pic>
+              </a:graphicData>
+            </a:graphic>
+          </wp:inline>
+        </w:drawing>
+      </w:r>
     </w:p>
     <w:p>
       <w:pPr>
@@ -6370,6 +5595,7 @@
   <w:style w:type="character" w:default="1" w:styleId="Fuentedeprrafopredeter">
     <w:name w:val="Default Paragraph Font"/>
     <w:uiPriority w:val="1"/>
+    <w:semiHidden/>
     <w:unhideWhenUsed/>
   </w:style>
   <w:style w:type="table" w:default="1" w:styleId="Tablanormal">
@@ -6699,6 +5925,20 @@
       <w14:ligatures w14:val="none"/>
     </w:rPr>
   </w:style>
+  <w:style w:type="character" w:styleId="Ttulodellibro">
+    <w:name w:val="Book Title"/>
+    <w:basedOn w:val="Fuentedeprrafopredeter"/>
+    <w:uiPriority w:val="33"/>
+    <w:qFormat/>
+    <w:rsid w:val="00E9171D"/>
+    <w:rPr>
+      <w:b/>
+      <w:bCs/>
+      <w:i/>
+      <w:iCs/>
+      <w:spacing w:val="5"/>
+    </w:rPr>
+  </w:style>
 </w:styles>
 </file>
 

</xml_diff>